<commit_message>
fix: sprint integridad — anti-duplicados, RESTRICT recepciones, eliminar_op, facturación por condición fiscal (mig 055)
- facturas_recibidas: trigger + UNIQUE anti-duplicado por (proveedor, tipo, letra, nro)
- recepciones_oc: FK RESTRICT; editar OC con recepciones ya no reescribe ítems
- eliminar_op: repone kg a la barra, bloquea si hay PT/evidencia de calidad
- numeración de presupuestos server-side (advisory lock, UNIQUE)
- guardar_permisos y ajustar_precios_pct atómicas; MODULOS_LABELS completo (Calidad asignable)
- emitirFactura: letra A/B por condición fiscal del cliente (RG 5003), USD→ARS al TC BNA del día, punto de venta e IVA desde config (antes: Factura B hardcodeada con cotización 1)
- clientes: condición fiscal + validación de CUIT
- tarifa operario unificada (tarifaOperarioUSD desde config)
- limpieza: generarAsientoVenta huérfana eliminada
- informe de auditoría integral en docs/analisis/

Co-Authored-By: Claude Fable 5 <noreply@anthropic.com>
</commit_message>
<xml_diff>
--- a/docs/MANUAL_USUARIO.docx
+++ b/docs/MANUAL_USUARIO.docx
@@ -4584,6 +4584,56 @@
         <w:t xml:space="preserve">- Queda armada la cadena de trazabilidad: certificado → colada → barra → OP → PT.</w:t>
       </w:r>
     </w:p>
+    <w:p>
+      <w:pPr>
+        <w:pStyle w:val="BodyText"/>
+      </w:pPr>
+      <w:r>
+        <w:rPr>
+          <w:b/>
+          <w:bCs/>
+        </w:rPr>
+        <w:t xml:space="preserve">Si eliminás una OP:</w:t>
+      </w:r>
+      <w:r>
+        <w:t xml:space="preserve"> </w:t>
+      </w:r>
+      <w:r>
+        <w:t xml:space="preserve">los metros consumidos</w:t>
+      </w:r>
+      <w:r>
+        <w:t xml:space="preserve"> </w:t>
+      </w:r>
+      <w:r>
+        <w:rPr>
+          <w:b/>
+          <w:bCs/>
+        </w:rPr>
+        <w:t xml:space="preserve">vuelven a la barra</w:t>
+      </w:r>
+      <w:r>
+        <w:t xml:space="preserve"> </w:t>
+      </w:r>
+      <w:r>
+        <w:t xml:space="preserve">automáticamente. Y si la OP ya generó PT, tiene registros de calidad, no conformidades, tratamientos o puntos de control firmados,</w:t>
+      </w:r>
+      <w:r>
+        <w:t xml:space="preserve"> </w:t>
+      </w:r>
+      <w:r>
+        <w:rPr>
+          <w:b/>
+          <w:bCs/>
+        </w:rPr>
+        <w:t xml:space="preserve">no se puede eliminar</w:t>
+      </w:r>
+      <w:r>
+        <w:t xml:space="preserve"> </w:t>
+      </w:r>
+      <w:r>
+        <w:t xml:space="preserve">(retención de evidencia del SGC) — corregila o suspendela en vez de borrarla.</w:t>
+      </w:r>
+    </w:p>
     <w:bookmarkEnd w:id="22"/>
     <w:bookmarkStart w:id="23" w:name="X845f6889353551b7445a1ff16c2cd4f5f826c0e"/>
     <w:p>
@@ -6609,6 +6659,84 @@
         <w:t xml:space="preserve">.</w:t>
       </w:r>
     </w:p>
+    <w:p>
+      <w:pPr>
+        <w:pStyle w:val="BlockText"/>
+      </w:pPr>
+      <w:r>
+        <w:rPr>
+          <w:b/>
+          <w:bCs/>
+        </w:rPr>
+        <w:t xml:space="preserve">Protecciones:</w:t>
+      </w:r>
+      <w:r>
+        <w:t xml:space="preserve"> </w:t>
+      </w:r>
+      <w:r>
+        <w:t xml:space="preserve">una OC</w:t>
+      </w:r>
+      <w:r>
+        <w:t xml:space="preserve"> </w:t>
+      </w:r>
+      <w:r>
+        <w:rPr>
+          <w:b/>
+          <w:bCs/>
+        </w:rPr>
+        <w:t xml:space="preserve">con mercadería recibida no se puede eliminar</w:t>
+      </w:r>
+      <w:r>
+        <w:t xml:space="preserve"> </w:t>
+      </w:r>
+      <w:r>
+        <w:t xml:space="preserve">(para darla de baja, pasala a</w:t>
+      </w:r>
+      <w:r>
+        <w:t xml:space="preserve"> </w:t>
+      </w:r>
+      <w:r>
+        <w:rPr>
+          <w:rStyle w:val="VerbatimChar"/>
+        </w:rPr>
+        <w:t xml:space="preserve">anulada</w:t>
+      </w:r>
+      <w:r>
+        <w:t xml:space="preserve">) y al editarla</w:t>
+      </w:r>
+      <w:r>
+        <w:t xml:space="preserve"> </w:t>
+      </w:r>
+      <w:r>
+        <w:rPr>
+          <w:b/>
+          <w:bCs/>
+        </w:rPr>
+        <w:t xml:space="preserve">solo se actualiza la cabecera</w:t>
+      </w:r>
+      <w:r>
+        <w:t xml:space="preserve"> </w:t>
+      </w:r>
+      <w:r>
+        <w:t xml:space="preserve">— los ítems quedan como están, para no romper la trazabilidad de recepciones e inspecciones. Además,</w:t>
+      </w:r>
+      <w:r>
+        <w:t xml:space="preserve"> </w:t>
+      </w:r>
+      <w:r>
+        <w:rPr>
+          <w:b/>
+          <w:bCs/>
+        </w:rPr>
+        <w:t xml:space="preserve">el mismo comprobante del mismo proveedor no se puede registrar dos veces</w:t>
+      </w:r>
+      <w:r>
+        <w:t xml:space="preserve"> </w:t>
+      </w:r>
+      <w:r>
+        <w:t xml:space="preserve">(el sistema lo rechaza con aviso).</w:t>
+      </w:r>
+    </w:p>
     <w:bookmarkEnd w:id="27"/>
     <w:bookmarkStart w:id="28" w:name="inspección-de-entrada-cuarentena"/>
     <w:p>
@@ -7297,6 +7425,19 @@
           <w:b/>
           <w:bCs/>
         </w:rPr>
+        <w:t xml:space="preserve">Condición fiscal</w:t>
+      </w:r>
+      <w:r>
+        <w:t xml:space="preserve">,</w:t>
+      </w:r>
+      <w:r>
+        <w:t xml:space="preserve"> </w:t>
+      </w:r>
+      <w:r>
+        <w:rPr>
+          <w:b/>
+          <w:bCs/>
+        </w:rPr>
         <w:t xml:space="preserve">Contacto</w:t>
       </w:r>
       <w:r>
@@ -7357,51 +7498,76 @@
     </w:p>
     <w:p>
       <w:pPr>
-        <w:pStyle w:val="Compact"/>
         <w:numPr>
           <w:ilvl w:val="0"/>
           <w:numId w:val="1009"/>
         </w:numPr>
       </w:pPr>
       <w:r>
-        <w:rPr>
-          <w:b/>
-          <w:bCs/>
-        </w:rPr>
-        <w:t xml:space="preserve">Importar Excel:</w:t>
-      </w:r>
-      <w:r>
-        <w:t xml:space="preserve"> </w:t>
-      </w:r>
-      <w:r>
-        <w:t xml:space="preserve">para cargar muchos de una. Detecta duplicados por CUIT (o por nombre).</w:t>
-      </w:r>
-    </w:p>
-    <w:p>
-      <w:pPr>
-        <w:pStyle w:val="Compact"/>
+        <w:t xml:space="preserve">El</w:t>
+      </w:r>
+      <w:r>
+        <w:t xml:space="preserve"> </w:t>
+      </w:r>
+      <w:r>
+        <w:rPr>
+          <w:b/>
+          <w:bCs/>
+        </w:rPr>
+        <w:t xml:space="preserve">CUIT se valida</w:t>
+      </w:r>
+      <w:r>
+        <w:t xml:space="preserve"> </w:t>
+      </w:r>
+      <w:r>
+        <w:t xml:space="preserve">(dígito verificador): si está mal tipeado, no deja guardar.</w:t>
+      </w:r>
+    </w:p>
+    <w:p>
+      <w:pPr>
         <w:numPr>
           <w:ilvl w:val="0"/>
           <w:numId w:val="1009"/>
         </w:numPr>
       </w:pPr>
       <w:r>
-        <w:rPr>
-          <w:b/>
-          <w:bCs/>
-        </w:rPr>
-        <w:t xml:space="preserve">Ficha del cliente:</w:t>
-      </w:r>
-      <w:r>
-        <w:t xml:space="preserve"> </w:t>
-      </w:r>
-      <w:r>
-        <w:t xml:space="preserve">tocá el nombre para ver su historial completo (presupuestos, ventas, facturas, pagos).</w:t>
-      </w:r>
-    </w:p>
-    <w:p>
-      <w:pPr>
-        <w:pStyle w:val="Compact"/>
+        <w:t xml:space="preserve">La</w:t>
+      </w:r>
+      <w:r>
+        <w:t xml:space="preserve"> </w:t>
+      </w:r>
+      <w:r>
+        <w:rPr>
+          <w:b/>
+          <w:bCs/>
+        </w:rPr>
+        <w:t xml:space="preserve">condición fiscal</w:t>
+      </w:r>
+      <w:r>
+        <w:t xml:space="preserve"> </w:t>
+      </w:r>
+      <w:r>
+        <w:t xml:space="preserve">(Responsable Inscripto, Monotributista, Exento, Consumidor final) define</w:t>
+      </w:r>
+      <w:r>
+        <w:t xml:space="preserve"> </w:t>
+      </w:r>
+      <w:r>
+        <w:rPr>
+          <w:b/>
+          <w:bCs/>
+        </w:rPr>
+        <w:t xml:space="preserve">qué letra de factura recibe</w:t>
+      </w:r>
+      <w:r>
+        <w:t xml:space="preserve"> </w:t>
+      </w:r>
+      <w:r>
+        <w:t xml:space="preserve">el cliente al facturarle (A o B). Cargala antes de facturar: si el cliente tiene CUIT y no tiene condición definida, el botón Facturar te la va a pedir.</w:t>
+      </w:r>
+    </w:p>
+    <w:p>
+      <w:pPr>
         <w:numPr>
           <w:ilvl w:val="0"/>
           <w:numId w:val="1009"/>
@@ -7412,6 +7578,48 @@
           <w:b/>
           <w:bCs/>
         </w:rPr>
+        <w:t xml:space="preserve">Importar Excel:</w:t>
+      </w:r>
+      <w:r>
+        <w:t xml:space="preserve"> </w:t>
+      </w:r>
+      <w:r>
+        <w:t xml:space="preserve">para cargar muchos de una. Detecta duplicados por CUIT (o por nombre).</w:t>
+      </w:r>
+    </w:p>
+    <w:p>
+      <w:pPr>
+        <w:numPr>
+          <w:ilvl w:val="0"/>
+          <w:numId w:val="1009"/>
+        </w:numPr>
+      </w:pPr>
+      <w:r>
+        <w:rPr>
+          <w:b/>
+          <w:bCs/>
+        </w:rPr>
+        <w:t xml:space="preserve">Ficha del cliente:</w:t>
+      </w:r>
+      <w:r>
+        <w:t xml:space="preserve"> </w:t>
+      </w:r>
+      <w:r>
+        <w:t xml:space="preserve">tocá el nombre para ver su historial completo (presupuestos, ventas, facturas, pagos).</w:t>
+      </w:r>
+    </w:p>
+    <w:p>
+      <w:pPr>
+        <w:numPr>
+          <w:ilvl w:val="0"/>
+          <w:numId w:val="1009"/>
+        </w:numPr>
+      </w:pPr>
+      <w:r>
+        <w:rPr>
+          <w:b/>
+          <w:bCs/>
+        </w:rPr>
         <w:t xml:space="preserve">Exportar:</w:t>
       </w:r>
       <w:r>
@@ -8300,6 +8508,98 @@
       </w:r>
       <w:r>
         <w:t xml:space="preserve">y se genera el asiento de venta automáticamente.</w:t>
+      </w:r>
+      <w:r>
+        <w:t xml:space="preserve"> </w:t>
+      </w:r>
+      <w:r>
+        <w:t xml:space="preserve">- La</w:t>
+      </w:r>
+      <w:r>
+        <w:t xml:space="preserve"> </w:t>
+      </w:r>
+      <w:r>
+        <w:rPr>
+          <w:b/>
+          <w:bCs/>
+        </w:rPr>
+        <w:t xml:space="preserve">letra sale sola</w:t>
+      </w:r>
+      <w:r>
+        <w:t xml:space="preserve"> </w:t>
+      </w:r>
+      <w:r>
+        <w:t xml:space="preserve">de la condición fiscal del cliente: RI y monotributistas reciben</w:t>
+      </w:r>
+      <w:r>
+        <w:t xml:space="preserve"> </w:t>
+      </w:r>
+      <w:r>
+        <w:rPr>
+          <w:b/>
+          <w:bCs/>
+        </w:rPr>
+        <w:t xml:space="preserve">Factura A</w:t>
+      </w:r>
+      <w:r>
+        <w:t xml:space="preserve">, exentos y consumidor final reciben</w:t>
+      </w:r>
+      <w:r>
+        <w:t xml:space="preserve"> </w:t>
+      </w:r>
+      <w:r>
+        <w:rPr>
+          <w:b/>
+          <w:bCs/>
+        </w:rPr>
+        <w:t xml:space="preserve">B</w:t>
+      </w:r>
+      <w:r>
+        <w:t xml:space="preserve">. Factura A exige el CUIT del cliente.</w:t>
+      </w:r>
+      <w:r>
+        <w:t xml:space="preserve"> </w:t>
+      </w:r>
+      <w:r>
+        <w:t xml:space="preserve">- La venta está en USD y</w:t>
+      </w:r>
+      <w:r>
+        <w:t xml:space="preserve"> </w:t>
+      </w:r>
+      <w:r>
+        <w:rPr>
+          <w:b/>
+          <w:bCs/>
+        </w:rPr>
+        <w:t xml:space="preserve">se factura en pesos al tipo de cambio vendedor BNA del día</w:t>
+      </w:r>
+      <w:r>
+        <w:t xml:space="preserve"> </w:t>
+      </w:r>
+      <w:r>
+        <w:t xml:space="preserve">(el TC usado se muestra al emitir).</w:t>
+      </w:r>
+      <w:r>
+        <w:t xml:space="preserve"> </w:t>
+      </w:r>
+      <w:r>
+        <w:t xml:space="preserve">- El</w:t>
+      </w:r>
+      <w:r>
+        <w:t xml:space="preserve"> </w:t>
+      </w:r>
+      <w:r>
+        <w:rPr>
+          <w:b/>
+          <w:bCs/>
+        </w:rPr>
+        <w:t xml:space="preserve">punto de venta</w:t>
+      </w:r>
+      <w:r>
+        <w:t xml:space="preserve"> </w:t>
+      </w:r>
+      <w:r>
+        <w:t xml:space="preserve">se configura en Configuración → Imputación contable.</w:t>
       </w:r>
       <w:r>
         <w:t xml:space="preserve"> </w:t>
@@ -12371,7 +12671,7 @@
         <w:t xml:space="preserve"> </w:t>
       </w:r>
       <w:r>
-        <w:t xml:space="preserve">por usuario.</w:t>
+        <w:t xml:space="preserve">por usuario. La lista cubre todos los módulos del sistema (inventario, producción, compras, ventas, calidad, análisis y contabilidad).</w:t>
       </w:r>
     </w:p>
     <w:p>
@@ -12471,7 +12771,7 @@
         <w:t xml:space="preserve"> </w:t>
       </w:r>
       <w:r>
-        <w:t xml:space="preserve">(21% por defecto), y si los precios</w:t>
+        <w:t xml:space="preserve">(21% por defecto), si los precios</w:t>
       </w:r>
       <w:r>
         <w:t xml:space="preserve"> </w:t>
@@ -12484,7 +12784,23 @@
         <w:t xml:space="preserve">incluyen IVA</w:t>
       </w:r>
       <w:r>
-        <w:t xml:space="preserve">.</w:t>
+        <w:t xml:space="preserve">, y el</w:t>
+      </w:r>
+      <w:r>
+        <w:t xml:space="preserve"> </w:t>
+      </w:r>
+      <w:r>
+        <w:rPr>
+          <w:b/>
+          <w:bCs/>
+        </w:rPr>
+        <w:t xml:space="preserve">punto de venta AFIP</w:t>
+      </w:r>
+      <w:r>
+        <w:t xml:space="preserve"> </w:t>
+      </w:r>
+      <w:r>
+        <w:t xml:space="preserve">para la facturación electrónica.</w:t>
       </w:r>
     </w:p>
     <w:p>

</xml_diff>

<commit_message>
feat: sprint ciclo del dinero — retenciones sufridas, cheques contables, posición IVA, costo real de OP (mig 056)
- Cobros con retenciones Gcias/IIBB/SUSS/IVA: asiento completo (banco + retenciones / Deudores por el total), certificados registrados en retenciones_sufridas, exportable para el contador
- Método cheque diferido en Cobros y Pagos (entra a cartera 111006 / sale por emitidos 212003)
- Cheques con asientos automáticos por estado: depósito, débito y rechazo (la deuda revive en la cta cte)
- Libro IVA Ventas con letra por comprobante, NC en negativo y alícuota implícita
- Exportable Posición IVA del mes: DF − CF − percepciones − retenciones → saldo
- Costo real congelado al completar OP: MP + timers × tarifas + overhead; el PT queda valuado al costo real
- Cuentas nuevas configurables en Imputación contable (retenciones + cheques)

Co-Authored-By: Claude Fable 5 <noreply@anthropic.com>
</commit_message>
<xml_diff>
--- a/docs/MANUAL_USUARIO.docx
+++ b/docs/MANUAL_USUARIO.docx
@@ -4583,6 +4583,44 @@
       <w:r>
         <w:t xml:space="preserve">- Queda armada la cadena de trazabilidad: certificado → colada → barra → OP → PT.</w:t>
       </w:r>
+      <w:r>
+        <w:t xml:space="preserve"> </w:t>
+      </w:r>
+      <w:r>
+        <w:t xml:space="preserve">- Se</w:t>
+      </w:r>
+      <w:r>
+        <w:t xml:space="preserve"> </w:t>
+      </w:r>
+      <w:r>
+        <w:rPr>
+          <w:b/>
+          <w:bCs/>
+        </w:rPr>
+        <w:t xml:space="preserve">congela el costo real</w:t>
+      </w:r>
+      <w:r>
+        <w:t xml:space="preserve"> </w:t>
+      </w:r>
+      <w:r>
+        <w:t xml:space="preserve">de la orden (material consumido + horas productivas de los timers × tarifas + overhead) y el lote de PT queda</w:t>
+      </w:r>
+      <w:r>
+        <w:t xml:space="preserve"> </w:t>
+      </w:r>
+      <w:r>
+        <w:rPr>
+          <w:b/>
+          <w:bCs/>
+        </w:rPr>
+        <w:t xml:space="preserve">valuado a ese costo</w:t>
+      </w:r>
+      <w:r>
+        <w:t xml:space="preserve"> </w:t>
+      </w:r>
+      <w:r>
+        <w:t xml:space="preserve">— el margen que ves en Análisis → Costos deja de ser una foto recalculable.</w:t>
+      </w:r>
     </w:p>
     <w:p>
       <w:pPr>
@@ -11711,7 +11749,7 @@
         <w:t xml:space="preserve"> </w:t>
       </w:r>
       <w:r>
-        <w:t xml:space="preserve">(caja / banco),</w:t>
+        <w:t xml:space="preserve">(caja / banco / cheque diferido),</w:t>
       </w:r>
       <w:r>
         <w:t xml:space="preserve"> </w:t>
@@ -11796,6 +11834,184 @@
         <w:t xml:space="preserve">a las facturas más viejas.</w:t>
       </w:r>
     </w:p>
+    <w:p>
+      <w:pPr>
+        <w:pStyle w:val="BodyText"/>
+      </w:pPr>
+      <w:r>
+        <w:rPr>
+          <w:b/>
+          <w:bCs/>
+        </w:rPr>
+        <w:t xml:space="preserve">Retenciones sufridas (clave con clientes grandes):</w:t>
+      </w:r>
+      <w:r>
+        <w:t xml:space="preserve"> </w:t>
+      </w:r>
+      <w:r>
+        <w:t xml:space="preserve">si el cliente te paga</w:t>
+      </w:r>
+      <w:r>
+        <w:t xml:space="preserve"> </w:t>
+      </w:r>
+      <w:r>
+        <w:rPr>
+          <w:b/>
+          <w:bCs/>
+        </w:rPr>
+        <w:t xml:space="preserve">neto de retenciones</w:t>
+      </w:r>
+      <w:r>
+        <w:t xml:space="preserve"> </w:t>
+      </w:r>
+      <w:r>
+        <w:t xml:space="preserve">(Ganancias, IIBB, SUSS, IVA — YPF y las mineras lo hacen siempre), cargá el</w:t>
+      </w:r>
+      <w:r>
+        <w:t xml:space="preserve"> </w:t>
+      </w:r>
+      <w:r>
+        <w:rPr>
+          <w:b/>
+          <w:bCs/>
+        </w:rPr>
+        <w:t xml:space="preserve">monto cobrado</w:t>
+      </w:r>
+      <w:r>
+        <w:t xml:space="preserve"> </w:t>
+      </w:r>
+      <w:r>
+        <w:t xml:space="preserve">en Monto y agregá cada certificado con</w:t>
+      </w:r>
+      <w:r>
+        <w:t xml:space="preserve"> </w:t>
+      </w:r>
+      <w:r>
+        <w:rPr>
+          <w:b/>
+          <w:bCs/>
+        </w:rPr>
+        <w:t xml:space="preserve">+ Retención</w:t>
+      </w:r>
+      <w:r>
+        <w:t xml:space="preserve"> </w:t>
+      </w:r>
+      <w:r>
+        <w:t xml:space="preserve">(impuesto, Nº de certificado, jurisdicción si es IIBB, y monto retenido). El sistema:</w:t>
+      </w:r>
+      <w:r>
+        <w:t xml:space="preserve"> </w:t>
+      </w:r>
+      <w:r>
+        <w:t xml:space="preserve">- arma el asiento completo: banco + cada retención al debe, deudores por el</w:t>
+      </w:r>
+      <w:r>
+        <w:t xml:space="preserve"> </w:t>
+      </w:r>
+      <w:r>
+        <w:rPr>
+          <w:b/>
+          <w:bCs/>
+        </w:rPr>
+        <w:t xml:space="preserve">total</w:t>
+      </w:r>
+      <w:r>
+        <w:t xml:space="preserve"> </w:t>
+      </w:r>
+      <w:r>
+        <w:t xml:space="preserve">al haber — la cta. cte. del cliente queda saldada de verdad;</w:t>
+      </w:r>
+      <w:r>
+        <w:t xml:space="preserve"> </w:t>
+      </w:r>
+      <w:r>
+        <w:t xml:space="preserve">- guarda cada certificado en el registro de</w:t>
+      </w:r>
+      <w:r>
+        <w:t xml:space="preserve"> </w:t>
+      </w:r>
+      <w:r>
+        <w:rPr>
+          <w:b/>
+          <w:bCs/>
+        </w:rPr>
+        <w:t xml:space="preserve">Retenciones sufridas</w:t>
+      </w:r>
+      <w:r>
+        <w:t xml:space="preserve"> </w:t>
+      </w:r>
+      <w:r>
+        <w:t xml:space="preserve">(exportable para el contador desde Exportables).</w:t>
+      </w:r>
+    </w:p>
+    <w:p>
+      <w:pPr>
+        <w:pStyle w:val="BodyText"/>
+      </w:pPr>
+      <w:r>
+        <w:rPr>
+          <w:b/>
+          <w:bCs/>
+        </w:rPr>
+        <w:t xml:space="preserve">Método</w:t>
+      </w:r>
+      <w:r>
+        <w:rPr>
+          <w:b/>
+          <w:bCs/>
+        </w:rPr>
+        <w:t xml:space="preserve"> </w:t>
+      </w:r>
+      <w:r>
+        <w:rPr>
+          <w:b/>
+          <w:bCs/>
+        </w:rPr>
+        <w:t xml:space="preserve">“Cheque diferido”</w:t>
+      </w:r>
+      <w:r>
+        <w:rPr>
+          <w:b/>
+          <w:bCs/>
+        </w:rPr>
+        <w:t xml:space="preserve">:</w:t>
+      </w:r>
+      <w:r>
+        <w:t xml:space="preserve"> </w:t>
+      </w:r>
+      <w:r>
+        <w:t xml:space="preserve">el cobro entra a la cuenta</w:t>
+      </w:r>
+      <w:r>
+        <w:t xml:space="preserve"> </w:t>
+      </w:r>
+      <w:r>
+        <w:rPr>
+          <w:b/>
+          <w:bCs/>
+        </w:rPr>
+        <w:t xml:space="preserve">Cheques en cartera</w:t>
+      </w:r>
+      <w:r>
+        <w:t xml:space="preserve"> </w:t>
+      </w:r>
+      <w:r>
+        <w:t xml:space="preserve">(no a caja/banco) y se abre el modal para completar número, banco y fecha de pago del cheque. En un pago, sale por</w:t>
+      </w:r>
+      <w:r>
+        <w:t xml:space="preserve"> </w:t>
+      </w:r>
+      <w:r>
+        <w:rPr>
+          <w:b/>
+          <w:bCs/>
+        </w:rPr>
+        <w:t xml:space="preserve">Cheques emitidos</w:t>
+      </w:r>
+      <w:r>
+        <w:t xml:space="preserve">.</w:t>
+      </w:r>
+    </w:p>
     <w:bookmarkEnd w:id="48"/>
     <w:bookmarkStart w:id="49" w:name="cheques"/>
     <w:p>
@@ -11824,6 +12040,306 @@
       </w:r>
       <w:r>
         <w:t xml:space="preserve">cuando se acerca la fecha de depósito o pago.</w:t>
+      </w:r>
+    </w:p>
+    <w:p>
+      <w:pPr>
+        <w:pStyle w:val="BodyText"/>
+      </w:pPr>
+      <w:r>
+        <w:rPr>
+          <w:b/>
+          <w:bCs/>
+        </w:rPr>
+        <w:t xml:space="preserve">Ahora los cheques mueven la contabilidad solos</w:t>
+      </w:r>
+      <w:r>
+        <w:t xml:space="preserve"> </w:t>
+      </w:r>
+      <w:r>
+        <w:t xml:space="preserve">al cambiar el estado:</w:t>
+      </w:r>
+    </w:p>
+    <w:tbl>
+      <w:tblPr>
+        <w:tblStyle w:val="Table"/>
+        <w:tblW w:type="pct" w:w="5000"/>
+        <w:tblLayout w:type="fixed"/>
+        <w:tblLook w:firstRow="1" w:lastRow="0" w:firstColumn="0" w:lastColumn="0" w:noHBand="0" w:noVBand="0" w:val="0020"/>
+      </w:tblPr>
+      <w:tblGrid>
+        <w:gridCol w:w="2262"/>
+        <w:gridCol w:w="5657"/>
+      </w:tblGrid>
+      <w:tr>
+        <w:trPr>
+          <w:tblHeader w:val="on"/>
+        </w:trPr>
+        <w:tc>
+          <w:tcPr/>
+          <w:p>
+            <w:pPr>
+              <w:pStyle w:val="Compact"/>
+            </w:pPr>
+            <w:r>
+              <w:t xml:space="preserve">Evento</w:t>
+            </w:r>
+          </w:p>
+        </w:tc>
+        <w:tc>
+          <w:tcPr/>
+          <w:p>
+            <w:pPr>
+              <w:pStyle w:val="Compact"/>
+            </w:pPr>
+            <w:r>
+              <w:t xml:space="preserve">Asiento automático</w:t>
+            </w:r>
+          </w:p>
+        </w:tc>
+      </w:tr>
+      <w:tr>
+        <w:tc>
+          <w:tcPr/>
+          <w:p>
+            <w:pPr>
+              <w:pStyle w:val="Compact"/>
+            </w:pPr>
+            <w:r>
+              <w:t xml:space="preserve">Recibido →</w:t>
+            </w:r>
+            <w:r>
+              <w:t xml:space="preserve"> </w:t>
+            </w:r>
+            <w:r>
+              <w:rPr>
+                <w:b/>
+                <w:bCs/>
+              </w:rPr>
+              <w:t xml:space="preserve">depositado</w:t>
+            </w:r>
+          </w:p>
+        </w:tc>
+        <w:tc>
+          <w:tcPr/>
+          <w:p>
+            <w:pPr>
+              <w:pStyle w:val="Compact"/>
+            </w:pPr>
+            <w:r>
+              <w:t xml:space="preserve">Banco / Cheques en cartera</w:t>
+            </w:r>
+          </w:p>
+        </w:tc>
+      </w:tr>
+      <w:tr>
+        <w:tc>
+          <w:tcPr/>
+          <w:p>
+            <w:pPr>
+              <w:pStyle w:val="Compact"/>
+            </w:pPr>
+            <w:r>
+              <w:t xml:space="preserve">Recibido →</w:t>
+            </w:r>
+            <w:r>
+              <w:t xml:space="preserve"> </w:t>
+            </w:r>
+            <w:r>
+              <w:rPr>
+                <w:b/>
+                <w:bCs/>
+              </w:rPr>
+              <w:t xml:space="preserve">rechazado</w:t>
+            </w:r>
+          </w:p>
+        </w:tc>
+        <w:tc>
+          <w:tcPr/>
+          <w:p>
+            <w:pPr>
+              <w:pStyle w:val="Compact"/>
+            </w:pPr>
+            <w:r>
+              <w:t xml:space="preserve">Deudores / Cartera (o Banco si ya estaba depositado) —</w:t>
+            </w:r>
+            <w:r>
+              <w:t xml:space="preserve"> </w:t>
+            </w:r>
+            <w:r>
+              <w:rPr>
+                <w:b/>
+                <w:bCs/>
+              </w:rPr>
+              <w:t xml:space="preserve">la deuda del cliente revive</w:t>
+            </w:r>
+            <w:r>
+              <w:t xml:space="preserve"> </w:t>
+            </w:r>
+            <w:r>
+              <w:t xml:space="preserve">en la cta. cte. desde la fecha del rechazo</w:t>
+            </w:r>
+          </w:p>
+        </w:tc>
+      </w:tr>
+      <w:tr>
+        <w:tc>
+          <w:tcPr/>
+          <w:p>
+            <w:pPr>
+              <w:pStyle w:val="Compact"/>
+            </w:pPr>
+            <w:r>
+              <w:t xml:space="preserve">Emitido →</w:t>
+            </w:r>
+            <w:r>
+              <w:t xml:space="preserve"> </w:t>
+            </w:r>
+            <w:r>
+              <w:rPr>
+                <w:b/>
+                <w:bCs/>
+              </w:rPr>
+              <w:t xml:space="preserve">debitado</w:t>
+            </w:r>
+          </w:p>
+        </w:tc>
+        <w:tc>
+          <w:tcPr/>
+          <w:p>
+            <w:pPr>
+              <w:pStyle w:val="Compact"/>
+            </w:pPr>
+            <w:r>
+              <w:t xml:space="preserve">Cheques emitidos / Banco</w:t>
+            </w:r>
+          </w:p>
+        </w:tc>
+      </w:tr>
+      <w:tr>
+        <w:tc>
+          <w:tcPr/>
+          <w:p>
+            <w:pPr>
+              <w:pStyle w:val="Compact"/>
+            </w:pPr>
+            <w:r>
+              <w:t xml:space="preserve">Emitido →</w:t>
+            </w:r>
+            <w:r>
+              <w:t xml:space="preserve"> </w:t>
+            </w:r>
+            <w:r>
+              <w:rPr>
+                <w:b/>
+                <w:bCs/>
+              </w:rPr>
+              <w:t xml:space="preserve">rechazado</w:t>
+            </w:r>
+          </w:p>
+        </w:tc>
+        <w:tc>
+          <w:tcPr/>
+          <w:p>
+            <w:pPr>
+              <w:pStyle w:val="Compact"/>
+            </w:pPr>
+            <w:r>
+              <w:t xml:space="preserve">Cheques emitidos / Proveedores (la deuda al proveedor revive)</w:t>
+            </w:r>
+          </w:p>
+        </w:tc>
+      </w:tr>
+    </w:tbl>
+    <w:p>
+      <w:pPr>
+        <w:pStyle w:val="BlockText"/>
+      </w:pPr>
+      <w:r>
+        <w:t xml:space="preserve">Para que el circuito cierre, el</w:t>
+      </w:r>
+      <w:r>
+        <w:t xml:space="preserve"> </w:t>
+      </w:r>
+      <w:r>
+        <w:rPr>
+          <w:b/>
+          <w:bCs/>
+        </w:rPr>
+        <w:t xml:space="preserve">alta</w:t>
+      </w:r>
+      <w:r>
+        <w:t xml:space="preserve"> </w:t>
+      </w:r>
+      <w:r>
+        <w:t xml:space="preserve">contable del cheque la hace</w:t>
+      </w:r>
+      <w:r>
+        <w:t xml:space="preserve"> </w:t>
+      </w:r>
+      <w:r>
+        <w:rPr>
+          <w:b/>
+          <w:bCs/>
+        </w:rPr>
+        <w:t xml:space="preserve">Cobros y pagos</w:t>
+      </w:r>
+      <w:r>
+        <w:t xml:space="preserve"> </w:t>
+      </w:r>
+      <w:r>
+        <w:t xml:space="preserve">con método</w:t>
+      </w:r>
+      <w:r>
+        <w:t xml:space="preserve"> </w:t>
+      </w:r>
+      <w:r>
+        <w:t xml:space="preserve">“Cheque diferido”</w:t>
+      </w:r>
+      <w:r>
+        <w:t xml:space="preserve">. Los estados</w:t>
+      </w:r>
+      <w:r>
+        <w:t xml:space="preserve"> </w:t>
+      </w:r>
+      <w:r>
+        <w:rPr>
+          <w:rStyle w:val="VerbatimChar"/>
+        </w:rPr>
+        <w:t xml:space="preserve">acreditado</w:t>
+      </w:r>
+      <w:r>
+        <w:t xml:space="preserve">,</w:t>
+      </w:r>
+      <w:r>
+        <w:t xml:space="preserve"> </w:t>
+      </w:r>
+      <w:r>
+        <w:rPr>
+          <w:rStyle w:val="VerbatimChar"/>
+        </w:rPr>
+        <w:t xml:space="preserve">endosado</w:t>
+      </w:r>
+      <w:r>
+        <w:t xml:space="preserve"> </w:t>
+      </w:r>
+      <w:r>
+        <w:t xml:space="preserve">y</w:t>
+      </w:r>
+      <w:r>
+        <w:t xml:space="preserve"> </w:t>
+      </w:r>
+      <w:r>
+        <w:rPr>
+          <w:rStyle w:val="VerbatimChar"/>
+        </w:rPr>
+        <w:t xml:space="preserve">anulado</w:t>
+      </w:r>
+      <w:r>
+        <w:t xml:space="preserve"> </w:t>
+      </w:r>
+      <w:r>
+        <w:t xml:space="preserve">no generan asiento.</w:t>
       </w:r>
     </w:p>
     <w:bookmarkEnd w:id="49"/>
@@ -12167,6 +12683,110 @@
         </w:tc>
       </w:tr>
     </w:tbl>
+    <w:p>
+      <w:pPr>
+        <w:pStyle w:val="BodyText"/>
+      </w:pPr>
+      <w:r>
+        <w:t xml:space="preserve">En</w:t>
+      </w:r>
+      <w:r>
+        <w:t xml:space="preserve"> </w:t>
+      </w:r>
+      <w:r>
+        <w:rPr>
+          <w:b/>
+          <w:bCs/>
+        </w:rPr>
+        <w:t xml:space="preserve">Exportables</w:t>
+      </w:r>
+      <w:r>
+        <w:t xml:space="preserve"> </w:t>
+      </w:r>
+      <w:r>
+        <w:t xml:space="preserve">(elegís un mes y descargás CSV, o toda la</w:t>
+      </w:r>
+      <w:r>
+        <w:t xml:space="preserve"> </w:t>
+      </w:r>
+      <w:r>
+        <w:rPr>
+          <w:b/>
+          <w:bCs/>
+        </w:rPr>
+        <w:t xml:space="preserve">carpeta del período</w:t>
+      </w:r>
+      <w:r>
+        <w:t xml:space="preserve"> </w:t>
+      </w:r>
+      <w:r>
+        <w:t xml:space="preserve">en ZIP): subdiarios de ventas y compras,</w:t>
+      </w:r>
+      <w:r>
+        <w:t xml:space="preserve"> </w:t>
+      </w:r>
+      <w:r>
+        <w:rPr>
+          <w:b/>
+          <w:bCs/>
+        </w:rPr>
+        <w:t xml:space="preserve">IVA ventas</w:t>
+      </w:r>
+      <w:r>
+        <w:t xml:space="preserve"> </w:t>
+      </w:r>
+      <w:r>
+        <w:t xml:space="preserve">(letra por comprobante, NC en negativo, alícuota),</w:t>
+      </w:r>
+      <w:r>
+        <w:t xml:space="preserve"> </w:t>
+      </w:r>
+      <w:r>
+        <w:rPr>
+          <w:b/>
+          <w:bCs/>
+        </w:rPr>
+        <w:t xml:space="preserve">IVA compras</w:t>
+      </w:r>
+      <w:r>
+        <w:t xml:space="preserve"> </w:t>
+      </w:r>
+      <w:r>
+        <w:t xml:space="preserve">(formato libro real),</w:t>
+      </w:r>
+      <w:r>
+        <w:t xml:space="preserve"> </w:t>
+      </w:r>
+      <w:r>
+        <w:rPr>
+          <w:b/>
+          <w:bCs/>
+        </w:rPr>
+        <w:t xml:space="preserve">Posición IVA del mes</w:t>
+      </w:r>
+      <w:r>
+        <w:t xml:space="preserve"> </w:t>
+      </w:r>
+      <w:r>
+        <w:t xml:space="preserve">(débito − crédito − percepciones − retenciones → saldo a pagar o a favor),</w:t>
+      </w:r>
+      <w:r>
+        <w:t xml:space="preserve"> </w:t>
+      </w:r>
+      <w:r>
+        <w:rPr>
+          <w:b/>
+          <w:bCs/>
+        </w:rPr>
+        <w:t xml:space="preserve">Retenciones sufridas</w:t>
+      </w:r>
+      <w:r>
+        <w:t xml:space="preserve"> </w:t>
+      </w:r>
+      <w:r>
+        <w:t xml:space="preserve">(los certificados del mes, para el contador), mayores y plan de cuentas.</w:t>
+      </w:r>
+    </w:p>
     <w:bookmarkEnd w:id="50"/>
     <w:bookmarkStart w:id="51" w:name="correlatividad"/>
     <w:p>
@@ -12860,7 +13480,61 @@
         <w:t xml:space="preserve"> </w:t>
       </w:r>
       <w:r>
-        <w:t xml:space="preserve">cuenta de caja (efectivo) y cuenta de banco (transferencias).</w:t>
+        <w:t xml:space="preserve">cuenta de caja (efectivo), cuenta de banco (transferencias),</w:t>
+      </w:r>
+      <w:r>
+        <w:t xml:space="preserve"> </w:t>
+      </w:r>
+      <w:r>
+        <w:rPr>
+          <w:b/>
+          <w:bCs/>
+        </w:rPr>
+        <w:t xml:space="preserve">cheques en cartera</w:t>
+      </w:r>
+      <w:r>
+        <w:t xml:space="preserve"> </w:t>
+      </w:r>
+      <w:r>
+        <w:t xml:space="preserve">(recibidos) y</w:t>
+      </w:r>
+      <w:r>
+        <w:t xml:space="preserve"> </w:t>
+      </w:r>
+      <w:r>
+        <w:rPr>
+          <w:b/>
+          <w:bCs/>
+        </w:rPr>
+        <w:t xml:space="preserve">cheques emitidos</w:t>
+      </w:r>
+      <w:r>
+        <w:t xml:space="preserve"> </w:t>
+      </w:r>
+      <w:r>
+        <w:t xml:space="preserve">(a pagar).</w:t>
+      </w:r>
+    </w:p>
+    <w:p>
+      <w:pPr>
+        <w:pStyle w:val="Compact"/>
+        <w:numPr>
+          <w:ilvl w:val="0"/>
+          <w:numId w:val="1017"/>
+        </w:numPr>
+      </w:pPr>
+      <w:r>
+        <w:rPr>
+          <w:b/>
+          <w:bCs/>
+        </w:rPr>
+        <w:t xml:space="preserve">Retenciones sufridas:</w:t>
+      </w:r>
+      <w:r>
+        <w:t xml:space="preserve"> </w:t>
+      </w:r>
+      <w:r>
+        <w:t xml:space="preserve">las cuentas de crédito fiscal donde van las retenciones que te aplican los clientes (Ganancias, IIBB, SUSS, IVA). Vienen preconfiguradas con las cuentas del plan de Vitalmet.</w:t>
       </w:r>
     </w:p>
     <w:p>

</xml_diff>

<commit_message>
feat: sprint inventario auditable — kardex, ajustes con asiento, valuación PPP, conteo físico (mig 058)
- movimientos_stock: trigger en barras/PT/insumos captura todo delta
  con saldo, usuario y etiqueta (consumo-op, venta, ajuste, conteo…);
  RPCs de stock re-emitidas con set_config para etiquetar
- ajustar_stock: motivo obligatorio + asiento contra AJUSTES DE
  INVENTARIO (421099); ediciones de cantidad enrutadas por la RPC
- Conteo físico CT-nnnn: snapshot, carga por sesiones, cierre aplica
  diferencias documentadas
- Recepción de OC valúa la barra (costo USD del ítem; fix barras en
  mts que nacían con stock 0)
- Valuación de inventario: exportable + card valor MP + PPP por material
- Tests 101/101 (tests/inventario.test.js)

Co-Authored-By: Claude Fable 5 <noreply@anthropic.com>
</commit_message>
<xml_diff>
--- a/docs/MANUAL_USUARIO.docx
+++ b/docs/MANUAL_USUARIO.docx
@@ -2408,6 +2408,72 @@
     </w:p>
     <w:p>
       <w:pPr>
+        <w:pStyle w:val="BlockText"/>
+      </w:pPr>
+      <w:r>
+        <w:rPr>
+          <w:b/>
+          <w:bCs/>
+        </w:rPr>
+        <w:t xml:space="preserve">Valuación:</w:t>
+      </w:r>
+      <w:r>
+        <w:t xml:space="preserve"> </w:t>
+      </w:r>
+      <w:r>
+        <w:t xml:space="preserve">las barras que entran por recepción de OC</w:t>
+      </w:r>
+      <w:r>
+        <w:t xml:space="preserve"> </w:t>
+      </w:r>
+      <w:r>
+        <w:rPr>
+          <w:b/>
+          <w:bCs/>
+        </w:rPr>
+        <w:t xml:space="preserve">nacen valuadas</w:t>
+      </w:r>
+      <w:r>
+        <w:t xml:space="preserve"> </w:t>
+      </w:r>
+      <w:r>
+        <w:t xml:space="preserve">con el precio del ítem de la OC (convertido a USD si la OC era en pesos). Con eso el stock de MP tiene valor contable real: lo ves en la tarjeta</w:t>
+      </w:r>
+      <w:r>
+        <w:t xml:space="preserve"> </w:t>
+      </w:r>
+      <w:r>
+        <w:rPr>
+          <w:b/>
+          <w:bCs/>
+        </w:rPr>
+        <w:t xml:space="preserve">Valor stock (costo)</w:t>
+      </w:r>
+      <w:r>
+        <w:t xml:space="preserve"> </w:t>
+      </w:r>
+      <w:r>
+        <w:t xml:space="preserve">y en el exportable</w:t>
+      </w:r>
+      <w:r>
+        <w:t xml:space="preserve"> </w:t>
+      </w:r>
+      <w:r>
+        <w:rPr>
+          <w:b/>
+          <w:bCs/>
+        </w:rPr>
+        <w:t xml:space="preserve">Valuación de inventario</w:t>
+      </w:r>
+      <w:r>
+        <w:t xml:space="preserve"> </w:t>
+      </w:r>
+      <w:r>
+        <w:t xml:space="preserve">(por lote y con promedio ponderado por material).</w:t>
+      </w:r>
+    </w:p>
+    <w:p>
+      <w:pPr>
         <w:pStyle w:val="FirstParagraph"/>
       </w:pPr>
       <w:r>
@@ -2678,6 +2744,156 @@
       </w:r>
       <w:r>
         <w:t xml:space="preserve">de ese material. Revisá proveedor y precio, y guardá — es una OC normal desde ahí en adelante.</w:t>
+      </w:r>
+    </w:p>
+    <w:p>
+      <w:pPr>
+        <w:pStyle w:val="FirstParagraph"/>
+      </w:pPr>
+      <w:r>
+        <w:rPr>
+          <w:b/>
+          <w:bCs/>
+        </w:rPr>
+        <w:t xml:space="preserve">Kardex (historial de movimientos):</w:t>
+      </w:r>
+      <w:r>
+        <w:t xml:space="preserve"> </w:t>
+      </w:r>
+      <w:r>
+        <w:t xml:space="preserve">cada barra, producto terminado e insumo tiene un botón</w:t>
+      </w:r>
+      <w:r>
+        <w:t xml:space="preserve"> </w:t>
+      </w:r>
+      <w:r>
+        <w:rPr>
+          <w:b/>
+          <w:bCs/>
+        </w:rPr>
+        <w:t xml:space="preserve">Kardex</w:t>
+      </w:r>
+      <w:r>
+        <w:t xml:space="preserve"> </w:t>
+      </w:r>
+      <w:r>
+        <w:t xml:space="preserve">que muestra todos sus movimientos de stock: qué entró, qué salió, cuándo, cuánto quedó y quién lo hizo. Los movimientos se etiquetan solos (Consumo OP, Venta, Entrega, Ajuste, Conteo físico, etc.). Nada se mueve sin dejar rastro.</w:t>
+      </w:r>
+    </w:p>
+    <w:p>
+      <w:pPr>
+        <w:pStyle w:val="BodyText"/>
+      </w:pPr>
+      <w:r>
+        <w:rPr>
+          <w:b/>
+          <w:bCs/>
+        </w:rPr>
+        <w:t xml:space="preserve">Ajustes de stock:</w:t>
+      </w:r>
+      <w:r>
+        <w:t xml:space="preserve"> </w:t>
+      </w:r>
+      <w:r>
+        <w:t xml:space="preserve">si al editar una barra / PT / insumo cambiás la</w:t>
+      </w:r>
+      <w:r>
+        <w:t xml:space="preserve"> </w:t>
+      </w:r>
+      <w:r>
+        <w:rPr>
+          <w:b/>
+          <w:bCs/>
+        </w:rPr>
+        <w:t xml:space="preserve">cantidad</w:t>
+      </w:r>
+      <w:r>
+        <w:t xml:space="preserve">, el sistema te pide un</w:t>
+      </w:r>
+      <w:r>
+        <w:t xml:space="preserve"> </w:t>
+      </w:r>
+      <w:r>
+        <w:rPr>
+          <w:b/>
+          <w:bCs/>
+        </w:rPr>
+        <w:t xml:space="preserve">motivo obligatorio</w:t>
+      </w:r>
+      <w:r>
+        <w:t xml:space="preserve">. El ajuste queda en el kardex y, si el ítem tiene costo, genera automáticamente el</w:t>
+      </w:r>
+      <w:r>
+        <w:t xml:space="preserve"> </w:t>
+      </w:r>
+      <w:r>
+        <w:rPr>
+          <w:b/>
+          <w:bCs/>
+        </w:rPr>
+        <w:t xml:space="preserve">asiento contable</w:t>
+      </w:r>
+      <w:r>
+        <w:t xml:space="preserve"> </w:t>
+      </w:r>
+      <w:r>
+        <w:t xml:space="preserve">(cuenta de stock contra AJUSTES DE INVENTARIO). Corregir stock ya no es</w:t>
+      </w:r>
+      <w:r>
+        <w:t xml:space="preserve"> </w:t>
+      </w:r>
+      <w:r>
+        <w:t xml:space="preserve">“pisar el número”</w:t>
+      </w:r>
+      <w:r>
+        <w:t xml:space="preserve">: queda documentado como en cualquier ERP serio.</w:t>
+      </w:r>
+    </w:p>
+    <w:p>
+      <w:pPr>
+        <w:pStyle w:val="BodyText"/>
+      </w:pPr>
+      <w:r>
+        <w:rPr>
+          <w:b/>
+          <w:bCs/>
+        </w:rPr>
+        <w:t xml:space="preserve">Conteo físico:</w:t>
+      </w:r>
+      <w:r>
+        <w:t xml:space="preserve"> </w:t>
+      </w:r>
+      <w:r>
+        <w:t xml:space="preserve">el botón</w:t>
+      </w:r>
+      <w:r>
+        <w:t xml:space="preserve"> </w:t>
+      </w:r>
+      <w:r>
+        <w:rPr>
+          <w:b/>
+          <w:bCs/>
+        </w:rPr>
+        <w:t xml:space="preserve">Conteo físico</w:t>
+      </w:r>
+      <w:r>
+        <w:t xml:space="preserve"> </w:t>
+      </w:r>
+      <w:r>
+        <w:t xml:space="preserve">(arriba de la tabla de barras) inicia un inventario: el sistema saca una foto del stock (barras, PT e insumos) y te da una planilla para cargar lo que contaste físicamente. Podés cargarla en varias sesiones — se guarda sola. Al</w:t>
+      </w:r>
+      <w:r>
+        <w:t xml:space="preserve"> </w:t>
+      </w:r>
+      <w:r>
+        <w:rPr>
+          <w:b/>
+          <w:bCs/>
+        </w:rPr>
+        <w:t xml:space="preserve">cerrar el conteo</w:t>
+      </w:r>
+      <w:r>
+        <w:t xml:space="preserve">, cada diferencia genera su ajuste documentado con asiento. Recomendado: un conteo por trimestre, o cíclico por familia de material.</w:t>
       </w:r>
     </w:p>
     <w:bookmarkEnd w:id="16"/>
@@ -13450,7 +13666,23 @@
         <w:t xml:space="preserve"> </w:t>
       </w:r>
       <w:r>
-        <w:t xml:space="preserve">(los certificados del mes, para el contador), mayores y plan de cuentas.</w:t>
+        <w:t xml:space="preserve">(los certificados del mes, para el contador), mayores,</w:t>
+      </w:r>
+      <w:r>
+        <w:t xml:space="preserve"> </w:t>
+      </w:r>
+      <w:r>
+        <w:rPr>
+          <w:b/>
+          <w:bCs/>
+        </w:rPr>
+        <w:t xml:space="preserve">Valuación de inventario</w:t>
+      </w:r>
+      <w:r>
+        <w:t xml:space="preserve"> </w:t>
+      </w:r>
+      <w:r>
+        <w:t xml:space="preserve">(foto valorizada del stock a hoy: MP por lote y por material con promedio ponderado, PT e insumos — respaldo de Bienes de Cambio del balance) y plan de cuentas.</w:t>
       </w:r>
     </w:p>
     <w:bookmarkEnd w:id="51"/>
@@ -14201,6 +14433,44 @@
       </w:r>
       <w:r>
         <w:t xml:space="preserve">las cuentas de crédito fiscal donde van las retenciones que te aplican los clientes (Ganancias, IIBB, SUSS, IVA). Vienen preconfiguradas con las cuentas del plan de Vitalmet.</w:t>
+      </w:r>
+    </w:p>
+    <w:p>
+      <w:pPr>
+        <w:pStyle w:val="Compact"/>
+        <w:numPr>
+          <w:ilvl w:val="0"/>
+          <w:numId w:val="1018"/>
+        </w:numPr>
+      </w:pPr>
+      <w:r>
+        <w:rPr>
+          <w:b/>
+          <w:bCs/>
+        </w:rPr>
+        <w:t xml:space="preserve">Stock y ajustes de inventario:</w:t>
+      </w:r>
+      <w:r>
+        <w:t xml:space="preserve"> </w:t>
+      </w:r>
+      <w:r>
+        <w:t xml:space="preserve">las cuentas de stock (materia prima, producto terminado, insumos) y la cuenta de resultado</w:t>
+      </w:r>
+      <w:r>
+        <w:t xml:space="preserve"> </w:t>
+      </w:r>
+      <w:r>
+        <w:rPr>
+          <w:b/>
+          <w:bCs/>
+        </w:rPr>
+        <w:t xml:space="preserve">AJUSTES DE INVENTARIO</w:t>
+      </w:r>
+      <w:r>
+        <w:t xml:space="preserve"> </w:t>
+      </w:r>
+      <w:r>
+        <w:t xml:space="preserve">contra la que se asientan las diferencias de ajustes y conteos físicos. Vienen preconfiguradas (114002 / 114001 / 114003 / 421099).</w:t>
       </w:r>
     </w:p>
     <w:p>

</xml_diff>

<commit_message>
feat: sprint calidad certificable — revisión por dirección, auditorías internas, competencias, certs emitidos, modo auditor (mig 059)
- Certificados de conformidad numerados CC-nnnn y registrados al
  emitir el PDF (reimprimir reusa el número)
- Revisión por la dirección RD-nnnn con KPIs congelados
  (computeKpisCalidad) y cierre inmutable por trigger
- Auditorías internas AI-nnnn con hallazgos tipificados y generación
  de NC vinculada (origen auditoría)
- Matriz de competencias con niveles, vencimientos y alertas
- Modo auditor solo lectura: es_contador() extendida a auditores,
  cero policies nuevas; checkbox en permisos + banner propio
- Fix: showKardex referenciaba global inexistente 'usuarios'
- Tests 103/103 (tests/sgc.test.js)

Co-Authored-By: Claude Fable 5 <noreply@anthropic.com>
</commit_message>
<xml_diff>
--- a/docs/MANUAL_USUARIO.docx
+++ b/docs/MANUAL_USUARIO.docx
@@ -2,7 +2,7 @@
 <file path=word/document.xml><?xml version="1.0" encoding="utf-8"?>
 <w:document xmlns:w="http://schemas.openxmlformats.org/wordprocessingml/2006/main" xmlns:m="http://schemas.openxmlformats.org/officeDocument/2006/math" xmlns:r="http://schemas.openxmlformats.org/officeDocument/2006/relationships" xmlns:o="urn:schemas-microsoft-com:office:office" xmlns:v="urn:schemas-microsoft-com:vml" xmlns:w10="urn:schemas-microsoft-com:office:word" xmlns:a="http://schemas.openxmlformats.org/drawingml/2006/main" xmlns:pic="http://schemas.openxmlformats.org/drawingml/2006/picture" xmlns:wp="http://schemas.openxmlformats.org/drawingml/2006/wordprocessingDrawing">
   <w:body>
-    <w:bookmarkStart w:id="67" w:name="X49288d98bb0e101ac90548faf60c95f63953311"/>
+    <w:bookmarkStart w:id="68" w:name="X49288d98bb0e101ac90548faf60c95f63953311"/>
     <w:p>
       <w:pPr>
         <w:pStyle w:val="Heading1"/>
@@ -10151,7 +10151,7 @@
     </w:p>
     <w:bookmarkEnd w:id="39"/>
     <w:bookmarkEnd w:id="40"/>
-    <w:bookmarkStart w:id="46" w:name="calidad-ncrcapa-documentos-pqp"/>
+    <w:bookmarkStart w:id="47" w:name="calidad-ncrcapa-documentos-pqp"/>
     <w:p>
       <w:pPr>
         <w:pStyle w:val="Heading2"/>
@@ -11778,13 +11778,281 @@
       </w:r>
     </w:p>
     <w:bookmarkEnd w:id="44"/>
-    <w:bookmarkStart w:id="45" w:name="retención-de-evidencia"/>
+    <w:bookmarkStart w:id="45" w:name="Xdd47fb353a4cec263fb0707e4acad9f2e437c89"/>
     <w:p>
       <w:pPr>
         <w:pStyle w:val="Heading3"/>
       </w:pPr>
       <w:r>
-        <w:t xml:space="preserve">10.5 Retención de evidencia</w:t>
+        <w:t xml:space="preserve">10.5 SGC — Tablero, revisión por dirección, auditorías y competencias</w:t>
+      </w:r>
+    </w:p>
+    <w:p>
+      <w:pPr>
+        <w:pStyle w:val="FirstParagraph"/>
+      </w:pPr>
+      <w:r>
+        <w:t xml:space="preserve">La pestaña</w:t>
+      </w:r>
+      <w:r>
+        <w:t xml:space="preserve"> </w:t>
+      </w:r>
+      <w:r>
+        <w:rPr>
+          <w:b/>
+          <w:bCs/>
+        </w:rPr>
+        <w:t xml:space="preserve">SGC</w:t>
+      </w:r>
+      <w:r>
+        <w:t xml:space="preserve"> </w:t>
+      </w:r>
+      <w:r>
+        <w:t xml:space="preserve">(dentro de Calidad) junta los rituales que pide ISO 9001 / API Q1 para certificar:</w:t>
+      </w:r>
+    </w:p>
+    <w:p>
+      <w:pPr>
+        <w:pStyle w:val="Compact"/>
+        <w:numPr>
+          <w:ilvl w:val="0"/>
+          <w:numId w:val="1013"/>
+        </w:numPr>
+      </w:pPr>
+      <w:r>
+        <w:rPr>
+          <w:b/>
+          <w:bCs/>
+        </w:rPr>
+        <w:t xml:space="preserve">Tablero:</w:t>
+      </w:r>
+      <w:r>
+        <w:t xml:space="preserve"> </w:t>
+      </w:r>
+      <w:r>
+        <w:t xml:space="preserve">KPIs de calidad del período (OTD, NC nuevas y abiertas, CAPA abiertas/vencidas, calibraciones vencidas, auditorías) más el</w:t>
+      </w:r>
+      <w:r>
+        <w:t xml:space="preserve"> </w:t>
+      </w:r>
+      <w:r>
+        <w:rPr>
+          <w:b/>
+          <w:bCs/>
+        </w:rPr>
+        <w:t xml:space="preserve">registro de certificados de conformidad emitidos</w:t>
+      </w:r>
+      <w:r>
+        <w:t xml:space="preserve">. Cada certificado que generás desde Ventas queda numerado correlativamente (</w:t>
+      </w:r>
+      <w:r>
+        <w:rPr>
+          <w:b/>
+          <w:bCs/>
+        </w:rPr>
+        <w:t xml:space="preserve">CC-0001, CC-0002…</w:t>
+      </w:r>
+      <w:r>
+        <w:t xml:space="preserve">) y registrado con su snapshot de piezas y coladas; reimprimir usa el mismo número.</w:t>
+      </w:r>
+    </w:p>
+    <w:p>
+      <w:pPr>
+        <w:pStyle w:val="Compact"/>
+        <w:numPr>
+          <w:ilvl w:val="0"/>
+          <w:numId w:val="1013"/>
+        </w:numPr>
+      </w:pPr>
+      <w:r>
+        <w:rPr>
+          <w:b/>
+          <w:bCs/>
+        </w:rPr>
+        <w:t xml:space="preserve">Revisión por la dirección</w:t>
+      </w:r>
+      <w:r>
+        <w:t xml:space="preserve"> </w:t>
+      </w:r>
+      <w:r>
+        <w:t xml:space="preserve">(§9.3): tocá</w:t>
+      </w:r>
+      <w:r>
+        <w:t xml:space="preserve"> </w:t>
+      </w:r>
+      <w:r>
+        <w:rPr>
+          <w:b/>
+          <w:bCs/>
+        </w:rPr>
+        <w:t xml:space="preserve">Nueva revisión</w:t>
+      </w:r>
+      <w:r>
+        <w:t xml:space="preserve">, elegí el período y el sistema</w:t>
+      </w:r>
+      <w:r>
+        <w:t xml:space="preserve"> </w:t>
+      </w:r>
+      <w:r>
+        <w:rPr>
+          <w:b/>
+          <w:bCs/>
+        </w:rPr>
+        <w:t xml:space="preserve">congela los KPIs automáticamente</w:t>
+      </w:r>
+      <w:r>
+        <w:t xml:space="preserve"> </w:t>
+      </w:r>
+      <w:r>
+        <w:t xml:space="preserve">— vos cargás asistentes, decisiones y acciones. Al</w:t>
+      </w:r>
+      <w:r>
+        <w:t xml:space="preserve"> </w:t>
+      </w:r>
+      <w:r>
+        <w:rPr>
+          <w:b/>
+          <w:bCs/>
+        </w:rPr>
+        <w:t xml:space="preserve">cerrarla</w:t>
+      </w:r>
+      <w:r>
+        <w:t xml:space="preserve"> </w:t>
+      </w:r>
+      <w:r>
+        <w:t xml:space="preserve">queda inmutable (no se puede editar ni borrar: es un registro del SGC). Mínimo una por año.</w:t>
+      </w:r>
+    </w:p>
+    <w:p>
+      <w:pPr>
+        <w:pStyle w:val="Compact"/>
+        <w:numPr>
+          <w:ilvl w:val="0"/>
+          <w:numId w:val="1013"/>
+        </w:numPr>
+      </w:pPr>
+      <w:r>
+        <w:rPr>
+          <w:b/>
+          <w:bCs/>
+        </w:rPr>
+        <w:t xml:space="preserve">Auditorías internas</w:t>
+      </w:r>
+      <w:r>
+        <w:t xml:space="preserve"> </w:t>
+      </w:r>
+      <w:r>
+        <w:t xml:space="preserve">(§9.2): cargá el programa anual (fecha planificada) y ejecutá cada auditoría cargando</w:t>
+      </w:r>
+      <w:r>
+        <w:t xml:space="preserve"> </w:t>
+      </w:r>
+      <w:r>
+        <w:rPr>
+          <w:b/>
+          <w:bCs/>
+        </w:rPr>
+        <w:t xml:space="preserve">hallazgos</w:t>
+      </w:r>
+      <w:r>
+        <w:t xml:space="preserve"> </w:t>
+      </w:r>
+      <w:r>
+        <w:t xml:space="preserve">tipificados (conforme, observación, NC menor/mayor, oportunidad) con su cláusula. Desde un hallazgo NC, el botón</w:t>
+      </w:r>
+      <w:r>
+        <w:t xml:space="preserve"> </w:t>
+      </w:r>
+      <w:r>
+        <w:rPr>
+          <w:b/>
+          <w:bCs/>
+        </w:rPr>
+        <w:t xml:space="preserve">Generar NC</w:t>
+      </w:r>
+      <w:r>
+        <w:t xml:space="preserve"> </w:t>
+      </w:r>
+      <w:r>
+        <w:t xml:space="preserve">crea la No Conformidad en NCR/CAPA con origen</w:t>
+      </w:r>
+      <w:r>
+        <w:t xml:space="preserve"> </w:t>
+      </w:r>
+      <w:r>
+        <w:t xml:space="preserve">“auditoría”</w:t>
+      </w:r>
+      <w:r>
+        <w:t xml:space="preserve"> </w:t>
+      </w:r>
+      <w:r>
+        <w:t xml:space="preserve">y las deja vinculadas. Las planificadas vencidas saltan en las alertas del tablero.</w:t>
+      </w:r>
+    </w:p>
+    <w:p>
+      <w:pPr>
+        <w:pStyle w:val="Compact"/>
+        <w:numPr>
+          <w:ilvl w:val="0"/>
+          <w:numId w:val="1013"/>
+        </w:numPr>
+      </w:pPr>
+      <w:r>
+        <w:rPr>
+          <w:b/>
+          <w:bCs/>
+        </w:rPr>
+        <w:t xml:space="preserve">Competencias</w:t>
+      </w:r>
+      <w:r>
+        <w:t xml:space="preserve"> </w:t>
+      </w:r>
+      <w:r>
+        <w:t xml:space="preserve">(§7.2): matriz persona × habilidad con nivel (en formación / calificado / experto), fecha, vencimiento y evidencia. Es lo que respalda ante el auditor que quien firmó un signoff estaba calificado. Las calificaciones vencidas o por vencer (30 días) saltan en alertas.</w:t>
+      </w:r>
+    </w:p>
+    <w:p>
+      <w:pPr>
+        <w:pStyle w:val="FirstParagraph"/>
+      </w:pPr>
+      <w:r>
+        <w:rPr>
+          <w:b/>
+          <w:bCs/>
+        </w:rPr>
+        <w:t xml:space="preserve">Modo auditor:</w:t>
+      </w:r>
+      <w:r>
+        <w:t xml:space="preserve"> </w:t>
+      </w:r>
+      <w:r>
+        <w:t xml:space="preserve">en Configuración → Usuarios podés marcar a un usuario como</w:t>
+      </w:r>
+      <w:r>
+        <w:t xml:space="preserve"> </w:t>
+      </w:r>
+      <w:r>
+        <w:rPr>
+          <w:b/>
+          <w:bCs/>
+        </w:rPr>
+        <w:t xml:space="preserve">Auditor (solo lectura)</w:t>
+      </w:r>
+      <w:r>
+        <w:t xml:space="preserve"> </w:t>
+      </w:r>
+      <w:r>
+        <w:t xml:space="preserve">— ideal para el auditor de certificación: ve todo el SGC, producción e inventario pero no puede tocar nada (mismo cerrojo doble del Modo Contador, garantizado por la base de datos).</w:t>
+      </w:r>
+    </w:p>
+    <w:bookmarkEnd w:id="45"/>
+    <w:bookmarkStart w:id="46" w:name="retención-de-evidencia"/>
+    <w:p>
+      <w:pPr>
+        <w:pStyle w:val="Heading3"/>
+      </w:pPr>
+      <w:r>
+        <w:t xml:space="preserve">10.6 Retención de evidencia</w:t>
       </w:r>
     </w:p>
     <w:p>
@@ -11838,9 +12106,9 @@
         </w:pict>
       </w:r>
     </w:p>
-    <w:bookmarkEnd w:id="45"/>
     <w:bookmarkEnd w:id="46"/>
-    <w:bookmarkStart w:id="55" w:name="contabilidad"/>
+    <w:bookmarkEnd w:id="47"/>
+    <w:bookmarkStart w:id="56" w:name="contabilidad"/>
     <w:p>
       <w:pPr>
         <w:pStyle w:val="Heading2"/>
@@ -11953,7 +12221,7 @@
         <w:t xml:space="preserve">). Si no, los asientos automáticos no saben a qué cuentas ir.</w:t>
       </w:r>
     </w:p>
-    <w:bookmarkStart w:id="47" w:name="plan-de-cuentas"/>
+    <w:bookmarkStart w:id="48" w:name="plan-de-cuentas"/>
     <w:p>
       <w:pPr>
         <w:pStyle w:val="Heading3"/>
@@ -11968,527 +12236,6 @@
       </w:pPr>
       <w:r>
         <w:t xml:space="preserve">La estructura jerárquica de cuentas (partida doble).</w:t>
-      </w:r>
-    </w:p>
-    <w:p>
-      <w:pPr>
-        <w:pStyle w:val="Compact"/>
-        <w:numPr>
-          <w:ilvl w:val="0"/>
-          <w:numId w:val="1013"/>
-        </w:numPr>
-      </w:pPr>
-      <w:r>
-        <w:rPr>
-          <w:b/>
-          <w:bCs/>
-        </w:rPr>
-        <w:t xml:space="preserve">Expandir / Colapsar</w:t>
-      </w:r>
-      <w:r>
-        <w:t xml:space="preserve"> </w:t>
-      </w:r>
-      <w:r>
-        <w:t xml:space="preserve">los grupos.</w:t>
-      </w:r>
-    </w:p>
-    <w:p>
-      <w:pPr>
-        <w:pStyle w:val="Compact"/>
-        <w:numPr>
-          <w:ilvl w:val="0"/>
-          <w:numId w:val="1013"/>
-        </w:numPr>
-      </w:pPr>
-      <w:r>
-        <w:rPr>
-          <w:b/>
-          <w:bCs/>
-        </w:rPr>
-        <w:t xml:space="preserve">+ Nueva cuenta:</w:t>
-      </w:r>
-      <w:r>
-        <w:t xml:space="preserve"> </w:t>
-      </w:r>
-      <w:r>
-        <w:rPr>
-          <w:b/>
-          <w:bCs/>
-        </w:rPr>
-        <w:t xml:space="preserve">Código</w:t>
-      </w:r>
-      <w:r>
-        <w:t xml:space="preserve"> </w:t>
-      </w:r>
-      <w:r>
-        <w:rPr>
-          <w:i/>
-          <w:iCs/>
-        </w:rPr>
-        <w:t xml:space="preserve">,</w:t>
-      </w:r>
-      <w:r>
-        <w:rPr>
-          <w:i/>
-          <w:iCs/>
-        </w:rPr>
-        <w:t xml:space="preserve"> </w:t>
-      </w:r>
-      <w:r>
-        <w:rPr>
-          <w:b/>
-          <w:bCs/>
-          <w:i/>
-          <w:iCs/>
-        </w:rPr>
-        <w:t xml:space="preserve">Nombre</w:t>
-      </w:r>
-      <w:r>
-        <w:rPr>
-          <w:i/>
-          <w:iCs/>
-        </w:rPr>
-        <w:t xml:space="preserve"> </w:t>
-      </w:r>
-      <w:r>
-        <w:t xml:space="preserve">,</w:t>
-      </w:r>
-      <w:r>
-        <w:t xml:space="preserve"> </w:t>
-      </w:r>
-      <w:r>
-        <w:rPr>
-          <w:b/>
-          <w:bCs/>
-        </w:rPr>
-        <w:t xml:space="preserve">Tipo</w:t>
-      </w:r>
-      <w:r>
-        <w:t xml:space="preserve"> </w:t>
-      </w:r>
-      <w:r>
-        <w:t xml:space="preserve">(Activo / Pasivo / Patrimonio Neto / Ingreso / Gasto / Resultado),</w:t>
-      </w:r>
-      <w:r>
-        <w:t xml:space="preserve"> </w:t>
-      </w:r>
-      <w:r>
-        <w:rPr>
-          <w:b/>
-          <w:bCs/>
-        </w:rPr>
-        <w:t xml:space="preserve">Cuenta padre</w:t>
-      </w:r>
-      <w:r>
-        <w:t xml:space="preserve">,</w:t>
-      </w:r>
-      <w:r>
-        <w:t xml:space="preserve"> </w:t>
-      </w:r>
-      <w:r>
-        <w:rPr>
-          <w:b/>
-          <w:bCs/>
-        </w:rPr>
-        <w:t xml:space="preserve">Imputable</w:t>
-      </w:r>
-      <w:r>
-        <w:t xml:space="preserve"> </w:t>
-      </w:r>
-      <w:r>
-        <w:t xml:space="preserve">(si se pueden cargar asientos ahí),</w:t>
-      </w:r>
-      <w:r>
-        <w:t xml:space="preserve"> </w:t>
-      </w:r>
-      <w:r>
-        <w:rPr>
-          <w:b/>
-          <w:bCs/>
-        </w:rPr>
-        <w:t xml:space="preserve">Activa</w:t>
-      </w:r>
-      <w:r>
-        <w:t xml:space="preserve">,</w:t>
-      </w:r>
-      <w:r>
-        <w:t xml:space="preserve"> </w:t>
-      </w:r>
-      <w:r>
-        <w:rPr>
-          <w:b/>
-          <w:bCs/>
-        </w:rPr>
-        <w:t xml:space="preserve">Ajustable</w:t>
-      </w:r>
-      <w:r>
-        <w:t xml:space="preserve"> </w:t>
-      </w:r>
-      <w:r>
-        <w:t xml:space="preserve">(para ajuste por inflación).</w:t>
-      </w:r>
-    </w:p>
-    <w:p>
-      <w:pPr>
-        <w:pStyle w:val="Compact"/>
-        <w:numPr>
-          <w:ilvl w:val="0"/>
-          <w:numId w:val="1013"/>
-        </w:numPr>
-      </w:pPr>
-      <w:r>
-        <w:t xml:space="preserve">Filtrá por tipo, activa o ajustable.</w:t>
-      </w:r>
-    </w:p>
-    <w:bookmarkEnd w:id="47"/>
-    <w:bookmarkStart w:id="48" w:name="asientos-contables"/>
-    <w:p>
-      <w:pPr>
-        <w:pStyle w:val="Heading3"/>
-      </w:pPr>
-      <w:r>
-        <w:t xml:space="preserve">11.2 Asientos contables</w:t>
-      </w:r>
-    </w:p>
-    <w:p>
-      <w:pPr>
-        <w:pStyle w:val="FirstParagraph"/>
-      </w:pPr>
-      <w:r>
-        <w:t xml:space="preserve">Lista de todos los asientos (debe = haber).</w:t>
-      </w:r>
-    </w:p>
-    <w:p>
-      <w:pPr>
-        <w:pStyle w:val="BodyText"/>
-      </w:pPr>
-      <w:r>
-        <w:rPr>
-          <w:b/>
-          <w:bCs/>
-        </w:rPr>
-        <w:t xml:space="preserve">Para cargar un asiento manual:</w:t>
-      </w:r>
-      <w:r>
-        <w:t xml:space="preserve"> </w:t>
-      </w:r>
-      <w:r>
-        <w:t xml:space="preserve">1.</w:t>
-      </w:r>
-      <w:r>
-        <w:t xml:space="preserve"> </w:t>
-      </w:r>
-      <w:r>
-        <w:rPr>
-          <w:b/>
-          <w:bCs/>
-        </w:rPr>
-        <w:t xml:space="preserve">+ Nuevo asiento</w:t>
-      </w:r>
-      <w:r>
-        <w:t xml:space="preserve">.</w:t>
-      </w:r>
-      <w:r>
-        <w:t xml:space="preserve"> </w:t>
-      </w:r>
-      <w:r>
-        <w:t xml:space="preserve">2.</w:t>
-      </w:r>
-      <w:r>
-        <w:t xml:space="preserve"> </w:t>
-      </w:r>
-      <w:r>
-        <w:rPr>
-          <w:b/>
-          <w:bCs/>
-        </w:rPr>
-        <w:t xml:space="preserve">Fecha</w:t>
-      </w:r>
-      <w:r>
-        <w:t xml:space="preserve"> </w:t>
-      </w:r>
-      <w:r>
-        <w:rPr>
-          <w:i/>
-          <w:iCs/>
-        </w:rPr>
-        <w:t xml:space="preserve">,</w:t>
-      </w:r>
-      <w:r>
-        <w:rPr>
-          <w:i/>
-          <w:iCs/>
-        </w:rPr>
-        <w:t xml:space="preserve"> </w:t>
-      </w:r>
-      <w:r>
-        <w:rPr>
-          <w:b/>
-          <w:bCs/>
-          <w:i/>
-          <w:iCs/>
-        </w:rPr>
-        <w:t xml:space="preserve">Descripción</w:t>
-      </w:r>
-      <w:r>
-        <w:rPr>
-          <w:i/>
-          <w:iCs/>
-        </w:rPr>
-        <w:t xml:space="preserve"> </w:t>
-      </w:r>
-      <w:r>
-        <w:t xml:space="preserve">,</w:t>
-      </w:r>
-      <w:r>
-        <w:t xml:space="preserve"> </w:t>
-      </w:r>
-      <w:r>
-        <w:rPr>
-          <w:b/>
-          <w:bCs/>
-        </w:rPr>
-        <w:t xml:space="preserve">Comprobante</w:t>
-      </w:r>
-      <w:r>
-        <w:t xml:space="preserve">,</w:t>
-      </w:r>
-      <w:r>
-        <w:t xml:space="preserve"> </w:t>
-      </w:r>
-      <w:r>
-        <w:rPr>
-          <w:b/>
-          <w:bCs/>
-        </w:rPr>
-        <w:t xml:space="preserve">Tipo</w:t>
-      </w:r>
-      <w:r>
-        <w:t xml:space="preserve"> </w:t>
-      </w:r>
-      <w:r>
-        <w:t xml:space="preserve">(manual / factura / cobro / pago / cierre / ajuste…),</w:t>
-      </w:r>
-      <w:r>
-        <w:t xml:space="preserve"> </w:t>
-      </w:r>
-      <w:r>
-        <w:rPr>
-          <w:b/>
-          <w:bCs/>
-        </w:rPr>
-        <w:t xml:space="preserve">Moneda</w:t>
-      </w:r>
-      <w:r>
-        <w:t xml:space="preserve">.</w:t>
-      </w:r>
-      <w:r>
-        <w:t xml:space="preserve"> </w:t>
-      </w:r>
-      <w:r>
-        <w:t xml:space="preserve">3.</w:t>
-      </w:r>
-      <w:r>
-        <w:t xml:space="preserve"> </w:t>
-      </w:r>
-      <w:r>
-        <w:rPr>
-          <w:b/>
-          <w:bCs/>
-        </w:rPr>
-        <w:t xml:space="preserve">Líneas:</w:t>
-      </w:r>
-      <w:r>
-        <w:t xml:space="preserve"> </w:t>
-      </w:r>
-      <w:r>
-        <w:t xml:space="preserve">agregá cuenta + monto en</w:t>
-      </w:r>
-      <w:r>
-        <w:t xml:space="preserve"> </w:t>
-      </w:r>
-      <w:r>
-        <w:rPr>
-          <w:b/>
-          <w:bCs/>
-        </w:rPr>
-        <w:t xml:space="preserve">Debe</w:t>
-      </w:r>
-      <w:r>
-        <w:t xml:space="preserve"> </w:t>
-      </w:r>
-      <w:r>
-        <w:t xml:space="preserve">o</w:t>
-      </w:r>
-      <w:r>
-        <w:t xml:space="preserve"> </w:t>
-      </w:r>
-      <w:r>
-        <w:rPr>
-          <w:b/>
-          <w:bCs/>
-        </w:rPr>
-        <w:t xml:space="preserve">Haber</w:t>
-      </w:r>
-      <w:r>
-        <w:t xml:space="preserve">. El</w:t>
-      </w:r>
-      <w:r>
-        <w:t xml:space="preserve"> </w:t>
-      </w:r>
-      <w:r>
-        <w:rPr>
-          <w:b/>
-          <w:bCs/>
-        </w:rPr>
-        <w:t xml:space="preserve">total Debe</w:t>
-      </w:r>
-      <w:r>
-        <w:t xml:space="preserve"> </w:t>
-      </w:r>
-      <w:r>
-        <w:t xml:space="preserve">tiene que ser</w:t>
-      </w:r>
-      <w:r>
-        <w:t xml:space="preserve"> </w:t>
-      </w:r>
-      <w:r>
-        <w:rPr>
-          <w:b/>
-          <w:bCs/>
-        </w:rPr>
-        <w:t xml:space="preserve">igual al total Haber</w:t>
-      </w:r>
-      <w:r>
-        <w:t xml:space="preserve"> </w:t>
-      </w:r>
-      <w:r>
-        <w:t xml:space="preserve">(si no, no deja guardar).</w:t>
-      </w:r>
-      <w:r>
-        <w:t xml:space="preserve"> </w:t>
-      </w:r>
-      <w:r>
-        <w:t xml:space="preserve">4. Guardá.</w:t>
-      </w:r>
-    </w:p>
-    <w:p>
-      <w:pPr>
-        <w:pStyle w:val="BodyText"/>
-      </w:pPr>
-      <w:r>
-        <w:rPr>
-          <w:b/>
-          <w:bCs/>
-        </w:rPr>
-        <w:t xml:space="preserve">Estados:</w:t>
-      </w:r>
-      <w:r>
-        <w:t xml:space="preserve"> </w:t>
-      </w:r>
-      <w:r>
-        <w:rPr>
-          <w:rStyle w:val="VerbatimChar"/>
-        </w:rPr>
-        <w:t xml:space="preserve">borrador → confirmado → (anulado)</w:t>
-      </w:r>
-      <w:r>
-        <w:t xml:space="preserve">.</w:t>
-      </w:r>
-      <w:r>
-        <w:t xml:space="preserve"> </w:t>
-      </w:r>
-      <w:r>
-        <w:t xml:space="preserve">-</w:t>
-      </w:r>
-      <w:r>
-        <w:t xml:space="preserve"> </w:t>
-      </w:r>
-      <w:r>
-        <w:rPr>
-          <w:b/>
-          <w:bCs/>
-        </w:rPr>
-        <w:t xml:space="preserve">Editar / Eliminar:</w:t>
-      </w:r>
-      <w:r>
-        <w:t xml:space="preserve"> </w:t>
-      </w:r>
-      <w:r>
-        <w:t xml:space="preserve">solo si está en</w:t>
-      </w:r>
-      <w:r>
-        <w:t xml:space="preserve"> </w:t>
-      </w:r>
-      <w:r>
-        <w:rPr>
-          <w:rStyle w:val="VerbatimChar"/>
-        </w:rPr>
-        <w:t xml:space="preserve">borrador</w:t>
-      </w:r>
-      <w:r>
-        <w:t xml:space="preserve">.</w:t>
-      </w:r>
-      <w:r>
-        <w:t xml:space="preserve"> </w:t>
-      </w:r>
-      <w:r>
-        <w:t xml:space="preserve">-</w:t>
-      </w:r>
-      <w:r>
-        <w:t xml:space="preserve"> </w:t>
-      </w:r>
-      <w:r>
-        <w:rPr>
-          <w:b/>
-          <w:bCs/>
-        </w:rPr>
-        <w:t xml:space="preserve">Anular:</w:t>
-      </w:r>
-      <w:r>
-        <w:t xml:space="preserve"> </w:t>
-      </w:r>
-      <w:r>
-        <w:t xml:space="preserve">genera un asiento inverso (no se borra, se contra-asienta).</w:t>
-      </w:r>
-    </w:p>
-    <w:p>
-      <w:pPr>
-        <w:pStyle w:val="BlockText"/>
-      </w:pPr>
-      <w:r>
-        <w:t xml:space="preserve">La numeración la pone la base de datos: es correlativa y no se repite.</w:t>
-      </w:r>
-    </w:p>
-    <w:bookmarkEnd w:id="48"/>
-    <w:bookmarkStart w:id="49" w:name="cobros-y-pagos"/>
-    <w:p>
-      <w:pPr>
-        <w:pStyle w:val="Heading3"/>
-      </w:pPr>
-      <w:r>
-        <w:t xml:space="preserve">11.3 Cobros y pagos</w:t>
-      </w:r>
-    </w:p>
-    <w:p>
-      <w:pPr>
-        <w:pStyle w:val="FirstParagraph"/>
-      </w:pPr>
-      <w:r>
-        <w:t xml:space="preserve">El lugar para registrar</w:t>
-      </w:r>
-      <w:r>
-        <w:t xml:space="preserve"> </w:t>
-      </w:r>
-      <w:r>
-        <w:rPr>
-          <w:b/>
-          <w:bCs/>
-        </w:rPr>
-        <w:t xml:space="preserve">plata que entra o sale</w:t>
-      </w:r>
-      <w:r>
-        <w:t xml:space="preserve">.</w:t>
       </w:r>
     </w:p>
     <w:p>
@@ -12500,36 +12247,17 @@
         </w:numPr>
       </w:pPr>
       <w:r>
-        <w:t xml:space="preserve">Elegí la pestaña:</w:t>
-      </w:r>
-      <w:r>
-        <w:t xml:space="preserve"> </w:t>
-      </w:r>
-      <w:r>
-        <w:rPr>
-          <w:b/>
-          <w:bCs/>
-        </w:rPr>
-        <w:t xml:space="preserve">Cobro de cliente</w:t>
-      </w:r>
-      <w:r>
-        <w:t xml:space="preserve"> </w:t>
-      </w:r>
-      <w:r>
-        <w:t xml:space="preserve">o</w:t>
-      </w:r>
-      <w:r>
-        <w:t xml:space="preserve"> </w:t>
-      </w:r>
-      <w:r>
-        <w:rPr>
-          <w:b/>
-          <w:bCs/>
-        </w:rPr>
-        <w:t xml:space="preserve">Pago a proveedor</w:t>
-      </w:r>
-      <w:r>
-        <w:t xml:space="preserve">.</w:t>
+        <w:rPr>
+          <w:b/>
+          <w:bCs/>
+        </w:rPr>
+        <w:t xml:space="preserve">Expandir / Colapsar</w:t>
+      </w:r>
+      <w:r>
+        <w:t xml:space="preserve"> </w:t>
+      </w:r>
+      <w:r>
+        <w:t xml:space="preserve">los grupos.</w:t>
       </w:r>
     </w:p>
     <w:p>
@@ -12541,46 +12269,54 @@
         </w:numPr>
       </w:pPr>
       <w:r>
-        <w:t xml:space="preserve">Completá</w:t>
-      </w:r>
-      <w:r>
-        <w:t xml:space="preserve"> </w:t>
-      </w:r>
-      <w:r>
-        <w:rPr>
-          <w:b/>
-          <w:bCs/>
-        </w:rPr>
-        <w:t xml:space="preserve">Fecha</w:t>
-      </w:r>
-      <w:r>
+        <w:rPr>
+          <w:b/>
+          <w:bCs/>
+        </w:rPr>
+        <w:t xml:space="preserve">+ Nueva cuenta:</w:t>
+      </w:r>
+      <w:r>
+        <w:t xml:space="preserve"> </w:t>
+      </w:r>
+      <w:r>
+        <w:rPr>
+          <w:b/>
+          <w:bCs/>
+        </w:rPr>
+        <w:t xml:space="preserve">Código</w:t>
+      </w:r>
+      <w:r>
+        <w:t xml:space="preserve"> </w:t>
+      </w:r>
+      <w:r>
+        <w:rPr>
+          <w:i/>
+          <w:iCs/>
+        </w:rPr>
         <w:t xml:space="preserve">,</w:t>
       </w:r>
       <w:r>
-        <w:t xml:space="preserve"> </w:t>
-      </w:r>
-      <w:r>
-        <w:rPr>
-          <w:b/>
-          <w:bCs/>
-        </w:rPr>
-        <w:t xml:space="preserve">Tercero</w:t>
-      </w:r>
-      <w:r>
-        <w:t xml:space="preserve"> </w:t>
-      </w:r>
-      <w:r>
-        <w:t xml:space="preserve">(cliente/proveedor),</w:t>
-      </w:r>
-      <w:r>
-        <w:t xml:space="preserve"> </w:t>
-      </w:r>
-      <w:r>
-        <w:rPr>
-          <w:b/>
-          <w:bCs/>
-        </w:rPr>
-        <w:t xml:space="preserve">Monto</w:t>
+        <w:rPr>
+          <w:i/>
+          <w:iCs/>
+        </w:rPr>
+        <w:t xml:space="preserve"> </w:t>
+      </w:r>
+      <w:r>
+        <w:rPr>
+          <w:b/>
+          <w:bCs/>
+          <w:i/>
+          <w:iCs/>
+        </w:rPr>
+        <w:t xml:space="preserve">Nombre</w:t>
+      </w:r>
+      <w:r>
+        <w:rPr>
+          <w:i/>
+          <w:iCs/>
+        </w:rPr>
+        <w:t xml:space="preserve"> </w:t>
       </w:r>
       <w:r>
         <w:t xml:space="preserve">,</w:t>
@@ -12593,55 +12329,23 @@
           <w:b/>
           <w:bCs/>
         </w:rPr>
-        <w:t xml:space="preserve">Moneda</w:t>
-      </w:r>
-      <w:r>
-        <w:t xml:space="preserve"> </w:t>
-      </w:r>
-      <w:r>
-        <w:t xml:space="preserve">(y</w:t>
-      </w:r>
-      <w:r>
-        <w:t xml:space="preserve"> </w:t>
-      </w:r>
-      <w:r>
-        <w:rPr>
-          <w:b/>
-          <w:bCs/>
-        </w:rPr>
-        <w:t xml:space="preserve">TC</w:t>
-      </w:r>
-      <w:r>
-        <w:t xml:space="preserve"> </w:t>
-      </w:r>
-      <w:r>
-        <w:t xml:space="preserve">si es en pesos),</w:t>
-      </w:r>
-      <w:r>
-        <w:t xml:space="preserve"> </w:t>
-      </w:r>
-      <w:r>
-        <w:rPr>
-          <w:b/>
-          <w:bCs/>
-        </w:rPr>
-        <w:t xml:space="preserve">Método</w:t>
-      </w:r>
-      <w:r>
-        <w:t xml:space="preserve"> </w:t>
-      </w:r>
-      <w:r>
-        <w:t xml:space="preserve">(caja / banco / cheque diferido),</w:t>
-      </w:r>
-      <w:r>
-        <w:t xml:space="preserve"> </w:t>
-      </w:r>
-      <w:r>
-        <w:rPr>
-          <w:b/>
-          <w:bCs/>
-        </w:rPr>
-        <w:t xml:space="preserve">Comprobante / recibo</w:t>
+        <w:t xml:space="preserve">Tipo</w:t>
+      </w:r>
+      <w:r>
+        <w:t xml:space="preserve"> </w:t>
+      </w:r>
+      <w:r>
+        <w:t xml:space="preserve">(Activo / Pasivo / Patrimonio Neto / Ingreso / Gasto / Resultado),</w:t>
+      </w:r>
+      <w:r>
+        <w:t xml:space="preserve"> </w:t>
+      </w:r>
+      <w:r>
+        <w:rPr>
+          <w:b/>
+          <w:bCs/>
+        </w:rPr>
+        <w:t xml:space="preserve">Cuenta padre</w:t>
       </w:r>
       <w:r>
         <w:t xml:space="preserve">,</w:t>
@@ -12654,10 +12358,42 @@
           <w:b/>
           <w:bCs/>
         </w:rPr>
-        <w:t xml:space="preserve">Observaciones</w:t>
-      </w:r>
-      <w:r>
-        <w:t xml:space="preserve">.</w:t>
+        <w:t xml:space="preserve">Imputable</w:t>
+      </w:r>
+      <w:r>
+        <w:t xml:space="preserve"> </w:t>
+      </w:r>
+      <w:r>
+        <w:t xml:space="preserve">(si se pueden cargar asientos ahí),</w:t>
+      </w:r>
+      <w:r>
+        <w:t xml:space="preserve"> </w:t>
+      </w:r>
+      <w:r>
+        <w:rPr>
+          <w:b/>
+          <w:bCs/>
+        </w:rPr>
+        <w:t xml:space="preserve">Activa</w:t>
+      </w:r>
+      <w:r>
+        <w:t xml:space="preserve">,</w:t>
+      </w:r>
+      <w:r>
+        <w:t xml:space="preserve"> </w:t>
+      </w:r>
+      <w:r>
+        <w:rPr>
+          <w:b/>
+          <w:bCs/>
+        </w:rPr>
+        <w:t xml:space="preserve">Ajustable</w:t>
+      </w:r>
+      <w:r>
+        <w:t xml:space="preserve"> </w:t>
+      </w:r>
+      <w:r>
+        <w:t xml:space="preserve">(para ajuste por inflación).</w:t>
       </w:r>
     </w:p>
     <w:p>
@@ -12669,6 +12405,538 @@
         </w:numPr>
       </w:pPr>
       <w:r>
+        <w:t xml:space="preserve">Filtrá por tipo, activa o ajustable.</w:t>
+      </w:r>
+    </w:p>
+    <w:bookmarkEnd w:id="48"/>
+    <w:bookmarkStart w:id="49" w:name="asientos-contables"/>
+    <w:p>
+      <w:pPr>
+        <w:pStyle w:val="Heading3"/>
+      </w:pPr>
+      <w:r>
+        <w:t xml:space="preserve">11.2 Asientos contables</w:t>
+      </w:r>
+    </w:p>
+    <w:p>
+      <w:pPr>
+        <w:pStyle w:val="FirstParagraph"/>
+      </w:pPr>
+      <w:r>
+        <w:t xml:space="preserve">Lista de todos los asientos (debe = haber).</w:t>
+      </w:r>
+    </w:p>
+    <w:p>
+      <w:pPr>
+        <w:pStyle w:val="BodyText"/>
+      </w:pPr>
+      <w:r>
+        <w:rPr>
+          <w:b/>
+          <w:bCs/>
+        </w:rPr>
+        <w:t xml:space="preserve">Para cargar un asiento manual:</w:t>
+      </w:r>
+      <w:r>
+        <w:t xml:space="preserve"> </w:t>
+      </w:r>
+      <w:r>
+        <w:t xml:space="preserve">1.</w:t>
+      </w:r>
+      <w:r>
+        <w:t xml:space="preserve"> </w:t>
+      </w:r>
+      <w:r>
+        <w:rPr>
+          <w:b/>
+          <w:bCs/>
+        </w:rPr>
+        <w:t xml:space="preserve">+ Nuevo asiento</w:t>
+      </w:r>
+      <w:r>
+        <w:t xml:space="preserve">.</w:t>
+      </w:r>
+      <w:r>
+        <w:t xml:space="preserve"> </w:t>
+      </w:r>
+      <w:r>
+        <w:t xml:space="preserve">2.</w:t>
+      </w:r>
+      <w:r>
+        <w:t xml:space="preserve"> </w:t>
+      </w:r>
+      <w:r>
+        <w:rPr>
+          <w:b/>
+          <w:bCs/>
+        </w:rPr>
+        <w:t xml:space="preserve">Fecha</w:t>
+      </w:r>
+      <w:r>
+        <w:t xml:space="preserve"> </w:t>
+      </w:r>
+      <w:r>
+        <w:rPr>
+          <w:i/>
+          <w:iCs/>
+        </w:rPr>
+        <w:t xml:space="preserve">,</w:t>
+      </w:r>
+      <w:r>
+        <w:rPr>
+          <w:i/>
+          <w:iCs/>
+        </w:rPr>
+        <w:t xml:space="preserve"> </w:t>
+      </w:r>
+      <w:r>
+        <w:rPr>
+          <w:b/>
+          <w:bCs/>
+          <w:i/>
+          <w:iCs/>
+        </w:rPr>
+        <w:t xml:space="preserve">Descripción</w:t>
+      </w:r>
+      <w:r>
+        <w:rPr>
+          <w:i/>
+          <w:iCs/>
+        </w:rPr>
+        <w:t xml:space="preserve"> </w:t>
+      </w:r>
+      <w:r>
+        <w:t xml:space="preserve">,</w:t>
+      </w:r>
+      <w:r>
+        <w:t xml:space="preserve"> </w:t>
+      </w:r>
+      <w:r>
+        <w:rPr>
+          <w:b/>
+          <w:bCs/>
+        </w:rPr>
+        <w:t xml:space="preserve">Comprobante</w:t>
+      </w:r>
+      <w:r>
+        <w:t xml:space="preserve">,</w:t>
+      </w:r>
+      <w:r>
+        <w:t xml:space="preserve"> </w:t>
+      </w:r>
+      <w:r>
+        <w:rPr>
+          <w:b/>
+          <w:bCs/>
+        </w:rPr>
+        <w:t xml:space="preserve">Tipo</w:t>
+      </w:r>
+      <w:r>
+        <w:t xml:space="preserve"> </w:t>
+      </w:r>
+      <w:r>
+        <w:t xml:space="preserve">(manual / factura / cobro / pago / cierre / ajuste…),</w:t>
+      </w:r>
+      <w:r>
+        <w:t xml:space="preserve"> </w:t>
+      </w:r>
+      <w:r>
+        <w:rPr>
+          <w:b/>
+          <w:bCs/>
+        </w:rPr>
+        <w:t xml:space="preserve">Moneda</w:t>
+      </w:r>
+      <w:r>
+        <w:t xml:space="preserve">.</w:t>
+      </w:r>
+      <w:r>
+        <w:t xml:space="preserve"> </w:t>
+      </w:r>
+      <w:r>
+        <w:t xml:space="preserve">3.</w:t>
+      </w:r>
+      <w:r>
+        <w:t xml:space="preserve"> </w:t>
+      </w:r>
+      <w:r>
+        <w:rPr>
+          <w:b/>
+          <w:bCs/>
+        </w:rPr>
+        <w:t xml:space="preserve">Líneas:</w:t>
+      </w:r>
+      <w:r>
+        <w:t xml:space="preserve"> </w:t>
+      </w:r>
+      <w:r>
+        <w:t xml:space="preserve">agregá cuenta + monto en</w:t>
+      </w:r>
+      <w:r>
+        <w:t xml:space="preserve"> </w:t>
+      </w:r>
+      <w:r>
+        <w:rPr>
+          <w:b/>
+          <w:bCs/>
+        </w:rPr>
+        <w:t xml:space="preserve">Debe</w:t>
+      </w:r>
+      <w:r>
+        <w:t xml:space="preserve"> </w:t>
+      </w:r>
+      <w:r>
+        <w:t xml:space="preserve">o</w:t>
+      </w:r>
+      <w:r>
+        <w:t xml:space="preserve"> </w:t>
+      </w:r>
+      <w:r>
+        <w:rPr>
+          <w:b/>
+          <w:bCs/>
+        </w:rPr>
+        <w:t xml:space="preserve">Haber</w:t>
+      </w:r>
+      <w:r>
+        <w:t xml:space="preserve">. El</w:t>
+      </w:r>
+      <w:r>
+        <w:t xml:space="preserve"> </w:t>
+      </w:r>
+      <w:r>
+        <w:rPr>
+          <w:b/>
+          <w:bCs/>
+        </w:rPr>
+        <w:t xml:space="preserve">total Debe</w:t>
+      </w:r>
+      <w:r>
+        <w:t xml:space="preserve"> </w:t>
+      </w:r>
+      <w:r>
+        <w:t xml:space="preserve">tiene que ser</w:t>
+      </w:r>
+      <w:r>
+        <w:t xml:space="preserve"> </w:t>
+      </w:r>
+      <w:r>
+        <w:rPr>
+          <w:b/>
+          <w:bCs/>
+        </w:rPr>
+        <w:t xml:space="preserve">igual al total Haber</w:t>
+      </w:r>
+      <w:r>
+        <w:t xml:space="preserve"> </w:t>
+      </w:r>
+      <w:r>
+        <w:t xml:space="preserve">(si no, no deja guardar).</w:t>
+      </w:r>
+      <w:r>
+        <w:t xml:space="preserve"> </w:t>
+      </w:r>
+      <w:r>
+        <w:t xml:space="preserve">4. Guardá.</w:t>
+      </w:r>
+    </w:p>
+    <w:p>
+      <w:pPr>
+        <w:pStyle w:val="BodyText"/>
+      </w:pPr>
+      <w:r>
+        <w:rPr>
+          <w:b/>
+          <w:bCs/>
+        </w:rPr>
+        <w:t xml:space="preserve">Estados:</w:t>
+      </w:r>
+      <w:r>
+        <w:t xml:space="preserve"> </w:t>
+      </w:r>
+      <w:r>
+        <w:rPr>
+          <w:rStyle w:val="VerbatimChar"/>
+        </w:rPr>
+        <w:t xml:space="preserve">borrador → confirmado → (anulado)</w:t>
+      </w:r>
+      <w:r>
+        <w:t xml:space="preserve">.</w:t>
+      </w:r>
+      <w:r>
+        <w:t xml:space="preserve"> </w:t>
+      </w:r>
+      <w:r>
+        <w:t xml:space="preserve">-</w:t>
+      </w:r>
+      <w:r>
+        <w:t xml:space="preserve"> </w:t>
+      </w:r>
+      <w:r>
+        <w:rPr>
+          <w:b/>
+          <w:bCs/>
+        </w:rPr>
+        <w:t xml:space="preserve">Editar / Eliminar:</w:t>
+      </w:r>
+      <w:r>
+        <w:t xml:space="preserve"> </w:t>
+      </w:r>
+      <w:r>
+        <w:t xml:space="preserve">solo si está en</w:t>
+      </w:r>
+      <w:r>
+        <w:t xml:space="preserve"> </w:t>
+      </w:r>
+      <w:r>
+        <w:rPr>
+          <w:rStyle w:val="VerbatimChar"/>
+        </w:rPr>
+        <w:t xml:space="preserve">borrador</w:t>
+      </w:r>
+      <w:r>
+        <w:t xml:space="preserve">.</w:t>
+      </w:r>
+      <w:r>
+        <w:t xml:space="preserve"> </w:t>
+      </w:r>
+      <w:r>
+        <w:t xml:space="preserve">-</w:t>
+      </w:r>
+      <w:r>
+        <w:t xml:space="preserve"> </w:t>
+      </w:r>
+      <w:r>
+        <w:rPr>
+          <w:b/>
+          <w:bCs/>
+        </w:rPr>
+        <w:t xml:space="preserve">Anular:</w:t>
+      </w:r>
+      <w:r>
+        <w:t xml:space="preserve"> </w:t>
+      </w:r>
+      <w:r>
+        <w:t xml:space="preserve">genera un asiento inverso (no se borra, se contra-asienta).</w:t>
+      </w:r>
+    </w:p>
+    <w:p>
+      <w:pPr>
+        <w:pStyle w:val="BlockText"/>
+      </w:pPr>
+      <w:r>
+        <w:t xml:space="preserve">La numeración la pone la base de datos: es correlativa y no se repite.</w:t>
+      </w:r>
+    </w:p>
+    <w:bookmarkEnd w:id="49"/>
+    <w:bookmarkStart w:id="50" w:name="cobros-y-pagos"/>
+    <w:p>
+      <w:pPr>
+        <w:pStyle w:val="Heading3"/>
+      </w:pPr>
+      <w:r>
+        <w:t xml:space="preserve">11.3 Cobros y pagos</w:t>
+      </w:r>
+    </w:p>
+    <w:p>
+      <w:pPr>
+        <w:pStyle w:val="FirstParagraph"/>
+      </w:pPr>
+      <w:r>
+        <w:t xml:space="preserve">El lugar para registrar</w:t>
+      </w:r>
+      <w:r>
+        <w:t xml:space="preserve"> </w:t>
+      </w:r>
+      <w:r>
+        <w:rPr>
+          <w:b/>
+          <w:bCs/>
+        </w:rPr>
+        <w:t xml:space="preserve">plata que entra o sale</w:t>
+      </w:r>
+      <w:r>
+        <w:t xml:space="preserve">.</w:t>
+      </w:r>
+    </w:p>
+    <w:p>
+      <w:pPr>
+        <w:pStyle w:val="Compact"/>
+        <w:numPr>
+          <w:ilvl w:val="0"/>
+          <w:numId w:val="1015"/>
+        </w:numPr>
+      </w:pPr>
+      <w:r>
+        <w:t xml:space="preserve">Elegí la pestaña:</w:t>
+      </w:r>
+      <w:r>
+        <w:t xml:space="preserve"> </w:t>
+      </w:r>
+      <w:r>
+        <w:rPr>
+          <w:b/>
+          <w:bCs/>
+        </w:rPr>
+        <w:t xml:space="preserve">Cobro de cliente</w:t>
+      </w:r>
+      <w:r>
+        <w:t xml:space="preserve"> </w:t>
+      </w:r>
+      <w:r>
+        <w:t xml:space="preserve">o</w:t>
+      </w:r>
+      <w:r>
+        <w:t xml:space="preserve"> </w:t>
+      </w:r>
+      <w:r>
+        <w:rPr>
+          <w:b/>
+          <w:bCs/>
+        </w:rPr>
+        <w:t xml:space="preserve">Pago a proveedor</w:t>
+      </w:r>
+      <w:r>
+        <w:t xml:space="preserve">.</w:t>
+      </w:r>
+    </w:p>
+    <w:p>
+      <w:pPr>
+        <w:pStyle w:val="Compact"/>
+        <w:numPr>
+          <w:ilvl w:val="0"/>
+          <w:numId w:val="1015"/>
+        </w:numPr>
+      </w:pPr>
+      <w:r>
+        <w:t xml:space="preserve">Completá</w:t>
+      </w:r>
+      <w:r>
+        <w:t xml:space="preserve"> </w:t>
+      </w:r>
+      <w:r>
+        <w:rPr>
+          <w:b/>
+          <w:bCs/>
+        </w:rPr>
+        <w:t xml:space="preserve">Fecha</w:t>
+      </w:r>
+      <w:r>
+        <w:t xml:space="preserve">,</w:t>
+      </w:r>
+      <w:r>
+        <w:t xml:space="preserve"> </w:t>
+      </w:r>
+      <w:r>
+        <w:rPr>
+          <w:b/>
+          <w:bCs/>
+        </w:rPr>
+        <w:t xml:space="preserve">Tercero</w:t>
+      </w:r>
+      <w:r>
+        <w:t xml:space="preserve"> </w:t>
+      </w:r>
+      <w:r>
+        <w:t xml:space="preserve">(cliente/proveedor),</w:t>
+      </w:r>
+      <w:r>
+        <w:t xml:space="preserve"> </w:t>
+      </w:r>
+      <w:r>
+        <w:rPr>
+          <w:b/>
+          <w:bCs/>
+        </w:rPr>
+        <w:t xml:space="preserve">Monto</w:t>
+      </w:r>
+      <w:r>
+        <w:t xml:space="preserve">,</w:t>
+      </w:r>
+      <w:r>
+        <w:t xml:space="preserve"> </w:t>
+      </w:r>
+      <w:r>
+        <w:rPr>
+          <w:b/>
+          <w:bCs/>
+        </w:rPr>
+        <w:t xml:space="preserve">Moneda</w:t>
+      </w:r>
+      <w:r>
+        <w:t xml:space="preserve"> </w:t>
+      </w:r>
+      <w:r>
+        <w:t xml:space="preserve">(y</w:t>
+      </w:r>
+      <w:r>
+        <w:t xml:space="preserve"> </w:t>
+      </w:r>
+      <w:r>
+        <w:rPr>
+          <w:b/>
+          <w:bCs/>
+        </w:rPr>
+        <w:t xml:space="preserve">TC</w:t>
+      </w:r>
+      <w:r>
+        <w:t xml:space="preserve"> </w:t>
+      </w:r>
+      <w:r>
+        <w:t xml:space="preserve">si es en pesos),</w:t>
+      </w:r>
+      <w:r>
+        <w:t xml:space="preserve"> </w:t>
+      </w:r>
+      <w:r>
+        <w:rPr>
+          <w:b/>
+          <w:bCs/>
+        </w:rPr>
+        <w:t xml:space="preserve">Método</w:t>
+      </w:r>
+      <w:r>
+        <w:t xml:space="preserve"> </w:t>
+      </w:r>
+      <w:r>
+        <w:t xml:space="preserve">(caja / banco / cheque diferido),</w:t>
+      </w:r>
+      <w:r>
+        <w:t xml:space="preserve"> </w:t>
+      </w:r>
+      <w:r>
+        <w:rPr>
+          <w:b/>
+          <w:bCs/>
+        </w:rPr>
+        <w:t xml:space="preserve">Comprobante / recibo</w:t>
+      </w:r>
+      <w:r>
+        <w:t xml:space="preserve">,</w:t>
+      </w:r>
+      <w:r>
+        <w:t xml:space="preserve"> </w:t>
+      </w:r>
+      <w:r>
+        <w:rPr>
+          <w:b/>
+          <w:bCs/>
+        </w:rPr>
+        <w:t xml:space="preserve">Observaciones</w:t>
+      </w:r>
+      <w:r>
+        <w:t xml:space="preserve">.</w:t>
+      </w:r>
+    </w:p>
+    <w:p>
+      <w:pPr>
+        <w:pStyle w:val="Compact"/>
+        <w:numPr>
+          <w:ilvl w:val="0"/>
+          <w:numId w:val="1015"/>
+        </w:numPr>
+      </w:pPr>
+      <w:r>
         <w:rPr>
           <w:b/>
           <w:bCs/>
@@ -12894,8 +13162,8 @@
         <w:t xml:space="preserve">.</w:t>
       </w:r>
     </w:p>
-    <w:bookmarkEnd w:id="49"/>
-    <w:bookmarkStart w:id="50" w:name="cheques"/>
+    <w:bookmarkEnd w:id="50"/>
+    <w:bookmarkStart w:id="51" w:name="cheques"/>
     <w:p>
       <w:pPr>
         <w:pStyle w:val="Heading3"/>
@@ -13224,8 +13492,8 @@
         <w:t xml:space="preserve">no generan asiento.</w:t>
       </w:r>
     </w:p>
-    <w:bookmarkEnd w:id="50"/>
-    <w:bookmarkStart w:id="51" w:name="libros-y-estados-contables"/>
+    <w:bookmarkEnd w:id="51"/>
+    <w:bookmarkStart w:id="52" w:name="libros-y-estados-contables"/>
     <w:p>
       <w:pPr>
         <w:pStyle w:val="Heading3"/>
@@ -13685,8 +13953,8 @@
         <w:t xml:space="preserve">(foto valorizada del stock a hoy: MP por lote y por material con promedio ponderado, PT e insumos — respaldo de Bienes de Cambio del balance) y plan de cuentas.</w:t>
       </w:r>
     </w:p>
-    <w:bookmarkEnd w:id="51"/>
-    <w:bookmarkStart w:id="52" w:name="correlatividad"/>
+    <w:bookmarkEnd w:id="52"/>
+    <w:bookmarkStart w:id="53" w:name="correlatividad"/>
     <w:p>
       <w:pPr>
         <w:pStyle w:val="Heading3"/>
@@ -13732,93 +14000,14 @@
         <w:t xml:space="preserve">. Revisalo antes de cierres o auditorías.</w:t>
       </w:r>
     </w:p>
-    <w:bookmarkEnd w:id="52"/>
-    <w:bookmarkStart w:id="53" w:name="conciliación-bancaria"/>
+    <w:bookmarkEnd w:id="53"/>
+    <w:bookmarkStart w:id="54" w:name="conciliación-bancaria"/>
     <w:p>
       <w:pPr>
         <w:pStyle w:val="Heading3"/>
       </w:pPr>
       <w:r>
         <w:t xml:space="preserve">11.7 Conciliación bancaria</w:t>
-      </w:r>
-    </w:p>
-    <w:p>
-      <w:pPr>
-        <w:pStyle w:val="Compact"/>
-        <w:numPr>
-          <w:ilvl w:val="0"/>
-          <w:numId w:val="1015"/>
-        </w:numPr>
-      </w:pPr>
-      <w:r>
-        <w:t xml:space="preserve">Definí las</w:t>
-      </w:r>
-      <w:r>
-        <w:t xml:space="preserve"> </w:t>
-      </w:r>
-      <w:r>
-        <w:rPr>
-          <w:b/>
-          <w:bCs/>
-        </w:rPr>
-        <w:t xml:space="preserve">cuentas bancarias</w:t>
-      </w:r>
-      <w:r>
-        <w:t xml:space="preserve">.</w:t>
-      </w:r>
-    </w:p>
-    <w:p>
-      <w:pPr>
-        <w:pStyle w:val="Compact"/>
-        <w:numPr>
-          <w:ilvl w:val="0"/>
-          <w:numId w:val="1015"/>
-        </w:numPr>
-      </w:pPr>
-      <w:r>
-        <w:rPr>
-          <w:b/>
-          <w:bCs/>
-        </w:rPr>
-        <w:t xml:space="preserve">Importá el extracto</w:t>
-      </w:r>
-      <w:r>
-        <w:t xml:space="preserve"> </w:t>
-      </w:r>
-      <w:r>
-        <w:t xml:space="preserve">del banco (CSV/XLS).</w:t>
-      </w:r>
-    </w:p>
-    <w:p>
-      <w:pPr>
-        <w:pStyle w:val="Compact"/>
-        <w:numPr>
-          <w:ilvl w:val="0"/>
-          <w:numId w:val="1015"/>
-        </w:numPr>
-      </w:pPr>
-      <w:r>
-        <w:rPr>
-          <w:b/>
-          <w:bCs/>
-        </w:rPr>
-        <w:t xml:space="preserve">Conciliá:</w:t>
-      </w:r>
-      <w:r>
-        <w:t xml:space="preserve"> </w:t>
-      </w:r>
-      <w:r>
-        <w:t xml:space="preserve">emparejá cada línea del extracto con su asiento. Los no conciliados quedan marcados.</w:t>
-      </w:r>
-    </w:p>
-    <w:bookmarkEnd w:id="53"/>
-    <w:bookmarkStart w:id="54" w:name="cierre-períodos-y-ajuste-por-inflación"/>
-    <w:p>
-      <w:pPr>
-        <w:pStyle w:val="Heading3"/>
-      </w:pPr>
-      <w:r>
-        <w:t xml:space="preserve">11.8 Cierre, períodos y ajuste por inflación</w:t>
       </w:r>
     </w:p>
     <w:p>
@@ -13830,30 +14019,20 @@
         </w:numPr>
       </w:pPr>
       <w:r>
-        <w:rPr>
-          <w:b/>
-          <w:bCs/>
-        </w:rPr>
-        <w:t xml:space="preserve">Períodos mensuales:</w:t>
-      </w:r>
-      <w:r>
-        <w:t xml:space="preserve"> </w:t>
-      </w:r>
-      <w:r>
-        <w:t xml:space="preserve">cerrás un mes para que</w:t>
-      </w:r>
-      <w:r>
-        <w:t xml:space="preserve"> </w:t>
-      </w:r>
-      <w:r>
-        <w:rPr>
-          <w:b/>
-          <w:bCs/>
-        </w:rPr>
-        <w:t xml:space="preserve">nadie cargue asientos en él</w:t>
-      </w:r>
-      <w:r>
-        <w:t xml:space="preserve">. Si necesitás corregir, lo reabre el administrador.</w:t>
+        <w:t xml:space="preserve">Definí las</w:t>
+      </w:r>
+      <w:r>
+        <w:t xml:space="preserve"> </w:t>
+      </w:r>
+      <w:r>
+        <w:rPr>
+          <w:b/>
+          <w:bCs/>
+        </w:rPr>
+        <w:t xml:space="preserve">cuentas bancarias</w:t>
+      </w:r>
+      <w:r>
+        <w:t xml:space="preserve">.</w:t>
       </w:r>
     </w:p>
     <w:p>
@@ -13869,13 +14048,13 @@
           <w:b/>
           <w:bCs/>
         </w:rPr>
-        <w:t xml:space="preserve">Índices IPC:</w:t>
-      </w:r>
-      <w:r>
-        <w:t xml:space="preserve"> </w:t>
-      </w:r>
-      <w:r>
-        <w:t xml:space="preserve">cargá el IPC del INDEC mes a mes. Es la base para el ajuste por inflación.</w:t>
+        <w:t xml:space="preserve">Importá el extracto</w:t>
+      </w:r>
+      <w:r>
+        <w:t xml:space="preserve"> </w:t>
+      </w:r>
+      <w:r>
+        <w:t xml:space="preserve">del banco (CSV/XLS).</w:t>
       </w:r>
     </w:p>
     <w:p>
@@ -13891,233 +14070,23 @@
           <w:b/>
           <w:bCs/>
         </w:rPr>
-        <w:t xml:space="preserve">Ajuste por inflación (RT 6):</w:t>
-      </w:r>
-      <w:r>
-        <w:t xml:space="preserve"> </w:t>
-      </w:r>
-      <w:r>
-        <w:t xml:space="preserve">elegí el período,</w:t>
-      </w:r>
-      <w:r>
-        <w:t xml:space="preserve"> </w:t>
-      </w:r>
-      <w:r>
-        <w:rPr>
-          <w:b/>
-          <w:bCs/>
-        </w:rPr>
-        <w:t xml:space="preserve">Calcular preview</w:t>
-      </w:r>
-      <w:r>
-        <w:t xml:space="preserve">, revisá y</w:t>
-      </w:r>
-      <w:r>
-        <w:t xml:space="preserve"> </w:t>
-      </w:r>
-      <w:r>
-        <w:rPr>
-          <w:b/>
-          <w:bCs/>
-        </w:rPr>
-        <w:t xml:space="preserve">Generar asiento</w:t>
-      </w:r>
-      <w:r>
-        <w:t xml:space="preserve"> </w:t>
-      </w:r>
-      <w:r>
-        <w:t xml:space="preserve">(reexpresa las cuentas no monetarias contra RECPAM). Necesitás al menos 2 meses de IPC cargados.</w:t>
-      </w:r>
-    </w:p>
-    <w:p>
-      <w:pPr>
-        <w:pStyle w:val="Compact"/>
-        <w:numPr>
-          <w:ilvl w:val="0"/>
-          <w:numId w:val="1016"/>
-        </w:numPr>
-      </w:pPr>
-      <w:r>
-        <w:rPr>
-          <w:b/>
-          <w:bCs/>
-        </w:rPr>
-        <w:t xml:space="preserve">Cierre y apertura:</w:t>
-      </w:r>
-      <w:r>
-        <w:t xml:space="preserve"> </w:t>
-      </w:r>
-      <w:r>
-        <w:t xml:space="preserve">cierre del ejercicio en pasos (refundición de resultados → pasaje a resultados no asignados → cierre patrimonial → apertura). Usá</w:t>
-      </w:r>
-      <w:r>
-        <w:t xml:space="preserve"> </w:t>
-      </w:r>
-      <w:r>
-        <w:rPr>
-          <w:b/>
-          <w:bCs/>
-        </w:rPr>
-        <w:t xml:space="preserve">Calcular preview</w:t>
-      </w:r>
-      <w:r>
-        <w:t xml:space="preserve"> </w:t>
-      </w:r>
-      <w:r>
-        <w:t xml:space="preserve">antes de</w:t>
-      </w:r>
-      <w:r>
-        <w:t xml:space="preserve"> </w:t>
-      </w:r>
-      <w:r>
-        <w:rPr>
-          <w:b/>
-          <w:bCs/>
-        </w:rPr>
-        <w:t xml:space="preserve">Generar asientos</w:t>
-      </w:r>
-      <w:r>
-        <w:t xml:space="preserve">.</w:t>
-      </w:r>
-    </w:p>
-    <w:p>
-      <w:r>
-        <w:pict>
-          <v:rect style="width:0;height:1.5pt" o:hralign="center" o:hrstd="t" o:hr="t"/>
-        </w:pict>
+        <w:t xml:space="preserve">Conciliá:</w:t>
+      </w:r>
+      <w:r>
+        <w:t xml:space="preserve"> </w:t>
+      </w:r>
+      <w:r>
+        <w:t xml:space="preserve">emparejá cada línea del extracto con su asiento. Los no conciliados quedan marcados.</w:t>
       </w:r>
     </w:p>
     <w:bookmarkEnd w:id="54"/>
-    <w:bookmarkEnd w:id="55"/>
-    <w:bookmarkStart w:id="59" w:name="configuración"/>
-    <w:p>
-      <w:pPr>
-        <w:pStyle w:val="Heading2"/>
-      </w:pPr>
-      <w:r>
-        <w:t xml:space="preserve">12. Configuración</w:t>
-      </w:r>
-    </w:p>
-    <w:p>
-      <w:pPr>
-        <w:pStyle w:val="FirstParagraph"/>
-      </w:pPr>
-      <w:r>
-        <w:t xml:space="preserve">Tres pestañas. Las dos últimas son</w:t>
-      </w:r>
-      <w:r>
-        <w:t xml:space="preserve"> </w:t>
-      </w:r>
-      <w:r>
-        <w:rPr>
-          <w:b/>
-          <w:bCs/>
-        </w:rPr>
-        <w:t xml:space="preserve">solo para el administrador</w:t>
-      </w:r>
-      <w:r>
-        <w:t xml:space="preserve">.</w:t>
-      </w:r>
-    </w:p>
-    <w:bookmarkStart w:id="56" w:name="materiales"/>
+    <w:bookmarkStart w:id="55" w:name="cierre-períodos-y-ajuste-por-inflación"/>
     <w:p>
       <w:pPr>
         <w:pStyle w:val="Heading3"/>
       </w:pPr>
       <w:r>
-        <w:t xml:space="preserve">12.1 Materiales</w:t>
-      </w:r>
-    </w:p>
-    <w:p>
-      <w:pPr>
-        <w:pStyle w:val="FirstParagraph"/>
-      </w:pPr>
-      <w:r>
-        <w:t xml:space="preserve">El catálogo de tipos de acero / normas que después elegís en barras y certificados.</w:t>
-      </w:r>
-      <w:r>
-        <w:t xml:space="preserve"> </w:t>
-      </w:r>
-      <w:r>
-        <w:rPr>
-          <w:b/>
-          <w:bCs/>
-        </w:rPr>
-        <w:t xml:space="preserve">+ Nuevo material</w:t>
-      </w:r>
-      <w:r>
-        <w:t xml:space="preserve"> </w:t>
-      </w:r>
-      <w:r>
-        <w:t xml:space="preserve">→</w:t>
-      </w:r>
-      <w:r>
-        <w:t xml:space="preserve"> </w:t>
-      </w:r>
-      <w:r>
-        <w:rPr>
-          <w:b/>
-          <w:bCs/>
-        </w:rPr>
-        <w:t xml:space="preserve">Material / Norma</w:t>
-      </w:r>
-      <w:r>
-        <w:t xml:space="preserve"> </w:t>
-      </w:r>
-      <w:r>
-        <w:t xml:space="preserve">*,</w:t>
-      </w:r>
-      <w:r>
-        <w:t xml:space="preserve"> </w:t>
-      </w:r>
-      <w:r>
-        <w:rPr>
-          <w:b/>
-          <w:bCs/>
-        </w:rPr>
-        <w:t xml:space="preserve">Descripción</w:t>
-      </w:r>
-      <w:r>
-        <w:t xml:space="preserve">,</w:t>
-      </w:r>
-      <w:r>
-        <w:t xml:space="preserve"> </w:t>
-      </w:r>
-      <w:r>
-        <w:rPr>
-          <w:b/>
-          <w:bCs/>
-        </w:rPr>
-        <w:t xml:space="preserve">Orden</w:t>
-      </w:r>
-      <w:r>
-        <w:t xml:space="preserve">,</w:t>
-      </w:r>
-      <w:r>
-        <w:t xml:space="preserve"> </w:t>
-      </w:r>
-      <w:r>
-        <w:rPr>
-          <w:b/>
-          <w:bCs/>
-        </w:rPr>
-        <w:t xml:space="preserve">Estado</w:t>
-      </w:r>
-      <w:r>
-        <w:t xml:space="preserve"> </w:t>
-      </w:r>
-      <w:r>
-        <w:t xml:space="preserve">(activo / inactivo).</w:t>
-      </w:r>
-    </w:p>
-    <w:bookmarkEnd w:id="56"/>
-    <w:bookmarkStart w:id="57" w:name="usuarios-y-permisos-admin"/>
-    <w:p>
-      <w:pPr>
-        <w:pStyle w:val="Heading3"/>
-      </w:pPr>
-      <w:r>
-        <w:t xml:space="preserve">12.2 Usuarios y permisos (admin)</w:t>
+        <w:t xml:space="preserve">11.8 Cierre, períodos y ajuste por inflación</w:t>
       </w:r>
     </w:p>
     <w:p>
@@ -14129,23 +14098,30 @@
         </w:numPr>
       </w:pPr>
       <w:r>
-        <w:t xml:space="preserve">Ves y podés</w:t>
-      </w:r>
-      <w:r>
-        <w:t xml:space="preserve"> </w:t>
-      </w:r>
-      <w:r>
-        <w:rPr>
-          <w:b/>
-          <w:bCs/>
-        </w:rPr>
-        <w:t xml:space="preserve">cambiar el código de empresa</w:t>
-      </w:r>
-      <w:r>
-        <w:t xml:space="preserve"> </w:t>
-      </w:r>
-      <w:r>
-        <w:t xml:space="preserve">(el que usan los nuevos para unirse).</w:t>
+        <w:rPr>
+          <w:b/>
+          <w:bCs/>
+        </w:rPr>
+        <w:t xml:space="preserve">Períodos mensuales:</w:t>
+      </w:r>
+      <w:r>
+        <w:t xml:space="preserve"> </w:t>
+      </w:r>
+      <w:r>
+        <w:t xml:space="preserve">cerrás un mes para que</w:t>
+      </w:r>
+      <w:r>
+        <w:t xml:space="preserve"> </w:t>
+      </w:r>
+      <w:r>
+        <w:rPr>
+          <w:b/>
+          <w:bCs/>
+        </w:rPr>
+        <w:t xml:space="preserve">nadie cargue asientos en él</w:t>
+      </w:r>
+      <w:r>
+        <w:t xml:space="preserve">. Si necesitás corregir, lo reabre el administrador.</w:t>
       </w:r>
     </w:p>
     <w:p>
@@ -14157,101 +14133,259 @@
         </w:numPr>
       </w:pPr>
       <w:r>
-        <w:t xml:space="preserve">Listás usuarios, editás su</w:t>
-      </w:r>
-      <w:r>
-        <w:t xml:space="preserve"> </w:t>
-      </w:r>
-      <w:r>
-        <w:rPr>
-          <w:b/>
-          <w:bCs/>
-        </w:rPr>
-        <w:t xml:space="preserve">rol</w:t>
-      </w:r>
-      <w:r>
-        <w:t xml:space="preserve"> </w:t>
-      </w:r>
-      <w:r>
-        <w:t xml:space="preserve">y</w:t>
-      </w:r>
-      <w:r>
-        <w:t xml:space="preserve"> </w:t>
-      </w:r>
-      <w:r>
-        <w:rPr>
-          <w:b/>
-          <w:bCs/>
-        </w:rPr>
-        <w:t xml:space="preserve">habilitás/deshabilitás módulos</w:t>
-      </w:r>
-      <w:r>
-        <w:t xml:space="preserve"> </w:t>
-      </w:r>
-      <w:r>
-        <w:t xml:space="preserve">por usuario. La lista cubre todos los módulos del sistema (inventario, producción, compras, ventas, calidad, análisis y contabilidad).</w:t>
-      </w:r>
-    </w:p>
-    <w:p>
-      <w:pPr>
-        <w:pStyle w:val="BlockText"/>
-      </w:pPr>
-      <w:r>
-        <w:rPr>
-          <w:b/>
-          <w:bCs/>
-        </w:rPr>
-        <w:t xml:space="preserve">Nota técnica:</w:t>
-      </w:r>
-      <w:r>
-        <w:t xml:space="preserve"> </w:t>
-      </w:r>
-      <w:r>
-        <w:t xml:space="preserve">los permisos por módulo hoy son</w:t>
-      </w:r>
-      <w:r>
-        <w:t xml:space="preserve"> </w:t>
-      </w:r>
-      <w:r>
-        <w:rPr>
-          <w:b/>
-          <w:bCs/>
-        </w:rPr>
-        <w:t xml:space="preserve">visuales</w:t>
-      </w:r>
-      <w:r>
-        <w:t xml:space="preserve"> </w:t>
-      </w:r>
-      <w:r>
-        <w:t xml:space="preserve">(esconden secciones del menú). No los uses como barrera de seguridad fuerte.</w:t>
+        <w:rPr>
+          <w:b/>
+          <w:bCs/>
+        </w:rPr>
+        <w:t xml:space="preserve">Índices IPC:</w:t>
+      </w:r>
+      <w:r>
+        <w:t xml:space="preserve"> </w:t>
+      </w:r>
+      <w:r>
+        <w:t xml:space="preserve">cargá el IPC del INDEC mes a mes. Es la base para el ajuste por inflación.</w:t>
+      </w:r>
+    </w:p>
+    <w:p>
+      <w:pPr>
+        <w:pStyle w:val="Compact"/>
+        <w:numPr>
+          <w:ilvl w:val="0"/>
+          <w:numId w:val="1017"/>
+        </w:numPr>
+      </w:pPr>
+      <w:r>
+        <w:rPr>
+          <w:b/>
+          <w:bCs/>
+        </w:rPr>
+        <w:t xml:space="preserve">Ajuste por inflación (RT 6):</w:t>
+      </w:r>
+      <w:r>
+        <w:t xml:space="preserve"> </w:t>
+      </w:r>
+      <w:r>
+        <w:t xml:space="preserve">elegí el período,</w:t>
+      </w:r>
+      <w:r>
+        <w:t xml:space="preserve"> </w:t>
+      </w:r>
+      <w:r>
+        <w:rPr>
+          <w:b/>
+          <w:bCs/>
+        </w:rPr>
+        <w:t xml:space="preserve">Calcular preview</w:t>
+      </w:r>
+      <w:r>
+        <w:t xml:space="preserve">, revisá y</w:t>
+      </w:r>
+      <w:r>
+        <w:t xml:space="preserve"> </w:t>
+      </w:r>
+      <w:r>
+        <w:rPr>
+          <w:b/>
+          <w:bCs/>
+        </w:rPr>
+        <w:t xml:space="preserve">Generar asiento</w:t>
+      </w:r>
+      <w:r>
+        <w:t xml:space="preserve"> </w:t>
+      </w:r>
+      <w:r>
+        <w:t xml:space="preserve">(reexpresa las cuentas no monetarias contra RECPAM). Necesitás al menos 2 meses de IPC cargados.</w:t>
+      </w:r>
+    </w:p>
+    <w:p>
+      <w:pPr>
+        <w:pStyle w:val="Compact"/>
+        <w:numPr>
+          <w:ilvl w:val="0"/>
+          <w:numId w:val="1017"/>
+        </w:numPr>
+      </w:pPr>
+      <w:r>
+        <w:rPr>
+          <w:b/>
+          <w:bCs/>
+        </w:rPr>
+        <w:t xml:space="preserve">Cierre y apertura:</w:t>
+      </w:r>
+      <w:r>
+        <w:t xml:space="preserve"> </w:t>
+      </w:r>
+      <w:r>
+        <w:t xml:space="preserve">cierre del ejercicio en pasos (refundición de resultados → pasaje a resultados no asignados → cierre patrimonial → apertura). Usá</w:t>
+      </w:r>
+      <w:r>
+        <w:t xml:space="preserve"> </w:t>
+      </w:r>
+      <w:r>
+        <w:rPr>
+          <w:b/>
+          <w:bCs/>
+        </w:rPr>
+        <w:t xml:space="preserve">Calcular preview</w:t>
+      </w:r>
+      <w:r>
+        <w:t xml:space="preserve"> </w:t>
+      </w:r>
+      <w:r>
+        <w:t xml:space="preserve">antes de</w:t>
+      </w:r>
+      <w:r>
+        <w:t xml:space="preserve"> </w:t>
+      </w:r>
+      <w:r>
+        <w:rPr>
+          <w:b/>
+          <w:bCs/>
+        </w:rPr>
+        <w:t xml:space="preserve">Generar asientos</w:t>
+      </w:r>
+      <w:r>
+        <w:t xml:space="preserve">.</w:t>
+      </w:r>
+    </w:p>
+    <w:p>
+      <w:r>
+        <w:pict>
+          <v:rect style="width:0;height:1.5pt" o:hralign="center" o:hrstd="t" o:hr="t"/>
+        </w:pict>
+      </w:r>
+    </w:p>
+    <w:bookmarkEnd w:id="55"/>
+    <w:bookmarkEnd w:id="56"/>
+    <w:bookmarkStart w:id="60" w:name="configuración"/>
+    <w:p>
+      <w:pPr>
+        <w:pStyle w:val="Heading2"/>
+      </w:pPr>
+      <w:r>
+        <w:t xml:space="preserve">12. Configuración</w:t>
+      </w:r>
+    </w:p>
+    <w:p>
+      <w:pPr>
+        <w:pStyle w:val="FirstParagraph"/>
+      </w:pPr>
+      <w:r>
+        <w:t xml:space="preserve">Tres pestañas. Las dos últimas son</w:t>
+      </w:r>
+      <w:r>
+        <w:t xml:space="preserve"> </w:t>
+      </w:r>
+      <w:r>
+        <w:rPr>
+          <w:b/>
+          <w:bCs/>
+        </w:rPr>
+        <w:t xml:space="preserve">solo para el administrador</w:t>
+      </w:r>
+      <w:r>
+        <w:t xml:space="preserve">.</w:t>
+      </w:r>
+    </w:p>
+    <w:bookmarkStart w:id="57" w:name="materiales"/>
+    <w:p>
+      <w:pPr>
+        <w:pStyle w:val="Heading3"/>
+      </w:pPr>
+      <w:r>
+        <w:t xml:space="preserve">12.1 Materiales</w:t>
+      </w:r>
+    </w:p>
+    <w:p>
+      <w:pPr>
+        <w:pStyle w:val="FirstParagraph"/>
+      </w:pPr>
+      <w:r>
+        <w:t xml:space="preserve">El catálogo de tipos de acero / normas que después elegís en barras y certificados.</w:t>
+      </w:r>
+      <w:r>
+        <w:t xml:space="preserve"> </w:t>
+      </w:r>
+      <w:r>
+        <w:rPr>
+          <w:b/>
+          <w:bCs/>
+        </w:rPr>
+        <w:t xml:space="preserve">+ Nuevo material</w:t>
+      </w:r>
+      <w:r>
+        <w:t xml:space="preserve"> </w:t>
+      </w:r>
+      <w:r>
+        <w:t xml:space="preserve">→</w:t>
+      </w:r>
+      <w:r>
+        <w:t xml:space="preserve"> </w:t>
+      </w:r>
+      <w:r>
+        <w:rPr>
+          <w:b/>
+          <w:bCs/>
+        </w:rPr>
+        <w:t xml:space="preserve">Material / Norma</w:t>
+      </w:r>
+      <w:r>
+        <w:t xml:space="preserve"> </w:t>
+      </w:r>
+      <w:r>
+        <w:t xml:space="preserve">*,</w:t>
+      </w:r>
+      <w:r>
+        <w:t xml:space="preserve"> </w:t>
+      </w:r>
+      <w:r>
+        <w:rPr>
+          <w:b/>
+          <w:bCs/>
+        </w:rPr>
+        <w:t xml:space="preserve">Descripción</w:t>
+      </w:r>
+      <w:r>
+        <w:t xml:space="preserve">,</w:t>
+      </w:r>
+      <w:r>
+        <w:t xml:space="preserve"> </w:t>
+      </w:r>
+      <w:r>
+        <w:rPr>
+          <w:b/>
+          <w:bCs/>
+        </w:rPr>
+        <w:t xml:space="preserve">Orden</w:t>
+      </w:r>
+      <w:r>
+        <w:t xml:space="preserve">,</w:t>
+      </w:r>
+      <w:r>
+        <w:t xml:space="preserve"> </w:t>
+      </w:r>
+      <w:r>
+        <w:rPr>
+          <w:b/>
+          <w:bCs/>
+        </w:rPr>
+        <w:t xml:space="preserve">Estado</w:t>
+      </w:r>
+      <w:r>
+        <w:t xml:space="preserve"> </w:t>
+      </w:r>
+      <w:r>
+        <w:t xml:space="preserve">(activo / inactivo).</w:t>
       </w:r>
     </w:p>
     <w:bookmarkEnd w:id="57"/>
-    <w:bookmarkStart w:id="58" w:name="imputación-contable"/>
+    <w:bookmarkStart w:id="58" w:name="usuarios-y-permisos-admin"/>
     <w:p>
       <w:pPr>
         <w:pStyle w:val="Heading3"/>
       </w:pPr>
       <w:r>
-        <w:t xml:space="preserve">12.3 Imputación contable</w:t>
-      </w:r>
-    </w:p>
-    <w:p>
-      <w:pPr>
-        <w:pStyle w:val="FirstParagraph"/>
-      </w:pPr>
-      <w:r>
-        <w:rPr>
-          <w:b/>
-          <w:bCs/>
-        </w:rPr>
-        <w:t xml:space="preserve">Clave para que los asientos automáticos funcionen.</w:t>
-      </w:r>
-      <w:r>
-        <w:t xml:space="preserve"> </w:t>
-      </w:r>
-      <w:r>
-        <w:t xml:space="preserve">Acá decís qué cuenta contable usar para cada tipo de operación:</w:t>
+        <w:t xml:space="preserve">12.2 Usuarios y permisos (admin)</w:t>
       </w:r>
     </w:p>
     <w:p>
@@ -14263,62 +14397,23 @@
         </w:numPr>
       </w:pPr>
       <w:r>
-        <w:rPr>
-          <w:b/>
-          <w:bCs/>
-        </w:rPr>
-        <w:t xml:space="preserve">Ventas:</w:t>
-      </w:r>
-      <w:r>
-        <w:t xml:space="preserve"> </w:t>
-      </w:r>
-      <w:r>
-        <w:t xml:space="preserve">cuenta de venta, deudores por ventas, IVA débito fiscal,</w:t>
-      </w:r>
-      <w:r>
-        <w:t xml:space="preserve"> </w:t>
-      </w:r>
-      <w:r>
-        <w:rPr>
-          <w:b/>
-          <w:bCs/>
-        </w:rPr>
-        <w:t xml:space="preserve">alícuota de IVA</w:t>
-      </w:r>
-      <w:r>
-        <w:t xml:space="preserve"> </w:t>
-      </w:r>
-      <w:r>
-        <w:t xml:space="preserve">(21% por defecto), si los precios</w:t>
-      </w:r>
-      <w:r>
-        <w:t xml:space="preserve"> </w:t>
-      </w:r>
-      <w:r>
-        <w:rPr>
-          <w:b/>
-          <w:bCs/>
-        </w:rPr>
-        <w:t xml:space="preserve">incluyen IVA</w:t>
-      </w:r>
-      <w:r>
-        <w:t xml:space="preserve">, y el</w:t>
-      </w:r>
-      <w:r>
-        <w:t xml:space="preserve"> </w:t>
-      </w:r>
-      <w:r>
-        <w:rPr>
-          <w:b/>
-          <w:bCs/>
-        </w:rPr>
-        <w:t xml:space="preserve">punto de venta AFIP</w:t>
-      </w:r>
-      <w:r>
-        <w:t xml:space="preserve"> </w:t>
-      </w:r>
-      <w:r>
-        <w:t xml:space="preserve">para la facturación electrónica.</w:t>
+        <w:t xml:space="preserve">Ves y podés</w:t>
+      </w:r>
+      <w:r>
+        <w:t xml:space="preserve"> </w:t>
+      </w:r>
+      <w:r>
+        <w:rPr>
+          <w:b/>
+          <w:bCs/>
+        </w:rPr>
+        <w:t xml:space="preserve">cambiar el código de empresa</w:t>
+      </w:r>
+      <w:r>
+        <w:t xml:space="preserve"> </w:t>
+      </w:r>
+      <w:r>
+        <w:t xml:space="preserve">(el que usan los nuevos para unirse).</w:t>
       </w:r>
     </w:p>
     <w:p>
@@ -14330,33 +14425,101 @@
         </w:numPr>
       </w:pPr>
       <w:r>
-        <w:rPr>
-          <w:b/>
-          <w:bCs/>
-        </w:rPr>
-        <w:t xml:space="preserve">Compras:</w:t>
-      </w:r>
-      <w:r>
-        <w:t xml:space="preserve"> </w:t>
-      </w:r>
-      <w:r>
-        <w:t xml:space="preserve">IVA crédito fiscal, proveedores, compra de materia prima / insumos / herramientas, servicios de terceros, y la cuenta puente</w:t>
-      </w:r>
-      <w:r>
-        <w:t xml:space="preserve"> </w:t>
-      </w:r>
-      <w:r>
-        <w:rPr>
-          <w:b/>
-          <w:bCs/>
-        </w:rPr>
-        <w:t xml:space="preserve">GR/IR</w:t>
-      </w:r>
-      <w:r>
-        <w:t xml:space="preserve"> </w:t>
-      </w:r>
-      <w:r>
-        <w:t xml:space="preserve">(facturas a recibir).</w:t>
+        <w:t xml:space="preserve">Listás usuarios, editás su</w:t>
+      </w:r>
+      <w:r>
+        <w:t xml:space="preserve"> </w:t>
+      </w:r>
+      <w:r>
+        <w:rPr>
+          <w:b/>
+          <w:bCs/>
+        </w:rPr>
+        <w:t xml:space="preserve">rol</w:t>
+      </w:r>
+      <w:r>
+        <w:t xml:space="preserve"> </w:t>
+      </w:r>
+      <w:r>
+        <w:t xml:space="preserve">y</w:t>
+      </w:r>
+      <w:r>
+        <w:t xml:space="preserve"> </w:t>
+      </w:r>
+      <w:r>
+        <w:rPr>
+          <w:b/>
+          <w:bCs/>
+        </w:rPr>
+        <w:t xml:space="preserve">habilitás/deshabilitás módulos</w:t>
+      </w:r>
+      <w:r>
+        <w:t xml:space="preserve"> </w:t>
+      </w:r>
+      <w:r>
+        <w:t xml:space="preserve">por usuario. La lista cubre todos los módulos del sistema (inventario, producción, compras, ventas, calidad, análisis y contabilidad).</w:t>
+      </w:r>
+    </w:p>
+    <w:p>
+      <w:pPr>
+        <w:pStyle w:val="BlockText"/>
+      </w:pPr>
+      <w:r>
+        <w:rPr>
+          <w:b/>
+          <w:bCs/>
+        </w:rPr>
+        <w:t xml:space="preserve">Nota técnica:</w:t>
+      </w:r>
+      <w:r>
+        <w:t xml:space="preserve"> </w:t>
+      </w:r>
+      <w:r>
+        <w:t xml:space="preserve">los permisos por módulo hoy son</w:t>
+      </w:r>
+      <w:r>
+        <w:t xml:space="preserve"> </w:t>
+      </w:r>
+      <w:r>
+        <w:rPr>
+          <w:b/>
+          <w:bCs/>
+        </w:rPr>
+        <w:t xml:space="preserve">visuales</w:t>
+      </w:r>
+      <w:r>
+        <w:t xml:space="preserve"> </w:t>
+      </w:r>
+      <w:r>
+        <w:t xml:space="preserve">(esconden secciones del menú). No los uses como barrera de seguridad fuerte.</w:t>
+      </w:r>
+    </w:p>
+    <w:bookmarkEnd w:id="58"/>
+    <w:bookmarkStart w:id="59" w:name="imputación-contable"/>
+    <w:p>
+      <w:pPr>
+        <w:pStyle w:val="Heading3"/>
+      </w:pPr>
+      <w:r>
+        <w:t xml:space="preserve">12.3 Imputación contable</w:t>
+      </w:r>
+    </w:p>
+    <w:p>
+      <w:pPr>
+        <w:pStyle w:val="FirstParagraph"/>
+      </w:pPr>
+      <w:r>
+        <w:rPr>
+          <w:b/>
+          <w:bCs/>
+        </w:rPr>
+        <w:t xml:space="preserve">Clave para que los asientos automáticos funcionen.</w:t>
+      </w:r>
+      <w:r>
+        <w:t xml:space="preserve"> </w:t>
+      </w:r>
+      <w:r>
+        <w:t xml:space="preserve">Acá decís qué cuenta contable usar para cada tipo de operación:</w:t>
       </w:r>
     </w:p>
     <w:p>
@@ -14364,7 +14527,7 @@
         <w:pStyle w:val="Compact"/>
         <w:numPr>
           <w:ilvl w:val="0"/>
-          <w:numId w:val="1018"/>
+          <w:numId w:val="1019"/>
         </w:numPr>
       </w:pPr>
       <w:r>
@@ -14372,45 +14535,58 @@
           <w:b/>
           <w:bCs/>
         </w:rPr>
-        <w:t xml:space="preserve">Caja y banco:</w:t>
-      </w:r>
-      <w:r>
-        <w:t xml:space="preserve"> </w:t>
-      </w:r>
-      <w:r>
-        <w:t xml:space="preserve">cuenta de caja (efectivo), cuenta de banco (transferencias),</w:t>
-      </w:r>
-      <w:r>
-        <w:t xml:space="preserve"> </w:t>
-      </w:r>
-      <w:r>
-        <w:rPr>
-          <w:b/>
-          <w:bCs/>
-        </w:rPr>
-        <w:t xml:space="preserve">cheques en cartera</w:t>
-      </w:r>
-      <w:r>
-        <w:t xml:space="preserve"> </w:t>
-      </w:r>
-      <w:r>
-        <w:t xml:space="preserve">(recibidos) y</w:t>
-      </w:r>
-      <w:r>
-        <w:t xml:space="preserve"> </w:t>
-      </w:r>
-      <w:r>
-        <w:rPr>
-          <w:b/>
-          <w:bCs/>
-        </w:rPr>
-        <w:t xml:space="preserve">cheques emitidos</w:t>
-      </w:r>
-      <w:r>
-        <w:t xml:space="preserve"> </w:t>
-      </w:r>
-      <w:r>
-        <w:t xml:space="preserve">(a pagar).</w:t>
+        <w:t xml:space="preserve">Ventas:</w:t>
+      </w:r>
+      <w:r>
+        <w:t xml:space="preserve"> </w:t>
+      </w:r>
+      <w:r>
+        <w:t xml:space="preserve">cuenta de venta, deudores por ventas, IVA débito fiscal,</w:t>
+      </w:r>
+      <w:r>
+        <w:t xml:space="preserve"> </w:t>
+      </w:r>
+      <w:r>
+        <w:rPr>
+          <w:b/>
+          <w:bCs/>
+        </w:rPr>
+        <w:t xml:space="preserve">alícuota de IVA</w:t>
+      </w:r>
+      <w:r>
+        <w:t xml:space="preserve"> </w:t>
+      </w:r>
+      <w:r>
+        <w:t xml:space="preserve">(21% por defecto), si los precios</w:t>
+      </w:r>
+      <w:r>
+        <w:t xml:space="preserve"> </w:t>
+      </w:r>
+      <w:r>
+        <w:rPr>
+          <w:b/>
+          <w:bCs/>
+        </w:rPr>
+        <w:t xml:space="preserve">incluyen IVA</w:t>
+      </w:r>
+      <w:r>
+        <w:t xml:space="preserve">, y el</w:t>
+      </w:r>
+      <w:r>
+        <w:t xml:space="preserve"> </w:t>
+      </w:r>
+      <w:r>
+        <w:rPr>
+          <w:b/>
+          <w:bCs/>
+        </w:rPr>
+        <w:t xml:space="preserve">punto de venta AFIP</w:t>
+      </w:r>
+      <w:r>
+        <w:t xml:space="preserve"> </w:t>
+      </w:r>
+      <w:r>
+        <w:t xml:space="preserve">para la facturación electrónica.</w:t>
       </w:r>
     </w:p>
     <w:p>
@@ -14418,7 +14594,7 @@
         <w:pStyle w:val="Compact"/>
         <w:numPr>
           <w:ilvl w:val="0"/>
-          <w:numId w:val="1018"/>
+          <w:numId w:val="1019"/>
         </w:numPr>
       </w:pPr>
       <w:r>
@@ -14426,13 +14602,29 @@
           <w:b/>
           <w:bCs/>
         </w:rPr>
-        <w:t xml:space="preserve">Retenciones sufridas:</w:t>
-      </w:r>
-      <w:r>
-        <w:t xml:space="preserve"> </w:t>
-      </w:r>
-      <w:r>
-        <w:t xml:space="preserve">las cuentas de crédito fiscal donde van las retenciones que te aplican los clientes (Ganancias, IIBB, SUSS, IVA). Vienen preconfiguradas con las cuentas del plan de Vitalmet.</w:t>
+        <w:t xml:space="preserve">Compras:</w:t>
+      </w:r>
+      <w:r>
+        <w:t xml:space="preserve"> </w:t>
+      </w:r>
+      <w:r>
+        <w:t xml:space="preserve">IVA crédito fiscal, proveedores, compra de materia prima / insumos / herramientas, servicios de terceros, y la cuenta puente</w:t>
+      </w:r>
+      <w:r>
+        <w:t xml:space="preserve"> </w:t>
+      </w:r>
+      <w:r>
+        <w:rPr>
+          <w:b/>
+          <w:bCs/>
+        </w:rPr>
+        <w:t xml:space="preserve">GR/IR</w:t>
+      </w:r>
+      <w:r>
+        <w:t xml:space="preserve"> </w:t>
+      </w:r>
+      <w:r>
+        <w:t xml:space="preserve">(facturas a recibir).</w:t>
       </w:r>
     </w:p>
     <w:p>
@@ -14440,7 +14632,83 @@
         <w:pStyle w:val="Compact"/>
         <w:numPr>
           <w:ilvl w:val="0"/>
-          <w:numId w:val="1018"/>
+          <w:numId w:val="1019"/>
+        </w:numPr>
+      </w:pPr>
+      <w:r>
+        <w:rPr>
+          <w:b/>
+          <w:bCs/>
+        </w:rPr>
+        <w:t xml:space="preserve">Caja y banco:</w:t>
+      </w:r>
+      <w:r>
+        <w:t xml:space="preserve"> </w:t>
+      </w:r>
+      <w:r>
+        <w:t xml:space="preserve">cuenta de caja (efectivo), cuenta de banco (transferencias),</w:t>
+      </w:r>
+      <w:r>
+        <w:t xml:space="preserve"> </w:t>
+      </w:r>
+      <w:r>
+        <w:rPr>
+          <w:b/>
+          <w:bCs/>
+        </w:rPr>
+        <w:t xml:space="preserve">cheques en cartera</w:t>
+      </w:r>
+      <w:r>
+        <w:t xml:space="preserve"> </w:t>
+      </w:r>
+      <w:r>
+        <w:t xml:space="preserve">(recibidos) y</w:t>
+      </w:r>
+      <w:r>
+        <w:t xml:space="preserve"> </w:t>
+      </w:r>
+      <w:r>
+        <w:rPr>
+          <w:b/>
+          <w:bCs/>
+        </w:rPr>
+        <w:t xml:space="preserve">cheques emitidos</w:t>
+      </w:r>
+      <w:r>
+        <w:t xml:space="preserve"> </w:t>
+      </w:r>
+      <w:r>
+        <w:t xml:space="preserve">(a pagar).</w:t>
+      </w:r>
+    </w:p>
+    <w:p>
+      <w:pPr>
+        <w:pStyle w:val="Compact"/>
+        <w:numPr>
+          <w:ilvl w:val="0"/>
+          <w:numId w:val="1019"/>
+        </w:numPr>
+      </w:pPr>
+      <w:r>
+        <w:rPr>
+          <w:b/>
+          <w:bCs/>
+        </w:rPr>
+        <w:t xml:space="preserve">Retenciones sufridas:</w:t>
+      </w:r>
+      <w:r>
+        <w:t xml:space="preserve"> </w:t>
+      </w:r>
+      <w:r>
+        <w:t xml:space="preserve">las cuentas de crédito fiscal donde van las retenciones que te aplican los clientes (Ganancias, IIBB, SUSS, IVA). Vienen preconfiguradas con las cuentas del plan de Vitalmet.</w:t>
+      </w:r>
+    </w:p>
+    <w:p>
+      <w:pPr>
+        <w:pStyle w:val="Compact"/>
+        <w:numPr>
+          <w:ilvl w:val="0"/>
+          <w:numId w:val="1019"/>
         </w:numPr>
       </w:pPr>
       <w:r>
@@ -14501,9 +14769,9 @@
         </w:pict>
       </w:r>
     </w:p>
-    <w:bookmarkEnd w:id="58"/>
     <w:bookmarkEnd w:id="59"/>
-    <w:bookmarkStart w:id="64" w:name="X9473a15fdcd54171d921b584f88070d9a9c6e2d"/>
+    <w:bookmarkEnd w:id="60"/>
+    <w:bookmarkStart w:id="65" w:name="X9473a15fdcd54171d921b584f88070d9a9c6e2d"/>
     <w:p>
       <w:pPr>
         <w:pStyle w:val="Heading2"/>
@@ -14520,7 +14788,7 @@
         <w:t xml:space="preserve">Si entendés estos cuatro circuitos, sabés usar el ERP. Seguilos en orden.</w:t>
       </w:r>
     </w:p>
-    <w:bookmarkStart w:id="60" w:name="Xfc6a747a46029e6b14e9ea4e3a507ed2abe5c07"/>
+    <w:bookmarkStart w:id="61" w:name="Xfc6a747a46029e6b14e9ea4e3a507ed2abe5c07"/>
     <w:p>
       <w:pPr>
         <w:pStyle w:val="Heading3"/>
@@ -14612,8 +14880,8 @@
         <w:t xml:space="preserve">al facturar (venta) y al cobrar.</w:t>
       </w:r>
     </w:p>
-    <w:bookmarkEnd w:id="60"/>
-    <w:bookmarkStart w:id="61" w:name="Xb3ee42997e9ab092cf999dfe51d386c7317685c"/>
+    <w:bookmarkEnd w:id="61"/>
+    <w:bookmarkStart w:id="62" w:name="Xb3ee42997e9ab092cf999dfe51d386c7317685c"/>
     <w:p>
       <w:pPr>
         <w:pStyle w:val="Heading3"/>
@@ -14723,8 +14991,8 @@
         <w:t xml:space="preserve">en la recepción (GR/IR), en la factura y en el pago.</w:t>
       </w:r>
     </w:p>
-    <w:bookmarkEnd w:id="61"/>
-    <w:bookmarkStart w:id="62" w:name="Xd1d7949bac4e6a12c5bcb040f4ddda9ac7470f4"/>
+    <w:bookmarkEnd w:id="62"/>
+    <w:bookmarkStart w:id="63" w:name="Xd1d7949bac4e6a12c5bcb040f4ddda9ac7470f4"/>
     <w:p>
       <w:pPr>
         <w:pStyle w:val="Heading3"/>
@@ -14807,8 +15075,8 @@
         <w:t xml:space="preserve">7. Análisis → Trazabilidad     → verificá la cadena certificado → colada → barra → OP → PT</w:t>
       </w:r>
     </w:p>
-    <w:bookmarkEnd w:id="62"/>
-    <w:bookmarkStart w:id="63" w:name="Xf9a70cdce17ec8d32f80fb3b897c3b5e5c61186"/>
+    <w:bookmarkEnd w:id="63"/>
+    <w:bookmarkStart w:id="64" w:name="Xf9a70cdce17ec8d32f80fb3b897c3b5e5c61186"/>
     <w:p>
       <w:pPr>
         <w:pStyle w:val="Heading3"/>
@@ -14901,9 +15169,9 @@
         </w:pict>
       </w:r>
     </w:p>
-    <w:bookmarkEnd w:id="63"/>
     <w:bookmarkEnd w:id="64"/>
-    <w:bookmarkStart w:id="65" w:name="reglas-de-oro-y-errores-comunes"/>
+    <w:bookmarkEnd w:id="65"/>
+    <w:bookmarkStart w:id="66" w:name="reglas-de-oro-y-errores-comunes"/>
     <w:p>
       <w:pPr>
         <w:pStyle w:val="Heading2"/>
@@ -15868,8 +16136,8 @@
         </w:pict>
       </w:r>
     </w:p>
-    <w:bookmarkEnd w:id="65"/>
-    <w:bookmarkStart w:id="66" w:name="preguntas-frecuentes"/>
+    <w:bookmarkEnd w:id="66"/>
+    <w:bookmarkStart w:id="67" w:name="preguntas-frecuentes"/>
     <w:p>
       <w:pPr>
         <w:pStyle w:val="Heading2"/>
@@ -16282,8 +16550,8 @@
         <w:t xml:space="preserve">Manual de usuario de VitalStock ERP. Ante dudas o errores que no figuran acá, contactá al administrador del sistema.</w:t>
       </w:r>
     </w:p>
-    <w:bookmarkEnd w:id="66"/>
     <w:bookmarkEnd w:id="67"/>
+    <w:bookmarkEnd w:id="68"/>
     <w:sectPr>
       <w:footnotePr>
         <w:numRestart w:val="eachSect"/>
@@ -16733,34 +17001,7 @@
     <w:abstractNumId w:val="991"/>
   </w:num>
   <w:num w:numId="1014">
-    <w:abstractNumId w:val="99411"/>
-    <w:lvlOverride w:ilvl="0">
-      <w:startOverride w:val="1"/>
-    </w:lvlOverride>
-    <w:lvlOverride w:ilvl="1">
-      <w:startOverride w:val="1"/>
-    </w:lvlOverride>
-    <w:lvlOverride w:ilvl="2">
-      <w:startOverride w:val="1"/>
-    </w:lvlOverride>
-    <w:lvlOverride w:ilvl="3">
-      <w:startOverride w:val="1"/>
-    </w:lvlOverride>
-    <w:lvlOverride w:ilvl="4">
-      <w:startOverride w:val="1"/>
-    </w:lvlOverride>
-    <w:lvlOverride w:ilvl="5">
-      <w:startOverride w:val="1"/>
-    </w:lvlOverride>
-    <w:lvlOverride w:ilvl="6">
-      <w:startOverride w:val="1"/>
-    </w:lvlOverride>
-    <w:lvlOverride w:ilvl="7">
-      <w:startOverride w:val="1"/>
-    </w:lvlOverride>
-    <w:lvlOverride w:ilvl="8">
-      <w:startOverride w:val="1"/>
-    </w:lvlOverride>
+    <w:abstractNumId w:val="991"/>
   </w:num>
   <w:num w:numId="1015">
     <w:abstractNumId w:val="99411"/>
@@ -16793,12 +17034,42 @@
     </w:lvlOverride>
   </w:num>
   <w:num w:numId="1016">
-    <w:abstractNumId w:val="991"/>
+    <w:abstractNumId w:val="99411"/>
+    <w:lvlOverride w:ilvl="0">
+      <w:startOverride w:val="1"/>
+    </w:lvlOverride>
+    <w:lvlOverride w:ilvl="1">
+      <w:startOverride w:val="1"/>
+    </w:lvlOverride>
+    <w:lvlOverride w:ilvl="2">
+      <w:startOverride w:val="1"/>
+    </w:lvlOverride>
+    <w:lvlOverride w:ilvl="3">
+      <w:startOverride w:val="1"/>
+    </w:lvlOverride>
+    <w:lvlOverride w:ilvl="4">
+      <w:startOverride w:val="1"/>
+    </w:lvlOverride>
+    <w:lvlOverride w:ilvl="5">
+      <w:startOverride w:val="1"/>
+    </w:lvlOverride>
+    <w:lvlOverride w:ilvl="6">
+      <w:startOverride w:val="1"/>
+    </w:lvlOverride>
+    <w:lvlOverride w:ilvl="7">
+      <w:startOverride w:val="1"/>
+    </w:lvlOverride>
+    <w:lvlOverride w:ilvl="8">
+      <w:startOverride w:val="1"/>
+    </w:lvlOverride>
   </w:num>
   <w:num w:numId="1017">
     <w:abstractNumId w:val="991"/>
   </w:num>
   <w:num w:numId="1018">
+    <w:abstractNumId w:val="991"/>
+  </w:num>
+  <w:num w:numId="1019">
     <w:abstractNumId w:val="991"/>
   </w:num>
 </w:numbering>

</xml_diff>

<commit_message>
fix: 3-way match con conversión de moneda + aviso claro de OC sin recepciones (mig 061)
- registrar_factura_recibida re-emitida: convierte el valor recibido de la
  moneda de la OC a la de la factura (TC factura > TC OC; sin TC = error
  no bypasseable) y rechaza con mensaje claro la OC sin recepciones
  (override admin disponible para casos históricos)
- Frontend: convertirRecibidoAFactura pura + _frMatchInfo; el panel del
  modal distingue SIN RECEPCIONES / FALTA TC / DISCREPANCIA y muestra el
  TC usado; fr-moneda/fr-tc recalculan el preview en vivo
- Tests: 6 casos nuevos de conversión (suite 113/113)

Co-Authored-By: Claude Fable 5 <noreply@anthropic.com>
</commit_message>
<xml_diff>
--- a/docs/MANUAL_USUARIO.docx
+++ b/docs/MANUAL_USUARIO.docx
@@ -7296,6 +7296,112 @@
       </w:r>
       <w:r>
         <w:t xml:space="preserve">la factura contra la recepción (3-way match) y arma el asiento que cancela el GR/IR.</w:t>
+      </w:r>
+    </w:p>
+    <w:p>
+      <w:pPr>
+        <w:pStyle w:val="BlockText"/>
+      </w:pPr>
+      <w:r>
+        <w:rPr>
+          <w:b/>
+          <w:bCs/>
+        </w:rPr>
+        <w:t xml:space="preserve">El orden importa: primero Recibir, después Factura.</w:t>
+      </w:r>
+      <w:r>
+        <w:t xml:space="preserve"> </w:t>
+      </w:r>
+      <w:r>
+        <w:t xml:space="preserve">El match compara la factura contra lo que</w:t>
+      </w:r>
+      <w:r>
+        <w:t xml:space="preserve"> </w:t>
+      </w:r>
+      <w:r>
+        <w:rPr>
+          <w:b/>
+          <w:bCs/>
+        </w:rPr>
+        <w:t xml:space="preserve">recepcionaste en el sistema</w:t>
+      </w:r>
+      <w:r>
+        <w:t xml:space="preserve">. Si la OC no tiene recepciones cargadas, el panel avisa</w:t>
+      </w:r>
+      <w:r>
+        <w:t xml:space="preserve"> </w:t>
+      </w:r>
+      <w:r>
+        <w:rPr>
+          <w:b/>
+          <w:bCs/>
+        </w:rPr>
+        <w:t xml:space="preserve">SIN RECEPCIONES</w:t>
+      </w:r>
+      <w:r>
+        <w:t xml:space="preserve"> </w:t>
+      </w:r>
+      <w:r>
+        <w:t xml:space="preserve">y no deja registrar (aunque el estado de la OC diga</w:t>
+      </w:r>
+      <w:r>
+        <w:t xml:space="preserve"> </w:t>
+      </w:r>
+      <w:r>
+        <w:t xml:space="preserve">“recibida”</w:t>
+      </w:r>
+      <w:r>
+        <w:t xml:space="preserve">): cerrá el modal, registrá la recepción con</w:t>
+      </w:r>
+      <w:r>
+        <w:t xml:space="preserve"> </w:t>
+      </w:r>
+      <w:r>
+        <w:rPr>
+          <w:b/>
+          <w:bCs/>
+        </w:rPr>
+        <w:t xml:space="preserve">Recibir</w:t>
+      </w:r>
+      <w:r>
+        <w:t xml:space="preserve"> </w:t>
+      </w:r>
+      <w:r>
+        <w:t xml:space="preserve">y volvé. Un administrador puede registrar igual justificando el override (para material que entró antes de usar el sistema).</w:t>
+      </w:r>
+    </w:p>
+    <w:p>
+      <w:pPr>
+        <w:pStyle w:val="BlockText"/>
+      </w:pPr>
+      <w:r>
+        <w:rPr>
+          <w:b/>
+          <w:bCs/>
+        </w:rPr>
+        <w:t xml:space="preserve">Monedas distintas:</w:t>
+      </w:r>
+      <w:r>
+        <w:t xml:space="preserve"> </w:t>
+      </w:r>
+      <w:r>
+        <w:t xml:space="preserve">si la OC está en USD y la factura en ARS (o al revés), el sistema convierte lo recibido a la moneda de la factura con el</w:t>
+      </w:r>
+      <w:r>
+        <w:t xml:space="preserve"> </w:t>
+      </w:r>
+      <w:r>
+        <w:rPr>
+          <w:b/>
+          <w:bCs/>
+        </w:rPr>
+        <w:t xml:space="preserve">tipo de cambio de la factura</w:t>
+      </w:r>
+      <w:r>
+        <w:t xml:space="preserve"> </w:t>
+      </w:r>
+      <w:r>
+        <w:t xml:space="preserve">(o el de la OC si no cargaste uno) y te lo muestra en el panel. Sin tipo de cambio no hay comparación posible y no deja registrar.</w:t>
       </w:r>
     </w:p>
     <w:p>

</xml_diff>

<commit_message>
docs: manual (facturas: fechas, corregir/anular, tilde recibí-todo, +CUIT) + CLAUDE.md migración 062
Co-Authored-By: Claude Fable 5 <noreply@anthropic.com>
</commit_message>
<xml_diff>
--- a/docs/MANUAL_USUARIO.docx
+++ b/docs/MANUAL_USUARIO.docx
@@ -7199,7 +7199,23 @@
           <w:b/>
           <w:bCs/>
         </w:rPr>
-        <w:t xml:space="preserve">Fecha</w:t>
+        <w:t xml:space="preserve">Fecha de emisión</w:t>
+      </w:r>
+      <w:r>
+        <w:t xml:space="preserve"> </w:t>
+      </w:r>
+      <w:r>
+        <w:t xml:space="preserve">(la impresa en el comprobante),</w:t>
+      </w:r>
+      <w:r>
+        <w:t xml:space="preserve"> </w:t>
+      </w:r>
+      <w:r>
+        <w:rPr>
+          <w:b/>
+          <w:bCs/>
+        </w:rPr>
+        <w:t xml:space="preserve">Fecha contable</w:t>
       </w:r>
       <w:r>
         <w:t xml:space="preserve">,</w:t>
@@ -7307,6 +7323,56 @@
           <w:b/>
           <w:bCs/>
         </w:rPr>
+        <w:t xml:space="preserve">Las dos fechas:</w:t>
+      </w:r>
+      <w:r>
+        <w:t xml:space="preserve"> </w:t>
+      </w:r>
+      <w:r>
+        <w:t xml:space="preserve">la</w:t>
+      </w:r>
+      <w:r>
+        <w:t xml:space="preserve"> </w:t>
+      </w:r>
+      <w:r>
+        <w:rPr>
+          <w:b/>
+          <w:bCs/>
+        </w:rPr>
+        <w:t xml:space="preserve">de emisión</w:t>
+      </w:r>
+      <w:r>
+        <w:t xml:space="preserve"> </w:t>
+      </w:r>
+      <w:r>
+        <w:t xml:space="preserve">es la del papel; la</w:t>
+      </w:r>
+      <w:r>
+        <w:t xml:space="preserve"> </w:t>
+      </w:r>
+      <w:r>
+        <w:rPr>
+          <w:b/>
+          <w:bCs/>
+        </w:rPr>
+        <w:t xml:space="preserve">contable</w:t>
+      </w:r>
+      <w:r>
+        <w:t xml:space="preserve"> </w:t>
+      </w:r>
+      <w:r>
+        <w:t xml:space="preserve">(viene propuesta con la fecha de hoy) es cuándo impacta en los libros — el asiento, el libro IVA Compras y la posición IVA van por la contable. Ejemplo típico: factura emitida en junio que te llega en agosto → emisión junio, contable agosto.</w:t>
+      </w:r>
+    </w:p>
+    <w:p>
+      <w:pPr>
+        <w:pStyle w:val="BlockText"/>
+      </w:pPr>
+      <w:r>
+        <w:rPr>
+          <w:b/>
+          <w:bCs/>
+        </w:rPr>
         <w:t xml:space="preserve">El orden importa: primero Recibir, después Factura.</w:t>
       </w:r>
       <w:r>
@@ -7339,19 +7405,7 @@
         <w:t xml:space="preserve">SIN RECEPCIONES</w:t>
       </w:r>
       <w:r>
-        <w:t xml:space="preserve"> </w:t>
-      </w:r>
-      <w:r>
-        <w:t xml:space="preserve">y no deja registrar (aunque el estado de la OC diga</w:t>
-      </w:r>
-      <w:r>
-        <w:t xml:space="preserve"> </w:t>
-      </w:r>
-      <w:r>
-        <w:t xml:space="preserve">“recibida”</w:t>
-      </w:r>
-      <w:r>
-        <w:t xml:space="preserve">): cerrá el modal, registrá la recepción con</w:t>
+        <w:t xml:space="preserve">: registrá la recepción con</w:t>
       </w:r>
       <w:r>
         <w:t xml:space="preserve"> </w:t>
@@ -7367,7 +7421,168 @@
         <w:t xml:space="preserve"> </w:t>
       </w:r>
       <w:r>
-        <w:t xml:space="preserve">y volvé. Un administrador puede registrar igual justificando el override (para material que entró antes de usar el sistema).</w:t>
+        <w:t xml:space="preserve">y volvé…</w:t>
+      </w:r>
+      <w:r>
+        <w:t xml:space="preserve"> </w:t>
+      </w:r>
+      <w:r>
+        <w:rPr>
+          <w:b/>
+          <w:bCs/>
+        </w:rPr>
+        <w:t xml:space="preserve">o usá el atajo</w:t>
+      </w:r>
+      <w:r>
+        <w:t xml:space="preserve">: si el material llegó junto con la factura, tildá</w:t>
+      </w:r>
+      <w:r>
+        <w:t xml:space="preserve"> </w:t>
+      </w:r>
+      <w:r>
+        <w:rPr>
+          <w:b/>
+          <w:bCs/>
+        </w:rPr>
+        <w:t xml:space="preserve">“Recibí todo el material con esta factura”</w:t>
+      </w:r>
+      <w:r>
+        <w:t xml:space="preserve"> </w:t>
+      </w:r>
+      <w:r>
+        <w:t xml:space="preserve">en el mismo modal — el sistema registra la recepción completa de la OC (stock, kardex y asiento GR/IR) y recién después la factura, con el match cerrando solo. Un administrador puede registrar igual justificando el override (para material que entró antes de usar el sistema).</w:t>
+      </w:r>
+    </w:p>
+    <w:p>
+      <w:pPr>
+        <w:pStyle w:val="BlockText"/>
+      </w:pPr>
+      <w:r>
+        <w:rPr>
+          <w:b/>
+          <w:bCs/>
+        </w:rPr>
+        <w:t xml:space="preserve">¿Te equivocaste en algo?</w:t>
+      </w:r>
+      <w:r>
+        <w:t xml:space="preserve"> </w:t>
+      </w:r>
+      <w:r>
+        <w:t xml:space="preserve">En la tabla de Facturas recibidas cada comprobante tiene</w:t>
+      </w:r>
+      <w:r>
+        <w:t xml:space="preserve"> </w:t>
+      </w:r>
+      <w:r>
+        <w:rPr>
+          <w:b/>
+          <w:bCs/>
+        </w:rPr>
+        <w:t xml:space="preserve">Corregir</w:t>
+      </w:r>
+      <w:r>
+        <w:t xml:space="preserve"> </w:t>
+      </w:r>
+      <w:r>
+        <w:t xml:space="preserve">(lo anula y te reabre el formulario precargado para que cambies lo que estaba mal y lo registres de nuevo) y</w:t>
+      </w:r>
+      <w:r>
+        <w:t xml:space="preserve"> </w:t>
+      </w:r>
+      <w:r>
+        <w:rPr>
+          <w:b/>
+          <w:bCs/>
+        </w:rPr>
+        <w:t xml:space="preserve">Anular</w:t>
+      </w:r>
+      <w:r>
+        <w:t xml:space="preserve"> </w:t>
+      </w:r>
+      <w:r>
+        <w:t xml:space="preserve">(pide motivo y lo elimina; el asiento contable queda en estado</w:t>
+      </w:r>
+      <w:r>
+        <w:t xml:space="preserve"> </w:t>
+      </w:r>
+      <w:r>
+        <w:rPr>
+          <w:i/>
+          <w:iCs/>
+        </w:rPr>
+        <w:t xml:space="preserve">anulado</w:t>
+      </w:r>
+      <w:r>
+        <w:t xml:space="preserve"> </w:t>
+      </w:r>
+      <w:r>
+        <w:t xml:space="preserve">— nunca se borra — y el motivo va al registro de auditoría). Si la factura tiene una NC/ND asociada, primero anulá la NC/ND. Las recepciones de la OC no se tocan al anular: el material entró igual.</w:t>
+      </w:r>
+    </w:p>
+    <w:p>
+      <w:pPr>
+        <w:pStyle w:val="BlockText"/>
+      </w:pPr>
+      <w:r>
+        <w:rPr>
+          <w:b/>
+          <w:bCs/>
+        </w:rPr>
+        <w:t xml:space="preserve">Proveedor nuevo sin cargar:</w:t>
+      </w:r>
+      <w:r>
+        <w:t xml:space="preserve"> </w:t>
+      </w:r>
+      <w:r>
+        <w:t xml:space="preserve">tanto el modal de</w:t>
+      </w:r>
+      <w:r>
+        <w:t xml:space="preserve"> </w:t>
+      </w:r>
+      <w:r>
+        <w:rPr>
+          <w:b/>
+          <w:bCs/>
+        </w:rPr>
+        <w:t xml:space="preserve">nueva OC</w:t>
+      </w:r>
+      <w:r>
+        <w:t xml:space="preserve"> </w:t>
+      </w:r>
+      <w:r>
+        <w:t xml:space="preserve">como el de</w:t>
+      </w:r>
+      <w:r>
+        <w:t xml:space="preserve"> </w:t>
+      </w:r>
+      <w:r>
+        <w:rPr>
+          <w:b/>
+          <w:bCs/>
+        </w:rPr>
+        <w:t xml:space="preserve">factura sin OC</w:t>
+      </w:r>
+      <w:r>
+        <w:t xml:space="preserve"> </w:t>
+      </w:r>
+      <w:r>
+        <w:t xml:space="preserve">tienen el botón</w:t>
+      </w:r>
+      <w:r>
+        <w:t xml:space="preserve"> </w:t>
+      </w:r>
+      <w:r>
+        <w:rPr>
+          <w:b/>
+          <w:bCs/>
+        </w:rPr>
+        <w:t xml:space="preserve">+ CUIT</w:t>
+      </w:r>
+      <w:r>
+        <w:t xml:space="preserve"> </w:t>
+      </w:r>
+      <w:r>
+        <w:t xml:space="preserve">al lado del selector de proveedor: alta rápida de proveedor ocasional con CUIT validado, sin salir del formulario.</w:t>
       </w:r>
     </w:p>
     <w:p>

</xml_diff>

<commit_message>
docs: auditoría RT 54, plan Sprint A y cierre RT 54 en CLAUDE.md y manual
Co-Authored-By: Claude Fable 5.1 <noreply@anthropic.com>
Claude-Session: https://claude.ai/code/session_01254CxMSg8tFvTE3i7K5M2Y
</commit_message>
<xml_diff>
--- a/docs/MANUAL_USUARIO.docx
+++ b/docs/MANUAL_USUARIO.docx
@@ -14866,6 +14866,237 @@
       </w:r>
     </w:p>
     <w:p>
+      <w:pPr>
+        <w:pStyle w:val="Compact"/>
+        <w:numPr>
+          <w:ilvl w:val="0"/>
+          <w:numId w:val="1019"/>
+        </w:numPr>
+      </w:pPr>
+      <w:r>
+        <w:rPr>
+          <w:b/>
+          <w:bCs/>
+        </w:rPr>
+        <w:t xml:space="preserve">Ajustes de cierre RT 54 (antes de refundir):</w:t>
+      </w:r>
+      <w:r>
+        <w:t xml:space="preserve"> </w:t>
+      </w:r>
+      <w:r>
+        <w:t xml:space="preserve">en la misma página, el panel</w:t>
+      </w:r>
+      <w:r>
+        <w:t xml:space="preserve"> </w:t>
+      </w:r>
+      <w:r>
+        <w:rPr>
+          <w:b/>
+          <w:bCs/>
+        </w:rPr>
+        <w:t xml:space="preserve">Ajustes de cierre RT 54</w:t>
+      </w:r>
+      <w:r>
+        <w:t xml:space="preserve"> </w:t>
+      </w:r>
+      <w:r>
+        <w:t xml:space="preserve">genera los cinco asientos que pide la norma para Entidades Pequeñas. Cargá el</w:t>
+      </w:r>
+      <w:r>
+        <w:t xml:space="preserve"> </w:t>
+      </w:r>
+      <w:r>
+        <w:rPr>
+          <w:b/>
+          <w:bCs/>
+        </w:rPr>
+        <w:t xml:space="preserve">TC de cierre</w:t>
+      </w:r>
+      <w:r>
+        <w:t xml:space="preserve"> </w:t>
+      </w:r>
+      <w:r>
+        <w:t xml:space="preserve">y, paso por paso,</w:t>
+      </w:r>
+      <w:r>
+        <w:t xml:space="preserve"> </w:t>
+      </w:r>
+      <w:r>
+        <w:rPr>
+          <w:b/>
+          <w:bCs/>
+        </w:rPr>
+        <w:t xml:space="preserve">Preview</w:t>
+      </w:r>
+      <w:r>
+        <w:t xml:space="preserve"> </w:t>
+      </w:r>
+      <w:r>
+        <w:t xml:space="preserve">→</w:t>
+      </w:r>
+      <w:r>
+        <w:t xml:space="preserve"> </w:t>
+      </w:r>
+      <w:r>
+        <w:rPr>
+          <w:b/>
+          <w:bCs/>
+        </w:rPr>
+        <w:t xml:space="preserve">Generar asiento</w:t>
+      </w:r>
+      <w:r>
+        <w:t xml:space="preserve"> </w:t>
+      </w:r>
+      <w:r>
+        <w:t xml:space="preserve">(salen en borrador; confirmalos en Asientos):</w:t>
+      </w:r>
+    </w:p>
+    <w:p>
+      <w:pPr>
+        <w:pStyle w:val="Compact"/>
+        <w:numPr>
+          <w:ilvl w:val="1"/>
+          <w:numId w:val="1020"/>
+        </w:numPr>
+      </w:pPr>
+      <w:r>
+        <w:rPr>
+          <w:b/>
+          <w:bCs/>
+        </w:rPr>
+        <w:t xml:space="preserve">Impuesto a las ganancias:</w:t>
+      </w:r>
+      <w:r>
+        <w:t xml:space="preserve"> </w:t>
+      </w:r>
+      <w:r>
+        <w:t xml:space="preserve">el importe determinado que te pasa la contadora.</w:t>
+      </w:r>
+    </w:p>
+    <w:p>
+      <w:pPr>
+        <w:pStyle w:val="Compact"/>
+        <w:numPr>
+          <w:ilvl w:val="1"/>
+          <w:numId w:val="1020"/>
+        </w:numPr>
+      </w:pPr>
+      <w:r>
+        <w:rPr>
+          <w:b/>
+          <w:bCs/>
+        </w:rPr>
+        <w:t xml:space="preserve">Previsión para incobrables:</w:t>
+      </w:r>
+      <w:r>
+        <w:t xml:space="preserve"> </w:t>
+      </w:r>
+      <w:r>
+        <w:t xml:space="preserve">por antigüedad de la cartera (usa el aging de Cta. corriente × TC); ajustá los % por tramo. Ajusta la previsión existente al objetivo (constituye o revierte).</w:t>
+      </w:r>
+    </w:p>
+    <w:p>
+      <w:pPr>
+        <w:pStyle w:val="Compact"/>
+        <w:numPr>
+          <w:ilvl w:val="1"/>
+          <w:numId w:val="1020"/>
+        </w:numPr>
+      </w:pPr>
+      <w:r>
+        <w:rPr>
+          <w:b/>
+          <w:bCs/>
+        </w:rPr>
+        <w:t xml:space="preserve">Provisión vacaciones y cargas s/SAC:</w:t>
+      </w:r>
+      <w:r>
+        <w:t xml:space="preserve"> </w:t>
+      </w:r>
+      <w:r>
+        <w:t xml:space="preserve">vacaciones devengadas por centro (fábrica / administración) más las contribuciones sobre el SAC ya provisionado.</w:t>
+      </w:r>
+    </w:p>
+    <w:p>
+      <w:pPr>
+        <w:pStyle w:val="Compact"/>
+        <w:numPr>
+          <w:ilvl w:val="1"/>
+          <w:numId w:val="1020"/>
+        </w:numPr>
+      </w:pPr>
+      <w:r>
+        <w:rPr>
+          <w:b/>
+          <w:bCs/>
+        </w:rPr>
+        <w:t xml:space="preserve">Diferencia de cambio:</w:t>
+      </w:r>
+      <w:r>
+        <w:t xml:space="preserve"> </w:t>
+      </w:r>
+      <w:r>
+        <w:t xml:space="preserve">revalúa al TC de cierre las cuentas monetarias con saldo en dólares (sólo lo registrado en asientos en USD: una factura en pesos no se revalúa).</w:t>
+      </w:r>
+    </w:p>
+    <w:p>
+      <w:pPr>
+        <w:pStyle w:val="Compact"/>
+        <w:numPr>
+          <w:ilvl w:val="1"/>
+          <w:numId w:val="1020"/>
+        </w:numPr>
+      </w:pPr>
+      <w:r>
+        <w:rPr>
+          <w:b/>
+          <w:bCs/>
+        </w:rPr>
+        <w:t xml:space="preserve">Variación de existencias / CMV:</w:t>
+      </w:r>
+      <w:r>
+        <w:t xml:space="preserve"> </w:t>
+      </w:r>
+      <w:r>
+        <w:t xml:space="preserve">lleva las cuentas de stock a la existencia final (prellenada con la valuación de inventario × TC) y la diferencia es el</w:t>
+      </w:r>
+      <w:r>
+        <w:t xml:space="preserve"> </w:t>
+      </w:r>
+      <w:r>
+        <w:rPr>
+          <w:b/>
+          <w:bCs/>
+        </w:rPr>
+        <w:t xml:space="preserve">costo de los bienes vendidos</w:t>
+      </w:r>
+      <w:r>
+        <w:t xml:space="preserve">.</w:t>
+      </w:r>
+    </w:p>
+    <w:p>
+      <w:pPr>
+        <w:pStyle w:val="Compact"/>
+        <w:numPr>
+          <w:ilvl w:val="0"/>
+          <w:numId w:val="1019"/>
+        </w:numPr>
+      </w:pPr>
+      <w:r>
+        <w:rPr>
+          <w:b/>
+          <w:bCs/>
+        </w:rPr>
+        <w:t xml:space="preserve">Rubro RT 54:</w:t>
+      </w:r>
+      <w:r>
+        <w:t xml:space="preserve"> </w:t>
+      </w:r>
+      <w:r>
+        <w:t xml:space="preserve">cada cuenta imputable tiene un rubro (Plan de cuentas → Editar) que define dónde se expone en los estados contables y alimenta el reporte de Ratios.</w:t>
+      </w:r>
+    </w:p>
+    <w:p>
       <w:r>
         <w:pict>
           <v:rect style="width:0;height:1.5pt" o:hralign="center" o:hrstd="t" o:hr="t"/>
@@ -15003,140 +15234,6 @@
       </w:pPr>
       <w:r>
         <w:t xml:space="preserve">12.2 Usuarios y permisos (admin)</w:t>
-      </w:r>
-    </w:p>
-    <w:p>
-      <w:pPr>
-        <w:pStyle w:val="Compact"/>
-        <w:numPr>
-          <w:ilvl w:val="0"/>
-          <w:numId w:val="1020"/>
-        </w:numPr>
-      </w:pPr>
-      <w:r>
-        <w:t xml:space="preserve">Ves y podés</w:t>
-      </w:r>
-      <w:r>
-        <w:t xml:space="preserve"> </w:t>
-      </w:r>
-      <w:r>
-        <w:rPr>
-          <w:b/>
-          <w:bCs/>
-        </w:rPr>
-        <w:t xml:space="preserve">cambiar el código de empresa</w:t>
-      </w:r>
-      <w:r>
-        <w:t xml:space="preserve"> </w:t>
-      </w:r>
-      <w:r>
-        <w:t xml:space="preserve">(el que usan los nuevos para unirse).</w:t>
-      </w:r>
-    </w:p>
-    <w:p>
-      <w:pPr>
-        <w:pStyle w:val="Compact"/>
-        <w:numPr>
-          <w:ilvl w:val="0"/>
-          <w:numId w:val="1020"/>
-        </w:numPr>
-      </w:pPr>
-      <w:r>
-        <w:t xml:space="preserve">Listás usuarios, editás su</w:t>
-      </w:r>
-      <w:r>
-        <w:t xml:space="preserve"> </w:t>
-      </w:r>
-      <w:r>
-        <w:rPr>
-          <w:b/>
-          <w:bCs/>
-        </w:rPr>
-        <w:t xml:space="preserve">rol</w:t>
-      </w:r>
-      <w:r>
-        <w:t xml:space="preserve"> </w:t>
-      </w:r>
-      <w:r>
-        <w:t xml:space="preserve">y</w:t>
-      </w:r>
-      <w:r>
-        <w:t xml:space="preserve"> </w:t>
-      </w:r>
-      <w:r>
-        <w:rPr>
-          <w:b/>
-          <w:bCs/>
-        </w:rPr>
-        <w:t xml:space="preserve">habilitás/deshabilitás módulos</w:t>
-      </w:r>
-      <w:r>
-        <w:t xml:space="preserve"> </w:t>
-      </w:r>
-      <w:r>
-        <w:t xml:space="preserve">por usuario. La lista cubre todos los módulos del sistema (inventario, producción, compras, ventas, calidad, análisis y contabilidad).</w:t>
-      </w:r>
-    </w:p>
-    <w:p>
-      <w:pPr>
-        <w:pStyle w:val="BlockText"/>
-      </w:pPr>
-      <w:r>
-        <w:rPr>
-          <w:b/>
-          <w:bCs/>
-        </w:rPr>
-        <w:t xml:space="preserve">Nota técnica:</w:t>
-      </w:r>
-      <w:r>
-        <w:t xml:space="preserve"> </w:t>
-      </w:r>
-      <w:r>
-        <w:t xml:space="preserve">los permisos por módulo hoy son</w:t>
-      </w:r>
-      <w:r>
-        <w:t xml:space="preserve"> </w:t>
-      </w:r>
-      <w:r>
-        <w:rPr>
-          <w:b/>
-          <w:bCs/>
-        </w:rPr>
-        <w:t xml:space="preserve">visuales</w:t>
-      </w:r>
-      <w:r>
-        <w:t xml:space="preserve"> </w:t>
-      </w:r>
-      <w:r>
-        <w:t xml:space="preserve">(esconden secciones del menú). No los uses como barrera de seguridad fuerte.</w:t>
-      </w:r>
-    </w:p>
-    <w:bookmarkEnd w:id="59"/>
-    <w:bookmarkStart w:id="60" w:name="imputación-contable"/>
-    <w:p>
-      <w:pPr>
-        <w:pStyle w:val="Heading3"/>
-      </w:pPr>
-      <w:r>
-        <w:t xml:space="preserve">12.3 Imputación contable</w:t>
-      </w:r>
-    </w:p>
-    <w:p>
-      <w:pPr>
-        <w:pStyle w:val="FirstParagraph"/>
-      </w:pPr>
-      <w:r>
-        <w:rPr>
-          <w:b/>
-          <w:bCs/>
-        </w:rPr>
-        <w:t xml:space="preserve">Clave para que los asientos automáticos funcionen.</w:t>
-      </w:r>
-      <w:r>
-        <w:t xml:space="preserve"> </w:t>
-      </w:r>
-      <w:r>
-        <w:t xml:space="preserve">Acá decís qué cuenta contable usar para cada tipo de operación:</w:t>
       </w:r>
     </w:p>
     <w:p>
@@ -15148,62 +15245,23 @@
         </w:numPr>
       </w:pPr>
       <w:r>
-        <w:rPr>
-          <w:b/>
-          <w:bCs/>
-        </w:rPr>
-        <w:t xml:space="preserve">Ventas:</w:t>
-      </w:r>
-      <w:r>
-        <w:t xml:space="preserve"> </w:t>
-      </w:r>
-      <w:r>
-        <w:t xml:space="preserve">cuenta de venta, deudores por ventas, IVA débito fiscal,</w:t>
-      </w:r>
-      <w:r>
-        <w:t xml:space="preserve"> </w:t>
-      </w:r>
-      <w:r>
-        <w:rPr>
-          <w:b/>
-          <w:bCs/>
-        </w:rPr>
-        <w:t xml:space="preserve">alícuota de IVA</w:t>
-      </w:r>
-      <w:r>
-        <w:t xml:space="preserve"> </w:t>
-      </w:r>
-      <w:r>
-        <w:t xml:space="preserve">(21% por defecto), si los precios</w:t>
-      </w:r>
-      <w:r>
-        <w:t xml:space="preserve"> </w:t>
-      </w:r>
-      <w:r>
-        <w:rPr>
-          <w:b/>
-          <w:bCs/>
-        </w:rPr>
-        <w:t xml:space="preserve">incluyen IVA</w:t>
-      </w:r>
-      <w:r>
-        <w:t xml:space="preserve">, y el</w:t>
-      </w:r>
-      <w:r>
-        <w:t xml:space="preserve"> </w:t>
-      </w:r>
-      <w:r>
-        <w:rPr>
-          <w:b/>
-          <w:bCs/>
-        </w:rPr>
-        <w:t xml:space="preserve">punto de venta AFIP</w:t>
-      </w:r>
-      <w:r>
-        <w:t xml:space="preserve"> </w:t>
-      </w:r>
-      <w:r>
-        <w:t xml:space="preserve">para la facturación electrónica.</w:t>
+        <w:t xml:space="preserve">Ves y podés</w:t>
+      </w:r>
+      <w:r>
+        <w:t xml:space="preserve"> </w:t>
+      </w:r>
+      <w:r>
+        <w:rPr>
+          <w:b/>
+          <w:bCs/>
+        </w:rPr>
+        <w:t xml:space="preserve">cambiar el código de empresa</w:t>
+      </w:r>
+      <w:r>
+        <w:t xml:space="preserve"> </w:t>
+      </w:r>
+      <w:r>
+        <w:t xml:space="preserve">(el que usan los nuevos para unirse).</w:t>
       </w:r>
     </w:p>
     <w:p>
@@ -15215,33 +15273,101 @@
         </w:numPr>
       </w:pPr>
       <w:r>
-        <w:rPr>
-          <w:b/>
-          <w:bCs/>
-        </w:rPr>
-        <w:t xml:space="preserve">Compras:</w:t>
-      </w:r>
-      <w:r>
-        <w:t xml:space="preserve"> </w:t>
-      </w:r>
-      <w:r>
-        <w:t xml:space="preserve">IVA crédito fiscal, proveedores, compra de materia prima / insumos / herramientas, servicios de terceros, y la cuenta puente</w:t>
-      </w:r>
-      <w:r>
-        <w:t xml:space="preserve"> </w:t>
-      </w:r>
-      <w:r>
-        <w:rPr>
-          <w:b/>
-          <w:bCs/>
-        </w:rPr>
-        <w:t xml:space="preserve">GR/IR</w:t>
-      </w:r>
-      <w:r>
-        <w:t xml:space="preserve"> </w:t>
-      </w:r>
-      <w:r>
-        <w:t xml:space="preserve">(facturas a recibir).</w:t>
+        <w:t xml:space="preserve">Listás usuarios, editás su</w:t>
+      </w:r>
+      <w:r>
+        <w:t xml:space="preserve"> </w:t>
+      </w:r>
+      <w:r>
+        <w:rPr>
+          <w:b/>
+          <w:bCs/>
+        </w:rPr>
+        <w:t xml:space="preserve">rol</w:t>
+      </w:r>
+      <w:r>
+        <w:t xml:space="preserve"> </w:t>
+      </w:r>
+      <w:r>
+        <w:t xml:space="preserve">y</w:t>
+      </w:r>
+      <w:r>
+        <w:t xml:space="preserve"> </w:t>
+      </w:r>
+      <w:r>
+        <w:rPr>
+          <w:b/>
+          <w:bCs/>
+        </w:rPr>
+        <w:t xml:space="preserve">habilitás/deshabilitás módulos</w:t>
+      </w:r>
+      <w:r>
+        <w:t xml:space="preserve"> </w:t>
+      </w:r>
+      <w:r>
+        <w:t xml:space="preserve">por usuario. La lista cubre todos los módulos del sistema (inventario, producción, compras, ventas, calidad, análisis y contabilidad).</w:t>
+      </w:r>
+    </w:p>
+    <w:p>
+      <w:pPr>
+        <w:pStyle w:val="BlockText"/>
+      </w:pPr>
+      <w:r>
+        <w:rPr>
+          <w:b/>
+          <w:bCs/>
+        </w:rPr>
+        <w:t xml:space="preserve">Nota técnica:</w:t>
+      </w:r>
+      <w:r>
+        <w:t xml:space="preserve"> </w:t>
+      </w:r>
+      <w:r>
+        <w:t xml:space="preserve">los permisos por módulo hoy son</w:t>
+      </w:r>
+      <w:r>
+        <w:t xml:space="preserve"> </w:t>
+      </w:r>
+      <w:r>
+        <w:rPr>
+          <w:b/>
+          <w:bCs/>
+        </w:rPr>
+        <w:t xml:space="preserve">visuales</w:t>
+      </w:r>
+      <w:r>
+        <w:t xml:space="preserve"> </w:t>
+      </w:r>
+      <w:r>
+        <w:t xml:space="preserve">(esconden secciones del menú). No los uses como barrera de seguridad fuerte.</w:t>
+      </w:r>
+    </w:p>
+    <w:bookmarkEnd w:id="59"/>
+    <w:bookmarkStart w:id="60" w:name="imputación-contable"/>
+    <w:p>
+      <w:pPr>
+        <w:pStyle w:val="Heading3"/>
+      </w:pPr>
+      <w:r>
+        <w:t xml:space="preserve">12.3 Imputación contable</w:t>
+      </w:r>
+    </w:p>
+    <w:p>
+      <w:pPr>
+        <w:pStyle w:val="FirstParagraph"/>
+      </w:pPr>
+      <w:r>
+        <w:rPr>
+          <w:b/>
+          <w:bCs/>
+        </w:rPr>
+        <w:t xml:space="preserve">Clave para que los asientos automáticos funcionen.</w:t>
+      </w:r>
+      <w:r>
+        <w:t xml:space="preserve"> </w:t>
+      </w:r>
+      <w:r>
+        <w:t xml:space="preserve">Acá decís qué cuenta contable usar para cada tipo de operación:</w:t>
       </w:r>
     </w:p>
     <w:p>
@@ -15249,7 +15375,7 @@
         <w:pStyle w:val="Compact"/>
         <w:numPr>
           <w:ilvl w:val="0"/>
-          <w:numId w:val="1021"/>
+          <w:numId w:val="1022"/>
         </w:numPr>
       </w:pPr>
       <w:r>
@@ -15257,45 +15383,58 @@
           <w:b/>
           <w:bCs/>
         </w:rPr>
-        <w:t xml:space="preserve">Caja y banco:</w:t>
-      </w:r>
-      <w:r>
-        <w:t xml:space="preserve"> </w:t>
-      </w:r>
-      <w:r>
-        <w:t xml:space="preserve">cuenta de caja (efectivo), cuenta de banco (transferencias),</w:t>
-      </w:r>
-      <w:r>
-        <w:t xml:space="preserve"> </w:t>
-      </w:r>
-      <w:r>
-        <w:rPr>
-          <w:b/>
-          <w:bCs/>
-        </w:rPr>
-        <w:t xml:space="preserve">cheques en cartera</w:t>
-      </w:r>
-      <w:r>
-        <w:t xml:space="preserve"> </w:t>
-      </w:r>
-      <w:r>
-        <w:t xml:space="preserve">(recibidos) y</w:t>
-      </w:r>
-      <w:r>
-        <w:t xml:space="preserve"> </w:t>
-      </w:r>
-      <w:r>
-        <w:rPr>
-          <w:b/>
-          <w:bCs/>
-        </w:rPr>
-        <w:t xml:space="preserve">cheques emitidos</w:t>
-      </w:r>
-      <w:r>
-        <w:t xml:space="preserve"> </w:t>
-      </w:r>
-      <w:r>
-        <w:t xml:space="preserve">(a pagar).</w:t>
+        <w:t xml:space="preserve">Ventas:</w:t>
+      </w:r>
+      <w:r>
+        <w:t xml:space="preserve"> </w:t>
+      </w:r>
+      <w:r>
+        <w:t xml:space="preserve">cuenta de venta, deudores por ventas, IVA débito fiscal,</w:t>
+      </w:r>
+      <w:r>
+        <w:t xml:space="preserve"> </w:t>
+      </w:r>
+      <w:r>
+        <w:rPr>
+          <w:b/>
+          <w:bCs/>
+        </w:rPr>
+        <w:t xml:space="preserve">alícuota de IVA</w:t>
+      </w:r>
+      <w:r>
+        <w:t xml:space="preserve"> </w:t>
+      </w:r>
+      <w:r>
+        <w:t xml:space="preserve">(21% por defecto), si los precios</w:t>
+      </w:r>
+      <w:r>
+        <w:t xml:space="preserve"> </w:t>
+      </w:r>
+      <w:r>
+        <w:rPr>
+          <w:b/>
+          <w:bCs/>
+        </w:rPr>
+        <w:t xml:space="preserve">incluyen IVA</w:t>
+      </w:r>
+      <w:r>
+        <w:t xml:space="preserve">, y el</w:t>
+      </w:r>
+      <w:r>
+        <w:t xml:space="preserve"> </w:t>
+      </w:r>
+      <w:r>
+        <w:rPr>
+          <w:b/>
+          <w:bCs/>
+        </w:rPr>
+        <w:t xml:space="preserve">punto de venta AFIP</w:t>
+      </w:r>
+      <w:r>
+        <w:t xml:space="preserve"> </w:t>
+      </w:r>
+      <w:r>
+        <w:t xml:space="preserve">para la facturación electrónica.</w:t>
       </w:r>
     </w:p>
     <w:p>
@@ -15303,7 +15442,7 @@
         <w:pStyle w:val="Compact"/>
         <w:numPr>
           <w:ilvl w:val="0"/>
-          <w:numId w:val="1021"/>
+          <w:numId w:val="1022"/>
         </w:numPr>
       </w:pPr>
       <w:r>
@@ -15311,13 +15450,29 @@
           <w:b/>
           <w:bCs/>
         </w:rPr>
-        <w:t xml:space="preserve">Retenciones sufridas:</w:t>
-      </w:r>
-      <w:r>
-        <w:t xml:space="preserve"> </w:t>
-      </w:r>
-      <w:r>
-        <w:t xml:space="preserve">las cuentas de crédito fiscal donde van las retenciones que te aplican los clientes (Ganancias, IIBB, SUSS, IVA). Vienen preconfiguradas con las cuentas del plan de Vitalmet.</w:t>
+        <w:t xml:space="preserve">Compras:</w:t>
+      </w:r>
+      <w:r>
+        <w:t xml:space="preserve"> </w:t>
+      </w:r>
+      <w:r>
+        <w:t xml:space="preserve">IVA crédito fiscal, proveedores, compra de materia prima / insumos / herramientas, servicios de terceros, y la cuenta puente</w:t>
+      </w:r>
+      <w:r>
+        <w:t xml:space="preserve"> </w:t>
+      </w:r>
+      <w:r>
+        <w:rPr>
+          <w:b/>
+          <w:bCs/>
+        </w:rPr>
+        <w:t xml:space="preserve">GR/IR</w:t>
+      </w:r>
+      <w:r>
+        <w:t xml:space="preserve"> </w:t>
+      </w:r>
+      <w:r>
+        <w:t xml:space="preserve">(facturas a recibir).</w:t>
       </w:r>
     </w:p>
     <w:p>
@@ -15325,7 +15480,7 @@
         <w:pStyle w:val="Compact"/>
         <w:numPr>
           <w:ilvl w:val="0"/>
-          <w:numId w:val="1021"/>
+          <w:numId w:val="1022"/>
         </w:numPr>
       </w:pPr>
       <w:r>
@@ -15333,6 +15488,82 @@
           <w:b/>
           <w:bCs/>
         </w:rPr>
+        <w:t xml:space="preserve">Caja y banco:</w:t>
+      </w:r>
+      <w:r>
+        <w:t xml:space="preserve"> </w:t>
+      </w:r>
+      <w:r>
+        <w:t xml:space="preserve">cuenta de caja (efectivo), cuenta de banco (transferencias),</w:t>
+      </w:r>
+      <w:r>
+        <w:t xml:space="preserve"> </w:t>
+      </w:r>
+      <w:r>
+        <w:rPr>
+          <w:b/>
+          <w:bCs/>
+        </w:rPr>
+        <w:t xml:space="preserve">cheques en cartera</w:t>
+      </w:r>
+      <w:r>
+        <w:t xml:space="preserve"> </w:t>
+      </w:r>
+      <w:r>
+        <w:t xml:space="preserve">(recibidos) y</w:t>
+      </w:r>
+      <w:r>
+        <w:t xml:space="preserve"> </w:t>
+      </w:r>
+      <w:r>
+        <w:rPr>
+          <w:b/>
+          <w:bCs/>
+        </w:rPr>
+        <w:t xml:space="preserve">cheques emitidos</w:t>
+      </w:r>
+      <w:r>
+        <w:t xml:space="preserve"> </w:t>
+      </w:r>
+      <w:r>
+        <w:t xml:space="preserve">(a pagar).</w:t>
+      </w:r>
+    </w:p>
+    <w:p>
+      <w:pPr>
+        <w:pStyle w:val="Compact"/>
+        <w:numPr>
+          <w:ilvl w:val="0"/>
+          <w:numId w:val="1022"/>
+        </w:numPr>
+      </w:pPr>
+      <w:r>
+        <w:rPr>
+          <w:b/>
+          <w:bCs/>
+        </w:rPr>
+        <w:t xml:space="preserve">Retenciones sufridas:</w:t>
+      </w:r>
+      <w:r>
+        <w:t xml:space="preserve"> </w:t>
+      </w:r>
+      <w:r>
+        <w:t xml:space="preserve">las cuentas de crédito fiscal donde van las retenciones que te aplican los clientes (Ganancias, IIBB, SUSS, IVA). Vienen preconfiguradas con las cuentas del plan de Vitalmet.</w:t>
+      </w:r>
+    </w:p>
+    <w:p>
+      <w:pPr>
+        <w:pStyle w:val="Compact"/>
+        <w:numPr>
+          <w:ilvl w:val="0"/>
+          <w:numId w:val="1022"/>
+        </w:numPr>
+      </w:pPr>
+      <w:r>
+        <w:rPr>
+          <w:b/>
+          <w:bCs/>
+        </w:rPr>
         <w:t xml:space="preserve">Stock y ajustes de inventario:</w:t>
       </w:r>
       <w:r>
@@ -15356,6 +15587,28 @@
       </w:r>
       <w:r>
         <w:t xml:space="preserve">contra la que se asientan las diferencias de ajustes y conteos físicos. Vienen preconfiguradas (114002 / 114001 / 114003 / 421099).</w:t>
+      </w:r>
+    </w:p>
+    <w:p>
+      <w:pPr>
+        <w:pStyle w:val="Compact"/>
+        <w:numPr>
+          <w:ilvl w:val="0"/>
+          <w:numId w:val="1022"/>
+        </w:numPr>
+      </w:pPr>
+      <w:r>
+        <w:rPr>
+          <w:b/>
+          <w:bCs/>
+        </w:rPr>
+        <w:t xml:space="preserve">Cierre RT 54:</w:t>
+      </w:r>
+      <w:r>
+        <w:t xml:space="preserve"> </w:t>
+      </w:r>
+      <w:r>
+        <w:t xml:space="preserve">costo de los bienes vendidos (511000), diferencias de cambio (424006), previsión para incobrables (112090) y su gasto (423007), impuesto a las ganancias (425001) y a pagar (213005), provisión vacaciones (214009) y anticipos de clientes (215001). Preconfiguradas por la migración 072; son las que usan los ajustes de cierre.</w:t>
       </w:r>
     </w:p>
     <w:p>
@@ -17690,9 +17943,39 @@
     <w:abstractNumId w:val="991"/>
   </w:num>
   <w:num w:numId="1020">
+    <w:abstractNumId w:val="99411"/>
+    <w:lvlOverride w:ilvl="0">
+      <w:startOverride w:val="1"/>
+    </w:lvlOverride>
+    <w:lvlOverride w:ilvl="1">
+      <w:startOverride w:val="1"/>
+    </w:lvlOverride>
+    <w:lvlOverride w:ilvl="2">
+      <w:startOverride w:val="1"/>
+    </w:lvlOverride>
+    <w:lvlOverride w:ilvl="3">
+      <w:startOverride w:val="1"/>
+    </w:lvlOverride>
+    <w:lvlOverride w:ilvl="4">
+      <w:startOverride w:val="1"/>
+    </w:lvlOverride>
+    <w:lvlOverride w:ilvl="5">
+      <w:startOverride w:val="1"/>
+    </w:lvlOverride>
+    <w:lvlOverride w:ilvl="6">
+      <w:startOverride w:val="1"/>
+    </w:lvlOverride>
+    <w:lvlOverride w:ilvl="7">
+      <w:startOverride w:val="1"/>
+    </w:lvlOverride>
+    <w:lvlOverride w:ilvl="8">
+      <w:startOverride w:val="1"/>
+    </w:lvlOverride>
+  </w:num>
+  <w:num w:numId="1021">
     <w:abstractNumId w:val="991"/>
   </w:num>
-  <w:num w:numId="1021">
+  <w:num w:numId="1022">
     <w:abstractNumId w:val="991"/>
   </w:num>
 </w:numbering>

</xml_diff>

<commit_message>
docs: ajuste por inflación con anticuación (Sprint B) en CLAUDE.md y manual
Co-Authored-By: Claude Fable 5.1 <noreply@anthropic.com>
Claude-Session: https://claude.ai/code/session_01254CxMSg8tFvTE3i7K5M2Y
</commit_message>
<xml_diff>
--- a/docs/MANUAL_USUARIO.docx
+++ b/docs/MANUAL_USUARIO.docx
@@ -14760,7 +14760,7 @@
         <w:t xml:space="preserve"> </w:t>
       </w:r>
       <w:r>
-        <w:t xml:space="preserve">cargá el IPC del INDEC mes a mes. Es la base para el ajuste por inflación.</w:t>
+        <w:t xml:space="preserve">cargá el IPC del INDEC mes a mes (es la misma serie que publica la FACPCE). Es la base para el ajuste por inflación; cuanto más completa, más exacta la anticuación.</w:t>
       </w:r>
     </w:p>
     <w:p>
@@ -14776,13 +14776,26 @@
           <w:b/>
           <w:bCs/>
         </w:rPr>
-        <w:t xml:space="preserve">Ajuste por inflación (RT 6):</w:t>
-      </w:r>
-      <w:r>
-        <w:t xml:space="preserve"> </w:t>
-      </w:r>
-      <w:r>
-        <w:t xml:space="preserve">elegí el período,</w:t>
+        <w:t xml:space="preserve">Ajuste por inflación (RT 54):</w:t>
+      </w:r>
+      <w:r>
+        <w:t xml:space="preserve"> </w:t>
+      </w:r>
+      <w:r>
+        <w:t xml:space="preserve">elegí el</w:t>
+      </w:r>
+      <w:r>
+        <w:t xml:space="preserve"> </w:t>
+      </w:r>
+      <w:r>
+        <w:rPr>
+          <w:b/>
+          <w:bCs/>
+        </w:rPr>
+        <w:t xml:space="preserve">mes de cierre</w:t>
+      </w:r>
+      <w:r>
+        <w:t xml:space="preserve">,</w:t>
       </w:r>
       <w:r>
         <w:t xml:space="preserve"> </w:t>
@@ -14808,10 +14821,112 @@
         <w:t xml:space="preserve">Generar asiento</w:t>
       </w:r>
       <w:r>
-        <w:t xml:space="preserve"> </w:t>
-      </w:r>
-      <w:r>
-        <w:t xml:space="preserve">(reexpresa las cuentas no monetarias contra RECPAM). Necesitás al menos 2 meses de IPC cargados.</w:t>
+        <w:t xml:space="preserve">. Cada partida de las cuentas no monetarias se reexpresa por el índice de su mes de origen (anticuación mensual); si ya registraste un ajuste anterior, lo previo a esa fecha se lleva con un solo coeficiente y lo posterior mes a mes. El Capital se ajusta contra</w:t>
+      </w:r>
+      <w:r>
+        <w:t xml:space="preserve"> </w:t>
+      </w:r>
+      <w:r>
+        <w:rPr>
+          <w:b/>
+          <w:bCs/>
+        </w:rPr>
+        <w:t xml:space="preserve">Ajuste de capital</w:t>
+      </w:r>
+      <w:r>
+        <w:t xml:space="preserve"> </w:t>
+      </w:r>
+      <w:r>
+        <w:t xml:space="preserve">(312000) y la contrapartida es el</w:t>
+      </w:r>
+      <w:r>
+        <w:t xml:space="preserve"> </w:t>
+      </w:r>
+      <w:r>
+        <w:rPr>
+          <w:b/>
+          <w:bCs/>
+        </w:rPr>
+        <w:t xml:space="preserve">RECPAM</w:t>
+      </w:r>
+      <w:r>
+        <w:t xml:space="preserve">. Pasá el mouse por una fila para ver el detalle por mes. Si falta el IPC de algún mes, se usa el anterior y el sistema avisa. Hacé el ajuste</w:t>
+      </w:r>
+      <w:r>
+        <w:t xml:space="preserve"> </w:t>
+      </w:r>
+      <w:r>
+        <w:rPr>
+          <w:b/>
+          <w:bCs/>
+        </w:rPr>
+        <w:t xml:space="preserve">antes</w:t>
+      </w:r>
+      <w:r>
+        <w:t xml:space="preserve"> </w:t>
+      </w:r>
+      <w:r>
+        <w:t xml:space="preserve">de refundir resultados.</w:t>
+      </w:r>
+    </w:p>
+    <w:p>
+      <w:pPr>
+        <w:pStyle w:val="Compact"/>
+        <w:numPr>
+          <w:ilvl w:val="0"/>
+          <w:numId w:val="1019"/>
+        </w:numPr>
+      </w:pPr>
+      <w:r>
+        <w:rPr>
+          <w:b/>
+          <w:bCs/>
+        </w:rPr>
+        <w:t xml:space="preserve">Histórico vs Ajustado:</w:t>
+      </w:r>
+      <w:r>
+        <w:t xml:space="preserve"> </w:t>
+      </w:r>
+      <w:r>
+        <w:t xml:space="preserve">muestra cada cuenta a valor nominal y reexpresada desde cero a la fecha de corte (no cuenta los ajustes ya registrados).</w:t>
+      </w:r>
+    </w:p>
+    <w:p>
+      <w:pPr>
+        <w:pStyle w:val="Compact"/>
+        <w:numPr>
+          <w:ilvl w:val="0"/>
+          <w:numId w:val="1019"/>
+        </w:numPr>
+      </w:pPr>
+      <w:r>
+        <w:rPr>
+          <w:b/>
+          <w:bCs/>
+        </w:rPr>
+        <w:t xml:space="preserve">Comparativo entre ejercicios:</w:t>
+      </w:r>
+      <w:r>
+        <w:t xml:space="preserve"> </w:t>
+      </w:r>
+      <w:r>
+        <w:t xml:space="preserve">con</w:t>
+      </w:r>
+      <w:r>
+        <w:t xml:space="preserve"> </w:t>
+      </w:r>
+      <w:r>
+        <w:rPr>
+          <w:b/>
+          <w:bCs/>
+        </w:rPr>
+        <w:t xml:space="preserve">Moneda homogénea</w:t>
+      </w:r>
+      <w:r>
+        <w:t xml:space="preserve"> </w:t>
+      </w:r>
+      <w:r>
+        <w:t xml:space="preserve">tildado, el período A se lleva a moneda del período B (IPC B / IPC A) para que las cifras sean comparables, como pide la RT 54.</w:t>
       </w:r>
     </w:p>
     <w:p>

</xml_diff>

<commit_message>
docs: bienes de uso y depreciaciones (Sprint C) en CLAUDE.md y manual
Co-Authored-By: Claude Fable 5.1 <noreply@anthropic.com>
Claude-Session: https://claude.ai/code/session_01254CxMSg8tFvTE3i7K5M2Y
</commit_message>
<xml_diff>
--- a/docs/MANUAL_USUARIO.docx
+++ b/docs/MANUAL_USUARIO.docx
@@ -15187,6 +15187,134 @@
       </w:r>
       <w:r>
         <w:t xml:space="preserve">.</w:t>
+      </w:r>
+    </w:p>
+    <w:p>
+      <w:pPr>
+        <w:pStyle w:val="Compact"/>
+        <w:numPr>
+          <w:ilvl w:val="0"/>
+          <w:numId w:val="1019"/>
+        </w:numPr>
+      </w:pPr>
+      <w:r>
+        <w:rPr>
+          <w:b/>
+          <w:bCs/>
+        </w:rPr>
+        <w:t xml:space="preserve">Bienes de uso:</w:t>
+      </w:r>
+      <w:r>
+        <w:t xml:space="preserve"> </w:t>
+      </w:r>
+      <w:r>
+        <w:t xml:space="preserve">cargá cada activo fijo (tornos, CNC, rodados, instalaciones, herramientas, software) con</w:t>
+      </w:r>
+      <w:r>
+        <w:t xml:space="preserve"> </w:t>
+      </w:r>
+      <w:r>
+        <w:rPr>
+          <w:b/>
+          <w:bCs/>
+        </w:rPr>
+        <w:t xml:space="preserve">fecha de alta</w:t>
+      </w:r>
+      <w:r>
+        <w:t xml:space="preserve">,</w:t>
+      </w:r>
+      <w:r>
+        <w:t xml:space="preserve"> </w:t>
+      </w:r>
+      <w:r>
+        <w:rPr>
+          <w:b/>
+          <w:bCs/>
+        </w:rPr>
+        <w:t xml:space="preserve">valor de origen</w:t>
+      </w:r>
+      <w:r>
+        <w:t xml:space="preserve"> </w:t>
+      </w:r>
+      <w:r>
+        <w:t xml:space="preserve">en pesos,</w:t>
+      </w:r>
+      <w:r>
+        <w:t xml:space="preserve"> </w:t>
+      </w:r>
+      <w:r>
+        <w:rPr>
+          <w:b/>
+          <w:bCs/>
+        </w:rPr>
+        <w:t xml:space="preserve">valor residual</w:t>
+      </w:r>
+      <w:r>
+        <w:t xml:space="preserve"> </w:t>
+      </w:r>
+      <w:r>
+        <w:t xml:space="preserve">y</w:t>
+      </w:r>
+      <w:r>
+        <w:t xml:space="preserve"> </w:t>
+      </w:r>
+      <w:r>
+        <w:rPr>
+          <w:b/>
+          <w:bCs/>
+        </w:rPr>
+        <w:t xml:space="preserve">vida útil en meses</w:t>
+      </w:r>
+      <w:r>
+        <w:t xml:space="preserve"> </w:t>
+      </w:r>
+      <w:r>
+        <w:t xml:space="preserve">(el rubro sugiere las cuentas y la vida útil). La depreciación es lineal por meses: mes de alta completo, mes de baja incluido. En el cierre,</w:t>
+      </w:r>
+      <w:r>
+        <w:t xml:space="preserve"> </w:t>
+      </w:r>
+      <w:r>
+        <w:rPr>
+          <w:b/>
+          <w:bCs/>
+        </w:rPr>
+        <w:t xml:space="preserve">paso 6</w:t>
+      </w:r>
+      <w:r>
+        <w:t xml:space="preserve"> </w:t>
+      </w:r>
+      <w:r>
+        <w:t xml:space="preserve">del panel RT 54 calcula la depreciación del ejercicio de todos los bienes y genera el asiento (gasto contra amortización acumulada) en borrador.</w:t>
+      </w:r>
+      <w:r>
+        <w:t xml:space="preserve"> </w:t>
+      </w:r>
+      <w:r>
+        <w:rPr>
+          <w:b/>
+          <w:bCs/>
+        </w:rPr>
+        <w:t xml:space="preserve">Baja</w:t>
+      </w:r>
+      <w:r>
+        <w:t xml:space="preserve">: fecha y motivo; el asiento de baja se hace en Asientos. El</w:t>
+      </w:r>
+      <w:r>
+        <w:t xml:space="preserve"> </w:t>
+      </w:r>
+      <w:r>
+        <w:rPr>
+          <w:b/>
+          <w:bCs/>
+        </w:rPr>
+        <w:t xml:space="preserve">Anexo Bienes de uso</w:t>
+      </w:r>
+      <w:r>
+        <w:t xml:space="preserve"> </w:t>
+      </w:r>
+      <w:r>
+        <w:t xml:space="preserve">(valores de origen, altas, bajas, amortización del ejercicio y acumulada por rubro) se exporta desde Exportables.</w:t>
       </w:r>
     </w:p>
     <w:p>

</xml_diff>

<commit_message>
docs: estados contables RT 54 (Sprint D) en CLAUDE.md, manual e informe
Co-Authored-By: Claude Fable 5.1 <noreply@anthropic.com>
Claude-Session: https://claude.ai/code/session_01254CxMSg8tFvTE3i7K5M2Y
</commit_message>
<xml_diff>
--- a/docs/MANUAL_USUARIO.docx
+++ b/docs/MANUAL_USUARIO.docx
@@ -15315,6 +15315,57 @@
       </w:r>
       <w:r>
         <w:t xml:space="preserve">(valores de origen, altas, bajas, amortización del ejercicio y acumulada por rubro) se exporta desde Exportables.</w:t>
+      </w:r>
+    </w:p>
+    <w:p>
+      <w:pPr>
+        <w:pStyle w:val="Compact"/>
+        <w:numPr>
+          <w:ilvl w:val="0"/>
+          <w:numId w:val="1019"/>
+        </w:numPr>
+      </w:pPr>
+      <w:r>
+        <w:rPr>
+          <w:b/>
+          <w:bCs/>
+        </w:rPr>
+        <w:t xml:space="preserve">Estados contables RT 54 (Contabilidad → Estados contables → EECC RT 54):</w:t>
+      </w:r>
+      <w:r>
+        <w:t xml:space="preserve"> </w:t>
+      </w:r>
+      <w:r>
+        <w:t xml:space="preserve">elegí el ejercicio, cargá el TC de cierre (para el anexo de moneda extranjera) y tocá</w:t>
+      </w:r>
+      <w:r>
+        <w:t xml:space="preserve"> </w:t>
+      </w:r>
+      <w:r>
+        <w:rPr>
+          <w:b/>
+          <w:bCs/>
+        </w:rPr>
+        <w:t xml:space="preserve">Vista previa</w:t>
+      </w:r>
+      <w:r>
+        <w:t xml:space="preserve">: ves el Estado de situación patrimonial por rubro (corriente / no corriente), el Estado de resultados por función y el Flujo de efectivo sintético, con la columna del ejercicio anterior reexpresada a moneda de cierre.</w:t>
+      </w:r>
+      <w:r>
+        <w:t xml:space="preserve"> </w:t>
+      </w:r>
+      <w:r>
+        <w:rPr>
+          <w:b/>
+          <w:bCs/>
+        </w:rPr>
+        <w:t xml:space="preserve">Exportar Excel</w:t>
+      </w:r>
+      <w:r>
+        <w:t xml:space="preserve"> </w:t>
+      </w:r>
+      <w:r>
+        <w:t xml:space="preserve">baja un libro con carátula, ESP, ER, Evolución del PN, Flujo de efectivo, notas de composición de rubros y los anexos (moneda extranjera, bienes de uso, previsiones, costo de ventas, gastos por naturaleza, partes relacionadas), en el mismo orden que el modelo del Consejo. Corré antes los ajustes de cierre y el ajuste por inflación. Si una cuenta con saldo no tiene rubro, la vista previa lo avisa y el ESP no cuadra hasta que lo asignes.</w:t>
       </w:r>
     </w:p>
     <w:p>

</xml_diff>